<commit_message>
Gen. purpose report complete
</commit_message>
<xml_diff>
--- a/src/Apps/W1/Quality Management/app/src/Reports/QltyGeneralPurposeInspection.docx
+++ b/src/Apps/W1/Quality Management/app/src/Reports/QltyGeneralPurposeInspection.docx
@@ -6,48 +6,125 @@
       <w:tblPr>
         <w:tblStyle w:val="TableGrid"/>
         <w:tblW w:w="0" w:type="auto"/>
+        <w:tblLayout w:type="fixed"/>
         <w:tblLook w:val="04A0" w:firstRow="1" w:lastRow="0" w:firstColumn="1" w:lastColumn="0" w:noHBand="0" w:noVBand="1"/>
       </w:tblPr>
       <w:tblGrid>
-        <w:gridCol w:w="2875"/>
-        <w:gridCol w:w="3780"/>
-        <w:gridCol w:w="3780"/>
+        <w:gridCol w:w="2819"/>
+        <w:gridCol w:w="236"/>
+        <w:gridCol w:w="3724"/>
+        <w:gridCol w:w="236"/>
+        <w:gridCol w:w="3441"/>
       </w:tblGrid>
       <w:tr>
         <w:trPr>
           <w:cnfStyle w:val="100000000000" w:firstRow="1" w:lastRow="0" w:firstColumn="0" w:lastColumn="0" w:oddVBand="0" w:evenVBand="0" w:oddHBand="0" w:evenHBand="0" w:firstRowFirstColumn="0" w:firstRowLastColumn="0" w:lastRowFirstColumn="0" w:lastRowLastColumn="0"/>
           <w:tblHeader/>
         </w:trPr>
-        <w:tc>
-          <w:tcPr>
-            <w:tcW w:w="2875" w:type="dxa"/>
-          </w:tcPr>
-          <w:sdt>
-            <w:sdtPr>
-              <w:alias w:val="TestDocumentNoLabel"/>
-              <w:tag w:val="#BC:InsertDataItem,Labels/TestDocumentNoLabel"/>
-              <w:id w:val="693197583"/>
-              <w:placeholder>
-                <w:docPart w:val="E52ED68ED8474EB38ABFD788E6B53E47"/>
-              </w:placeholder>
-              <w:dataBinding w:prefixMappings="xmlns:ns0='urn:microsoft-dynamics-nav/reports/Qlty_General_Purpose_Inspect/20405/'" w:xpath="/ns0:NavWordReportXmlPart[1]/ns0:Labels[1]/ns0:TestDocumentNoLabel[1]" w:storeItemID="{17DA42EE-3024-4C2F-8931-9EB6F7151F21}"/>
-              <w15:color w:val="808080"/>
-              <w:text/>
-            </w:sdtPr>
-            <w:sdtContent>
+        <w:sdt>
+          <w:sdtPr>
+            <w:rPr>
+              <w:bCs/>
+            </w:rPr>
+            <w:alias w:val="InspectionLabel"/>
+            <w:tag w:val="#BC:InsertDataItem,Labels/InspectionLabel"/>
+            <w:id w:val="1793091244"/>
+            <w:placeholder>
+              <w:docPart w:val="19F040F6864B48A599C11E15E63169CB"/>
+            </w:placeholder>
+            <w:dataBinding w:prefixMappings="xmlns:ns0='urn:microsoft-dynamics-nav/reports/Qlty_General_Purpose_Inspect/20405/'" w:xpath="/ns0:NavWordReportXmlPart[1]/ns0:Labels[1]/ns0:InspectionLabel[1]" w:storeItemID="{F00BF611-06BA-436C-902A-C0D5E8DF929B}"/>
+            <w15:color w:val="808080"/>
+            <w:text/>
+          </w:sdtPr>
+          <w:sdtContent>
+            <w:tc>
+              <w:tcPr>
+                <w:tcW w:w="2819" w:type="dxa"/>
+                <w:vAlign w:val="bottom"/>
+              </w:tcPr>
               <w:p>
+                <w:pPr>
+                  <w:rPr>
+                    <w:lang w:val="da-DK"/>
+                  </w:rPr>
+                </w:pPr>
                 <w:proofErr w:type="spellStart"/>
                 <w:r>
-                  <w:t>TestDocumentNoLabel</w:t>
+                  <w:rPr>
+                    <w:bCs/>
+                  </w:rPr>
+                  <w:t>InspectionLabel</w:t>
                 </w:r>
                 <w:proofErr w:type="spellEnd"/>
               </w:p>
-            </w:sdtContent>
-          </w:sdt>
+            </w:tc>
+          </w:sdtContent>
+        </w:sdt>
+        <w:tc>
+          <w:tcPr>
+            <w:tcW w:w="236" w:type="dxa"/>
+          </w:tcPr>
+          <w:p>
+            <w:pPr>
+              <w:rPr>
+                <w:bCs/>
+              </w:rPr>
+            </w:pPr>
+          </w:p>
+        </w:tc>
+        <w:sdt>
+          <w:sdtPr>
+            <w:rPr>
+              <w:bCs/>
+            </w:rPr>
+            <w:alias w:val="ItemLabel"/>
+            <w:tag w:val="#BC:InsertDataItem,Labels/ItemLabel"/>
+            <w:id w:val="498628940"/>
+            <w:placeholder>
+              <w:docPart w:val="79CF619905ED4A029E02394C5DB96A90"/>
+            </w:placeholder>
+            <w:dataBinding w:prefixMappings="xmlns:ns0='urn:microsoft-dynamics-nav/reports/Qlty_General_Purpose_Inspect/20405/'" w:xpath="/ns0:NavWordReportXmlPart[1]/ns0:Labels[1]/ns0:ItemLabel[1]" w:storeItemID="{F00BF611-06BA-436C-902A-C0D5E8DF929B}"/>
+            <w15:color w:val="808080"/>
+            <w:text/>
+          </w:sdtPr>
+          <w:sdtContent>
+            <w:tc>
+              <w:tcPr>
+                <w:tcW w:w="3724" w:type="dxa"/>
+              </w:tcPr>
+              <w:p>
+                <w:pPr>
+                  <w:rPr>
+                    <w:rFonts w:asciiTheme="majorHAnsi" w:hAnsiTheme="majorHAnsi"/>
+                  </w:rPr>
+                </w:pPr>
+                <w:proofErr w:type="spellStart"/>
+                <w:r>
+                  <w:rPr>
+                    <w:bCs/>
+                  </w:rPr>
+                  <w:t>ItemLabel</w:t>
+                </w:r>
+                <w:proofErr w:type="spellEnd"/>
+              </w:p>
+            </w:tc>
+          </w:sdtContent>
+        </w:sdt>
+        <w:tc>
+          <w:tcPr>
+            <w:tcW w:w="236" w:type="dxa"/>
+          </w:tcPr>
+          <w:p>
+            <w:pPr>
+              <w:rPr>
+                <w:bCs/>
+              </w:rPr>
+            </w:pPr>
+          </w:p>
         </w:tc>
         <w:tc>
           <w:tcPr>
-            <w:tcW w:w="3780" w:type="dxa"/>
+            <w:tcW w:w="3441" w:type="dxa"/>
           </w:tcPr>
           <w:p>
             <w:pPr>
@@ -58,166 +135,141 @@
             <w:sdt>
               <w:sdtPr>
                 <w:rPr>
-                  <w:lang w:val="da-DK"/>
+                  <w:bCs/>
                 </w:rPr>
-                <w:alias w:val="CompletedDateLabel"/>
-                <w:tag w:val="#BC:InsertDataItem,Labels/CompletedDateLabel"/>
-                <w:id w:val="-2121214819"/>
+                <w:alias w:val="ItemTrackingLabel"/>
+                <w:tag w:val="#BC:InsertDataItem,Labels/ItemTrackingLabel"/>
+                <w:id w:val="-1559471266"/>
                 <w:placeholder>
-                  <w:docPart w:val="5FD2338AE18C4054B136E89865F0D601"/>
+                  <w:docPart w:val="89A6856229794EB18EFD4B388834A3AE"/>
                 </w:placeholder>
-                <w:dataBinding w:prefixMappings="xmlns:ns0='urn:microsoft-dynamics-nav/reports/Qlty_General_Purpose_Inspect/20405/'" w:xpath="/ns0:NavWordReportXmlPart[1]/ns0:Labels[1]/ns0:CompletedDateLabel[1]" w:storeItemID="{17DA42EE-3024-4C2F-8931-9EB6F7151F21}"/>
+                <w:dataBinding w:prefixMappings="xmlns:ns0='urn:microsoft-dynamics-nav/reports/Qlty_General_Purpose_Inspect/20405/'" w:xpath="/ns0:NavWordReportXmlPart[1]/ns0:Labels[1]/ns0:ItemTrackingLabel[1]" w:storeItemID="{F00BF611-06BA-436C-902A-C0D5E8DF929B}"/>
                 <w15:color w:val="808080"/>
                 <w:text/>
               </w:sdtPr>
               <w:sdtContent>
+                <w:proofErr w:type="spellStart"/>
                 <w:r>
                   <w:rPr>
-                    <w:lang w:val="da-DK"/>
+                    <w:bCs/>
                   </w:rPr>
-                  <w:t>CompletedDateLabel</w:t>
+                  <w:t>ItemTrackingLabel</w:t>
                 </w:r>
+                <w:proofErr w:type="spellEnd"/>
               </w:sdtContent>
             </w:sdt>
           </w:p>
         </w:tc>
-        <w:sdt>
-          <w:sdtPr>
-            <w:rPr>
-              <w:lang w:val="da-DK"/>
-            </w:rPr>
-            <w:alias w:val="CompletedByLabel"/>
-            <w:tag w:val="#BC:InsertDataItem,Labels/CompletedByLabel"/>
-            <w:id w:val="1030989401"/>
-            <w:placeholder>
-              <w:docPart w:val="E52ED68ED8474EB38ABFD788E6B53E47"/>
-            </w:placeholder>
-            <w:dataBinding w:prefixMappings="xmlns:ns0='urn:microsoft-dynamics-nav/reports/Qlty_General_Purpose_Inspect/20405/'" w:xpath="/ns0:NavWordReportXmlPart[1]/ns0:Labels[1]/ns0:CompletedByLabel[1]" w:storeItemID="{17DA42EE-3024-4C2F-8931-9EB6F7151F21}"/>
-            <w15:color w:val="808080"/>
-            <w:text/>
-          </w:sdtPr>
-          <w:sdtContent>
-            <w:tc>
-              <w:tcPr>
-                <w:tcW w:w="3780" w:type="dxa"/>
-              </w:tcPr>
-              <w:p>
-                <w:pPr>
-                  <w:rPr>
-                    <w:rFonts w:asciiTheme="majorHAnsi" w:hAnsiTheme="majorHAnsi"/>
-                  </w:rPr>
-                </w:pPr>
-                <w:r>
-                  <w:rPr>
-                    <w:lang w:val="da-DK"/>
-                  </w:rPr>
-                  <w:t>CompletedByLabel</w:t>
-                </w:r>
-              </w:p>
-            </w:tc>
-          </w:sdtContent>
-        </w:sdt>
       </w:tr>
       <w:tr>
         <w:tc>
           <w:tcPr>
-            <w:tcW w:w="2875" w:type="dxa"/>
+            <w:tcW w:w="2819" w:type="dxa"/>
+          </w:tcPr>
+          <w:p>
+            <w:sdt>
+              <w:sdtPr>
+                <w:alias w:val="QltyInspection_No"/>
+                <w:tag w:val="#BC:InsertDataItem,DataItems/CurrentInspection/QltyInspection_No"/>
+                <w:id w:val="1961220263"/>
+                <w:placeholder>
+                  <w:docPart w:val="76494A0D615A4F6F8CAF6506B0486BC6"/>
+                </w:placeholder>
+                <w:dataBinding w:prefixMappings="xmlns:ns0='urn:microsoft-dynamics-nav/reports/Qlty_General_Purpose_Inspect/20405/'" w:xpath="/ns0:NavWordReportXmlPart[1]/ns0:CurrentInspection[1]/ns0:QltyInspection_No[1]" w:storeItemID="{F00BF611-06BA-436C-902A-C0D5E8DF929B}"/>
+                <w15:color w:val="808080"/>
+                <w:text/>
+              </w:sdtPr>
+              <w:sdtContent>
+                <w:proofErr w:type="spellStart"/>
+                <w:r>
+                  <w:t>QltyInspection_No</w:t>
+                </w:r>
+                <w:proofErr w:type="spellEnd"/>
+              </w:sdtContent>
+            </w:sdt>
+            <w:r>
+              <w:t xml:space="preserve"> </w:t>
+            </w:r>
+            <w:sdt>
+              <w:sdtPr>
+                <w:alias w:val="ReinspectionSequenceInformation"/>
+                <w:tag w:val="#BC:InsertDataItem,DataItems/CurrentInspection/ReinspectionSequenceInformation"/>
+                <w:id w:val="-602108974"/>
+                <w:placeholder>
+                  <w:docPart w:val="F76A7EA3722A4A529E0451006182A3B0"/>
+                </w:placeholder>
+                <w15:dataBinding w:prefixMappings="xmlns:ns0='urn:microsoft-dynamics-nav/reports/Qlty_Certificate_of_Analysis/20401/' " w:xpath="/ns0:NavWordReportXmlPart[1]/ns0:CurrentInspection[1]/ns0:ReinspectionSequenceInformation[1]" w:storeItemID="{F00BF611-06BA-436C-902A-C0D5E8DF929B}"/>
+              </w:sdtPr>
+              <w:sdtContent>
+                <w:proofErr w:type="spellStart"/>
+                <w:r>
+                  <w:t>ReinspectionSequenceInformation</w:t>
+                </w:r>
+                <w:proofErr w:type="spellEnd"/>
+              </w:sdtContent>
+            </w:sdt>
+          </w:p>
+        </w:tc>
+        <w:tc>
+          <w:tcPr>
+            <w:tcW w:w="236" w:type="dxa"/>
+          </w:tcPr>
+          <w:p/>
+        </w:tc>
+        <w:tc>
+          <w:tcPr>
+            <w:tcW w:w="3724" w:type="dxa"/>
           </w:tcPr>
           <w:sdt>
             <w:sdtPr>
-              <w:rPr>
-                <w:rFonts w:cs="Segoe UI"/>
-              </w:rPr>
-              <w:alias w:val="QltyInspection_No"/>
-              <w:tag w:val="#BC:InsertDataItem,DataItems/CurrentInspection/QltyInspection_No"/>
-              <w:id w:val="51897518"/>
+              <w:alias w:val="ItemDescription"/>
+              <w:tag w:val="#BC:InsertDataItem,DataItems/CurrentInspection/ItemDescription"/>
+              <w:id w:val="1230270698"/>
               <w:placeholder>
-                <w:docPart w:val="323AFCE67AAB4BB19FFC21B54EB0799A"/>
+                <w:docPart w:val="E2B6192B7C8B44698D0543E9A92C0267"/>
               </w:placeholder>
-              <w:dataBinding w:prefixMappings="xmlns:ns0='urn:microsoft-dynamics-nav/reports/Qlty_General_Purpose_Inspect/20405/'" w:xpath="/ns0:NavWordReportXmlPart[1]/ns0:CurrentInspection[1]/ns0:QltyInspection_No[1]" w:storeItemID="{17DA42EE-3024-4C2F-8931-9EB6F7151F21}"/>
+              <w:dataBinding w:prefixMappings="xmlns:ns0='urn:microsoft-dynamics-nav/reports/Qlty_General_Purpose_Inspect/20405/'" w:xpath="/ns0:NavWordReportXmlPart[1]/ns0:CurrentInspection[1]/ns0:ItemDescription[1]" w:storeItemID="{F00BF611-06BA-436C-902A-C0D5E8DF929B}"/>
               <w15:color w:val="808080"/>
               <w:text/>
             </w:sdtPr>
             <w:sdtContent>
               <w:p>
+                <w:proofErr w:type="spellStart"/>
                 <w:r>
-                  <w:rPr>
-                    <w:rFonts w:cs="Segoe UI"/>
-                  </w:rPr>
-                  <w:t>QltyInspection_No</w:t>
+                  <w:t>ItemDescription</w:t>
                 </w:r>
+                <w:proofErr w:type="spellEnd"/>
               </w:p>
             </w:sdtContent>
           </w:sdt>
         </w:tc>
         <w:tc>
           <w:tcPr>
-            <w:tcW w:w="3780" w:type="dxa"/>
+            <w:tcW w:w="236" w:type="dxa"/>
+          </w:tcPr>
+          <w:p/>
+        </w:tc>
+        <w:tc>
+          <w:tcPr>
+            <w:tcW w:w="3441" w:type="dxa"/>
           </w:tcPr>
           <w:sdt>
             <w:sdtPr>
-              <w:rPr>
-                <w:rFonts w:cs="Segoe UI"/>
-              </w:rPr>
-              <w:alias w:val="FinishedDateOnly"/>
-              <w:tag w:val="#BC:InsertDataItem,DataItems/CurrentInspection/FinishedDateOnly"/>
-              <w:id w:val="-612591678"/>
+              <w:alias w:val="ItemTrackingDescription"/>
+              <w:tag w:val="#BC:InsertDataItem,DataItems/CurrentInspection/ItemTrackingDescription"/>
+              <w:id w:val="-1388635032"/>
               <w:placeholder>
-                <w:docPart w:val="E52ED68ED8474EB38ABFD788E6B53E47"/>
+                <w:docPart w:val="4B63C69D6D7C41D682DF1FFDD1EDEBC3"/>
               </w:placeholder>
-              <w:dataBinding w:prefixMappings="xmlns:ns0='urn:microsoft-dynamics-nav/reports/Qlty_General_Purpose_Inspect/20405/'" w:xpath="/ns0:NavWordReportXmlPart[1]/ns0:CurrentInspection[1]/ns0:FinishedDateOnly[1]" w:storeItemID="{17DA42EE-3024-4C2F-8931-9EB6F7151F21}"/>
+              <w:dataBinding w:prefixMappings="xmlns:ns0='urn:microsoft-dynamics-nav/reports/Qlty_General_Purpose_Inspect/20405/'" w:xpath="/ns0:NavWordReportXmlPart[1]/ns0:CurrentInspection[1]/ns0:ItemTrackingDescription[1]" w:storeItemID="{F00BF611-06BA-436C-902A-C0D5E8DF929B}"/>
               <w15:color w:val="808080"/>
               <w:text/>
             </w:sdtPr>
             <w:sdtContent>
               <w:p>
-                <w:pPr>
-                  <w:rPr>
-                    <w:rFonts w:asciiTheme="minorHAnsi" w:hAnsiTheme="minorHAnsi"/>
-                  </w:rPr>
-                </w:pPr>
-                <w:r>
-                  <w:rPr>
-                    <w:rFonts w:cs="Segoe UI"/>
-                  </w:rPr>
-                  <w:t>FinishedDateOnly</w:t>
-                </w:r>
-              </w:p>
-            </w:sdtContent>
-          </w:sdt>
-        </w:tc>
-        <w:tc>
-          <w:tcPr>
-            <w:tcW w:w="3780" w:type="dxa"/>
-          </w:tcPr>
-          <w:sdt>
-            <w:sdtPr>
-              <w:rPr>
-                <w:rFonts w:cs="Segoe UI"/>
-              </w:rPr>
-              <w:alias w:val="QltyInspection_Finished_By_User_ID"/>
-              <w:tag w:val="#BC:InsertDataItem,DataItems/CurrentInspection/QltyInspection_Finished_By_User_ID"/>
-              <w:id w:val="-1944606569"/>
-              <w:placeholder>
-                <w:docPart w:val="E89AA59296584643BE2AFF07AA055572"/>
-              </w:placeholder>
-              <w:dataBinding w:prefixMappings="xmlns:ns0='urn:microsoft-dynamics-nav/reports/Qlty_General_Purpose_Inspect/20405/'" w:xpath="/ns0:NavWordReportXmlPart[1]/ns0:CurrentInspection[1]/ns0:QltyInspection_Finished_By_User_ID[1]" w:storeItemID="{17DA42EE-3024-4C2F-8931-9EB6F7151F21}"/>
-              <w15:color w:val="808080"/>
-              <w:text/>
-            </w:sdtPr>
-            <w:sdtContent>
-              <w:p>
-                <w:pPr>
-                  <w:rPr>
-                    <w:rFonts w:asciiTheme="minorHAnsi" w:hAnsiTheme="minorHAnsi"/>
-                  </w:rPr>
-                </w:pPr>
                 <w:proofErr w:type="spellStart"/>
                 <w:r>
-                  <w:rPr>
-                    <w:rFonts w:cs="Segoe UI"/>
-                  </w:rPr>
-                  <w:t>QltyInspection_Finished_By_User_ID</w:t>
+                  <w:t>ItemTrackingDescription</w:t>
                 </w:r>
                 <w:proofErr w:type="spellEnd"/>
               </w:p>
@@ -228,36 +280,65 @@
       <w:tr>
         <w:tc>
           <w:tcPr>
-            <w:tcW w:w="2875" w:type="dxa"/>
+            <w:tcW w:w="2819" w:type="dxa"/>
           </w:tcPr>
           <w:p>
             <w:pPr>
               <w:rPr>
-                <w:rFonts w:asciiTheme="minorHAnsi" w:hAnsiTheme="minorHAnsi"/>
+                <w:sz w:val="16"/>
+                <w:szCs w:val="16"/>
               </w:rPr>
             </w:pPr>
           </w:p>
         </w:tc>
         <w:tc>
           <w:tcPr>
-            <w:tcW w:w="3780" w:type="dxa"/>
+            <w:tcW w:w="236" w:type="dxa"/>
           </w:tcPr>
           <w:p>
             <w:pPr>
               <w:rPr>
-                <w:rFonts w:asciiTheme="minorHAnsi" w:hAnsiTheme="minorHAnsi"/>
+                <w:sz w:val="16"/>
+                <w:szCs w:val="16"/>
               </w:rPr>
             </w:pPr>
           </w:p>
         </w:tc>
         <w:tc>
           <w:tcPr>
-            <w:tcW w:w="3780" w:type="dxa"/>
+            <w:tcW w:w="3724" w:type="dxa"/>
           </w:tcPr>
           <w:p>
             <w:pPr>
               <w:rPr>
-                <w:rFonts w:asciiTheme="minorHAnsi" w:hAnsiTheme="minorHAnsi"/>
+                <w:sz w:val="16"/>
+                <w:szCs w:val="16"/>
+              </w:rPr>
+            </w:pPr>
+          </w:p>
+        </w:tc>
+        <w:tc>
+          <w:tcPr>
+            <w:tcW w:w="236" w:type="dxa"/>
+          </w:tcPr>
+          <w:p>
+            <w:pPr>
+              <w:rPr>
+                <w:sz w:val="16"/>
+                <w:szCs w:val="16"/>
+              </w:rPr>
+            </w:pPr>
+          </w:p>
+        </w:tc>
+        <w:tc>
+          <w:tcPr>
+            <w:tcW w:w="3441" w:type="dxa"/>
+          </w:tcPr>
+          <w:p>
+            <w:pPr>
+              <w:rPr>
+                <w:sz w:val="16"/>
+                <w:szCs w:val="16"/>
               </w:rPr>
             </w:pPr>
           </w:p>
@@ -266,215 +347,230 @@
       <w:tr>
         <w:tc>
           <w:tcPr>
-            <w:tcW w:w="2875" w:type="dxa"/>
+            <w:tcW w:w="2819" w:type="dxa"/>
+          </w:tcPr>
+          <w:p>
+            <w:pPr>
+              <w:tabs>
+                <w:tab w:val="left" w:pos="2016"/>
+              </w:tabs>
+            </w:pPr>
+          </w:p>
+        </w:tc>
+        <w:tc>
+          <w:tcPr>
+            <w:tcW w:w="236" w:type="dxa"/>
           </w:tcPr>
           <w:p>
             <w:pPr>
               <w:rPr>
-                <w:rFonts w:asciiTheme="minorHAnsi" w:hAnsiTheme="minorHAnsi"/>
                 <w:b/>
+                <w:bCs/>
+                <w:lang w:val="da-DK"/>
+              </w:rPr>
+            </w:pPr>
+          </w:p>
+        </w:tc>
+        <w:tc>
+          <w:tcPr>
+            <w:tcW w:w="3724" w:type="dxa"/>
+          </w:tcPr>
+          <w:p>
+            <w:pPr>
+              <w:rPr>
+                <w:b/>
+                <w:bCs/>
               </w:rPr>
             </w:pPr>
             <w:sdt>
               <w:sdtPr>
                 <w:rPr>
                   <w:b/>
+                  <w:bCs/>
+                  <w:lang w:val="da-DK"/>
                 </w:rPr>
-                <w:alias w:val="InspectionLabel"/>
-                <w:tag w:val="#BC:InsertDataItem,Labels/InspectionLabel"/>
-                <w:id w:val="-1870988376"/>
+                <w:alias w:val="FinishedOnLabel"/>
+                <w:tag w:val="#BC:InsertDataItem,Labels/FinishedOnLabel"/>
+                <w:id w:val="500931782"/>
                 <w:placeholder>
-                  <w:docPart w:val="E52ED68ED8474EB38ABFD788E6B53E47"/>
+                  <w:docPart w:val="DF66177CBFFA47388B872CD7936BD8FF"/>
                 </w:placeholder>
-                <w:dataBinding w:prefixMappings="xmlns:ns0='urn:microsoft-dynamics-nav/reports/Qlty_General_Purpose_Inspect/20405/'" w:xpath="/ns0:NavWordReportXmlPart[1]/ns0:Labels[1]/ns0:InspectionLabel[1]" w:storeItemID="{17DA42EE-3024-4C2F-8931-9EB6F7151F21}"/>
+                <w:dataBinding w:prefixMappings="xmlns:ns0='urn:microsoft-dynamics-nav/reports/Qlty_General_Purpose_Inspect/20405/'" w:xpath="/ns0:NavWordReportXmlPart[1]/ns0:Labels[1]/ns0:FinishedOnLabel[1]" w:storeItemID="{F00BF611-06BA-436C-902A-C0D5E8DF929B}"/>
                 <w15:color w:val="808080"/>
                 <w:text/>
               </w:sdtPr>
               <w:sdtContent>
-                <w:proofErr w:type="spellStart"/>
                 <w:r>
                   <w:rPr>
                     <w:b/>
+                    <w:bCs/>
+                    <w:lang w:val="da-DK"/>
                   </w:rPr>
-                  <w:t>InspectionLabel</w:t>
+                  <w:t>FinishedOn</w:t>
                 </w:r>
-                <w:proofErr w:type="spellEnd"/>
+                <w:r>
+                  <w:rPr>
+                    <w:b/>
+                    <w:bCs/>
+                    <w:lang w:val="da-DK"/>
+                  </w:rPr>
+                  <w:t>Label</w:t>
+                </w:r>
               </w:sdtContent>
             </w:sdt>
           </w:p>
         </w:tc>
         <w:tc>
           <w:tcPr>
-            <w:tcW w:w="3780" w:type="dxa"/>
+            <w:tcW w:w="236" w:type="dxa"/>
           </w:tcPr>
-          <w:sdt>
-            <w:sdtPr>
+          <w:p>
+            <w:pPr>
               <w:rPr>
                 <w:b/>
+                <w:bCs/>
+                <w:lang w:val="da-DK"/>
               </w:rPr>
-              <w:alias w:val="ItemLabel"/>
-              <w:tag w:val="#BC:InsertDataItem,Labels/ItemLabel"/>
-              <w:id w:val="1000092371"/>
-              <w:placeholder>
-                <w:docPart w:val="E52ED68ED8474EB38ABFD788E6B53E47"/>
-              </w:placeholder>
-              <w:dataBinding w:prefixMappings="xmlns:ns0='urn:microsoft-dynamics-nav/reports/Qlty_General_Purpose_Inspect/20405/'" w:xpath="/ns0:NavWordReportXmlPart[1]/ns0:Labels[1]/ns0:ItemLabel[1]" w:storeItemID="{17DA42EE-3024-4C2F-8931-9EB6F7151F21}"/>
-              <w15:color w:val="808080"/>
-              <w:text/>
-            </w:sdtPr>
-            <w:sdtContent>
-              <w:p>
-                <w:pPr>
-                  <w:rPr>
-                    <w:rFonts w:asciiTheme="minorHAnsi" w:hAnsiTheme="minorHAnsi"/>
-                    <w:b/>
-                  </w:rPr>
-                </w:pPr>
-                <w:proofErr w:type="spellStart"/>
+            </w:pPr>
+          </w:p>
+        </w:tc>
+        <w:tc>
+          <w:tcPr>
+            <w:tcW w:w="3441" w:type="dxa"/>
+          </w:tcPr>
+          <w:p>
+            <w:pPr>
+              <w:rPr>
+                <w:b/>
+                <w:bCs/>
+              </w:rPr>
+            </w:pPr>
+            <w:sdt>
+              <w:sdtPr>
+                <w:rPr>
+                  <w:b/>
+                  <w:bCs/>
+                  <w:lang w:val="da-DK"/>
+                </w:rPr>
+                <w:alias w:val="FinishedByLabel"/>
+                <w:tag w:val="#BC:InsertDataItem,Labels/FinishedByLabel"/>
+                <w:id w:val="-927343786"/>
+                <w:placeholder>
+                  <w:docPart w:val="7427C850301144EDADD6A34A0BE51CB5"/>
+                </w:placeholder>
+                <w:dataBinding w:prefixMappings="xmlns:ns0='urn:microsoft-dynamics-nav/reports/Qlty_General_Purpose_Inspect/20405/'" w:xpath="/ns0:NavWordReportXmlPart[1]/ns0:Labels[1]/ns0:FinishedByLabel[1]" w:storeItemID="{F00BF611-06BA-436C-902A-C0D5E8DF929B}"/>
+                <w15:color w:val="808080"/>
+                <w:text/>
+              </w:sdtPr>
+              <w:sdtContent>
                 <w:r>
                   <w:rPr>
                     <w:b/>
+                    <w:bCs/>
+                    <w:lang w:val="da-DK"/>
                   </w:rPr>
-                  <w:t>ItemLabel</w:t>
+                  <w:t>Finished</w:t>
                 </w:r>
-                <w:proofErr w:type="spellEnd"/>
-              </w:p>
-            </w:sdtContent>
-          </w:sdt>
-        </w:tc>
-        <w:tc>
-          <w:tcPr>
-            <w:tcW w:w="3780" w:type="dxa"/>
-          </w:tcPr>
-          <w:sdt>
-            <w:sdtPr>
-              <w:rPr>
-                <w:b/>
-              </w:rPr>
-              <w:alias w:val="ItemTrackingLabel"/>
-              <w:tag w:val="#BC:InsertDataItem,Labels/ItemTrackingLabel"/>
-              <w:id w:val="1669518516"/>
-              <w:placeholder>
-                <w:docPart w:val="E52ED68ED8474EB38ABFD788E6B53E47"/>
-              </w:placeholder>
-              <w:dataBinding w:prefixMappings="xmlns:ns0='urn:microsoft-dynamics-nav/reports/Qlty_General_Purpose_Inspect/20405/'" w:xpath="/ns0:NavWordReportXmlPart[1]/ns0:Labels[1]/ns0:ItemTrackingLabel[1]" w:storeItemID="{17DA42EE-3024-4C2F-8931-9EB6F7151F21}"/>
-              <w15:color w:val="808080"/>
-              <w:text/>
-            </w:sdtPr>
-            <w:sdtContent>
-              <w:p>
-                <w:pPr>
-                  <w:rPr>
-                    <w:rFonts w:asciiTheme="minorHAnsi" w:hAnsiTheme="minorHAnsi"/>
-                    <w:b/>
-                  </w:rPr>
-                </w:pPr>
-                <w:proofErr w:type="spellStart"/>
                 <w:r>
                   <w:rPr>
                     <w:b/>
+                    <w:bCs/>
+                    <w:lang w:val="da-DK"/>
                   </w:rPr>
-                  <w:t>ItemTrackingLabel</w:t>
+                  <w:t>ByLabel</w:t>
                 </w:r>
-                <w:proofErr w:type="spellEnd"/>
-              </w:p>
-            </w:sdtContent>
-          </w:sdt>
+              </w:sdtContent>
+            </w:sdt>
+          </w:p>
         </w:tc>
       </w:tr>
       <w:tr>
         <w:sdt>
           <w:sdtPr>
-            <w:rPr>
-              <w:rFonts w:cs="Segoe UI"/>
-            </w:rPr>
-            <w:alias w:val="ReinspectionDescription"/>
-            <w:tag w:val="#BC:InsertDataItem,DataItems/CurrentInspection/ReinspectionDescription"/>
-            <w:id w:val="80647438"/>
+            <w:alias w:val="InspectionInformation"/>
+            <w:tag w:val="#BC:InsertDataItem,DataItems/CurrentInspection/InspectionInformation"/>
+            <w:id w:val="-289510379"/>
             <w:placeholder>
-              <w:docPart w:val="E52ED68ED8474EB38ABFD788E6B53E47"/>
+              <w:docPart w:val="A25D382DC26A4A4FA94FF29C06D215F6"/>
             </w:placeholder>
-            <w:dataBinding w:prefixMappings="xmlns:ns0='urn:microsoft-dynamics-nav/reports/Qlty_General_Purpose_Inspect/20405/'" w:xpath="/ns0:NavWordReportXmlPart[1]/ns0:CurrentInspection[1]/ns0:ReinspectionDescription[1]" w:storeItemID="{17DA42EE-3024-4C2F-8931-9EB6F7151F21}"/>
+            <w:dataBinding w:prefixMappings="xmlns:ns0='urn:microsoft-dynamics-nav/reports/Qlty_General_Purpose_Inspect/20405/'" w:xpath="/ns0:NavWordReportXmlPart[1]/ns0:CurrentInspection[1]/ns0:InspectionInformation[1]" w:storeItemID="{F00BF611-06BA-436C-902A-C0D5E8DF929B}"/>
             <w15:color w:val="808080"/>
             <w:text/>
           </w:sdtPr>
           <w:sdtContent>
             <w:tc>
               <w:tcPr>
-                <w:tcW w:w="2875" w:type="dxa"/>
+                <w:tcW w:w="2819" w:type="dxa"/>
               </w:tcPr>
               <w:p>
-                <w:pPr>
-                  <w:rPr>
-                    <w:rFonts w:asciiTheme="minorHAnsi" w:hAnsiTheme="minorHAnsi"/>
-                  </w:rPr>
-                </w:pPr>
+                <w:proofErr w:type="spellStart"/>
                 <w:r>
-                  <w:rPr>
-                    <w:rFonts w:cs="Segoe UI"/>
-                  </w:rPr>
-                  <w:t>ReinspectionDescription</w:t>
+                  <w:t>InspectionInformation</w:t>
                 </w:r>
+                <w:proofErr w:type="spellEnd"/>
               </w:p>
             </w:tc>
           </w:sdtContent>
         </w:sdt>
         <w:tc>
           <w:tcPr>
-            <w:tcW w:w="3780" w:type="dxa"/>
+            <w:tcW w:w="236" w:type="dxa"/>
+          </w:tcPr>
+          <w:p/>
+        </w:tc>
+        <w:sdt>
+          <w:sdtPr>
+            <w:alias w:val="#Nav: /CurrentInspection/QltyInspection_Finished_Date"/>
+            <w:tag w:val="#Nav: Qlty_General_Purpose_Inspect/20405"/>
+            <w:id w:val="-850415512"/>
+            <w:placeholder>
+              <w:docPart w:val="1E896787607645E0ABB983BFD537574D"/>
+            </w:placeholder>
+            <w:dataBinding w:prefixMappings="xmlns:ns0='urn:microsoft-dynamics-nav/reports/Qlty_General_Purpose_Inspect/20405/'" w:xpath="/ns0:NavWordReportXmlPart[1]/ns0:CurrentInspection[1]/ns0:QltyInspection_Finished_Date[1]" w:storeItemID="{F00BF611-06BA-436C-902A-C0D5E8DF929B}"/>
+            <w:text/>
+          </w:sdtPr>
+          <w:sdtContent>
+            <w:tc>
+              <w:tcPr>
+                <w:tcW w:w="3724" w:type="dxa"/>
+              </w:tcPr>
+              <w:p>
+                <w:proofErr w:type="spellStart"/>
+                <w:r>
+                  <w:t>QltyInspection_Finished_Date</w:t>
+                </w:r>
+                <w:proofErr w:type="spellEnd"/>
+              </w:p>
+            </w:tc>
+          </w:sdtContent>
+        </w:sdt>
+        <w:tc>
+          <w:tcPr>
+            <w:tcW w:w="236" w:type="dxa"/>
+          </w:tcPr>
+          <w:p/>
+        </w:tc>
+        <w:tc>
+          <w:tcPr>
+            <w:tcW w:w="3441" w:type="dxa"/>
           </w:tcPr>
           <w:sdt>
             <w:sdtPr>
-              <w:alias w:val="ItemDescription"/>
-              <w:tag w:val="#BC:InsertDataItem,DataItems/CurrentInspection/ItemDescription"/>
-              <w:id w:val="332964529"/>
+              <w:alias w:val="QltyInspection_Finished_By_User_ID"/>
+              <w:tag w:val="#BC:InsertDataItem,DataItems/CurrentInspection/QltyInspection_Finished_By_User_ID"/>
+              <w:id w:val="-140812418"/>
               <w:placeholder>
-                <w:docPart w:val="E52ED68ED8474EB38ABFD788E6B53E47"/>
+                <w:docPart w:val="E4B2EB81AEE240A29F9975B31C6BE17B"/>
               </w:placeholder>
-              <w:dataBinding w:prefixMappings="xmlns:ns0='urn:microsoft-dynamics-nav/reports/Qlty_General_Purpose_Inspect/20405/'" w:xpath="/ns0:NavWordReportXmlPart[1]/ns0:CurrentInspection[1]/ns0:ItemDescription[1]" w:storeItemID="{17DA42EE-3024-4C2F-8931-9EB6F7151F21}"/>
+              <w:dataBinding w:prefixMappings="xmlns:ns0='urn:microsoft-dynamics-nav/reports/Qlty_General_Purpose_Inspect/20405/'" w:xpath="/ns0:NavWordReportXmlPart[1]/ns0:CurrentInspection[1]/ns0:QltyInspection_Finished_By_User_ID[1]" w:storeItemID="{F00BF611-06BA-436C-902A-C0D5E8DF929B}"/>
               <w15:color w:val="808080"/>
               <w:text/>
             </w:sdtPr>
             <w:sdtContent>
               <w:p>
-                <w:pPr>
-                  <w:rPr>
-                    <w:rFonts w:asciiTheme="minorHAnsi" w:hAnsiTheme="minorHAnsi"/>
-                  </w:rPr>
-                </w:pPr>
-                <w:r>
-                  <w:t>ItemDescription</w:t>
-                </w:r>
-              </w:p>
-            </w:sdtContent>
-          </w:sdt>
-        </w:tc>
-        <w:tc>
-          <w:tcPr>
-            <w:tcW w:w="3780" w:type="dxa"/>
-          </w:tcPr>
-          <w:sdt>
-            <w:sdtPr>
-              <w:alias w:val="ItemTrackingDescription"/>
-              <w:tag w:val="#BC:InsertDataItem,DataItems/CurrentInspection/ItemTrackingDescription"/>
-              <w:id w:val="1610244472"/>
-              <w:placeholder>
-                <w:docPart w:val="E52ED68ED8474EB38ABFD788E6B53E47"/>
-              </w:placeholder>
-              <w:dataBinding w:prefixMappings="xmlns:ns0='urn:microsoft-dynamics-nav/reports/Qlty_General_Purpose_Inspect/20405/'" w:xpath="/ns0:NavWordReportXmlPart[1]/ns0:CurrentInspection[1]/ns0:ItemTrackingDescription[1]" w:storeItemID="{17DA42EE-3024-4C2F-8931-9EB6F7151F21}"/>
-              <w15:color w:val="808080"/>
-              <w:text/>
-            </w:sdtPr>
-            <w:sdtContent>
-              <w:p>
-                <w:pPr>
-                  <w:rPr>
-                    <w:rFonts w:asciiTheme="minorHAnsi" w:hAnsiTheme="minorHAnsi"/>
-                  </w:rPr>
-                </w:pPr>
                 <w:proofErr w:type="spellStart"/>
                 <w:r>
-                  <w:t>ItemTrackingDescription</w:t>
+                  <w:t>QltyInspection_Finished_By_User_ID</w:t>
                 </w:r>
                 <w:proofErr w:type="spellEnd"/>
               </w:p>
@@ -494,23 +590,25 @@
       <w:tblPr>
         <w:tblStyle w:val="BCDefaulttable"/>
         <w:tblW w:w="10483" w:type="dxa"/>
+        <w:tblLayout w:type="fixed"/>
         <w:tblLook w:val="0420" w:firstRow="1" w:lastRow="0" w:firstColumn="0" w:lastColumn="0" w:noHBand="0" w:noVBand="1"/>
       </w:tblPr>
       <w:tblGrid>
-        <w:gridCol w:w="144"/>
-        <w:gridCol w:w="3240"/>
+        <w:gridCol w:w="20"/>
+        <w:gridCol w:w="3364"/>
         <w:gridCol w:w="3427"/>
-        <w:gridCol w:w="3427"/>
-        <w:gridCol w:w="245"/>
+        <w:gridCol w:w="3629"/>
+        <w:gridCol w:w="43"/>
       </w:tblGrid>
       <w:tr>
         <w:trPr>
           <w:cnfStyle w:val="100000000000" w:firstRow="1" w:lastRow="0" w:firstColumn="0" w:lastColumn="0" w:oddVBand="0" w:evenVBand="0" w:oddHBand="0" w:evenHBand="0" w:firstRowFirstColumn="0" w:firstRowLastColumn="0" w:lastRowFirstColumn="0" w:lastRowLastColumn="0"/>
           <w:trHeight w:val="306"/>
+          <w:tblHeader/>
         </w:trPr>
         <w:tc>
           <w:tcPr>
-            <w:tcW w:w="90" w:type="dxa"/>
+            <w:tcW w:w="20" w:type="dxa"/>
           </w:tcPr>
           <w:p>
             <w:pPr>
@@ -525,20 +623,20 @@
         </w:tc>
         <w:sdt>
           <w:sdtPr>
-            <w:alias w:val="FieldLabel"/>
-            <w:tag w:val="#BC:InsertDataItem,Labels/FieldLabel"/>
+            <w:alias w:val="TestLabel"/>
+            <w:tag w:val="#BC:InsertDataItem,Labels/TestLabel"/>
             <w:id w:val="555513279"/>
             <w:placeholder>
               <w:docPart w:val="09AE8A9208CC4E20BC697BB15CE9DADA"/>
             </w:placeholder>
-            <w:dataBinding w:prefixMappings="xmlns:ns0='urn:microsoft-dynamics-nav/reports/Qlty_General_Purpose_Inspect/20405/'" w:xpath="/ns0:NavWordReportXmlPart[1]/ns0:Labels[1]/ns0:FieldLabel[1]" w:storeItemID="{17DA42EE-3024-4C2F-8931-9EB6F7151F21}"/>
+            <w:dataBinding w:prefixMappings="xmlns:ns0='urn:microsoft-dynamics-nav/reports/Qlty_General_Purpose_Inspect/20405/'" w:xpath="/ns0:NavWordReportXmlPart[1]/ns0:Labels[1]/ns0:TestLabel[1]" w:storeItemID="{17DA42EE-3024-4C2F-8931-9EB6F7151F21}"/>
             <w15:color w:val="808080"/>
             <w:text/>
           </w:sdtPr>
           <w:sdtContent>
             <w:tc>
               <w:tcPr>
-                <w:tcW w:w="3240" w:type="dxa"/>
+                <w:tcW w:w="3364" w:type="dxa"/>
                 <w:vAlign w:val="bottom"/>
               </w:tcPr>
               <w:p>
@@ -546,22 +644,27 @@
                   <w:spacing w:before="0" w:after="0" w:line="240" w:lineRule="auto"/>
                   <w:ind w:left="40"/>
                 </w:pPr>
+                <w:proofErr w:type="spellStart"/>
                 <w:r>
-                  <w:t>FieldLabel</w:t>
+                  <w:t>Test</w:t>
                 </w:r>
+                <w:r>
+                  <w:t>Label</w:t>
+                </w:r>
+                <w:proofErr w:type="spellEnd"/>
               </w:p>
             </w:tc>
           </w:sdtContent>
         </w:sdt>
         <w:sdt>
           <w:sdtPr>
-            <w:alias w:val="ResultLabel"/>
-            <w:tag w:val="#BC:InsertDataItem,Labels/ResultLabel"/>
+            <w:alias w:val="TestValueLabel"/>
+            <w:tag w:val="#BC:InsertDataItem,Labels/TestValueLabel"/>
             <w:id w:val="-1931646941"/>
             <w:placeholder>
               <w:docPart w:val="DefaultPlaceholder_-1854013440"/>
             </w:placeholder>
-            <w:dataBinding w:prefixMappings="xmlns:ns0='urn:microsoft-dynamics-nav/reports/Qlty_General_Purpose_Inspect/20405/'" w:xpath="/ns0:NavWordReportXmlPart[1]/ns0:Labels[1]/ns0:ResultLabel[1]" w:storeItemID="{17DA42EE-3024-4C2F-8931-9EB6F7151F21}"/>
+            <w:dataBinding w:prefixMappings="xmlns:ns0='urn:microsoft-dynamics-nav/reports/Qlty_General_Purpose_Inspect/20405/'" w:xpath="/ns0:NavWordReportXmlPart[1]/ns0:Labels[1]/ns0:TestValueLabel[1]" w:storeItemID="{17DA42EE-3024-4C2F-8931-9EB6F7151F21}"/>
             <w15:color w:val="808080"/>
             <w:text/>
           </w:sdtPr>
@@ -576,9 +679,14 @@
                   <w:spacing w:before="0" w:after="0" w:line="240" w:lineRule="auto"/>
                   <w:ind w:left="0"/>
                 </w:pPr>
+                <w:proofErr w:type="spellStart"/>
                 <w:r>
-                  <w:t>ResultLabel</w:t>
+                  <w:t>TestValue</w:t>
                 </w:r>
+                <w:r>
+                  <w:t>Label</w:t>
+                </w:r>
+                <w:proofErr w:type="spellEnd"/>
               </w:p>
             </w:tc>
           </w:sdtContent>
@@ -598,7 +706,7 @@
           <w:sdtContent>
             <w:tc>
               <w:tcPr>
-                <w:tcW w:w="3427" w:type="dxa"/>
+                <w:tcW w:w="3629" w:type="dxa"/>
                 <w:vAlign w:val="bottom"/>
               </w:tcPr>
               <w:p>
@@ -615,7 +723,7 @@
         </w:sdt>
         <w:tc>
           <w:tcPr>
-            <w:tcW w:w="296" w:type="dxa"/>
+            <w:tcW w:w="43" w:type="dxa"/>
           </w:tcPr>
           <w:p>
             <w:pPr>
@@ -666,7 +774,7 @@
                 </w:trPr>
                 <w:tc>
                   <w:tcPr>
-                    <w:tcW w:w="90" w:type="dxa"/>
+                    <w:tcW w:w="20" w:type="dxa"/>
                   </w:tcPr>
                   <w:p>
                     <w:pPr>
@@ -678,24 +786,25 @@
                 </w:tc>
                 <w:tc>
                   <w:tcPr>
-                    <w:tcW w:w="3427" w:type="dxa"/>
+                    <w:tcW w:w="10420" w:type="dxa"/>
                     <w:gridSpan w:val="3"/>
                   </w:tcPr>
                   <w:tbl>
                     <w:tblPr>
                       <w:tblStyle w:val="TableGrid"/>
-                      <w:tblW w:w="10094" w:type="dxa"/>
+                      <w:tblW w:w="10416" w:type="dxa"/>
+                      <w:tblLayout w:type="fixed"/>
                       <w:tblLook w:val="0600" w:firstRow="0" w:lastRow="0" w:firstColumn="0" w:lastColumn="0" w:noHBand="1" w:noVBand="1"/>
                     </w:tblPr>
                     <w:tblGrid>
-                      <w:gridCol w:w="3599"/>
-                      <w:gridCol w:w="3184"/>
-                      <w:gridCol w:w="3311"/>
+                      <w:gridCol w:w="3396"/>
+                      <w:gridCol w:w="3420"/>
+                      <w:gridCol w:w="3600"/>
                     </w:tblGrid>
                     <w:tr>
                       <w:tc>
                         <w:tcPr>
-                          <w:tcW w:w="3240" w:type="dxa"/>
+                          <w:tcW w:w="3396" w:type="dxa"/>
                         </w:tcPr>
                         <w:p>
                           <w:sdt>
@@ -771,7 +880,7 @@
                         <w:sdtContent>
                           <w:tc>
                             <w:tcPr>
-                              <w:tcW w:w="3427" w:type="dxa"/>
+                              <w:tcW w:w="3420" w:type="dxa"/>
                             </w:tcPr>
                             <w:p>
                               <w:r>
@@ -783,7 +892,7 @@
                       </w:sdt>
                       <w:tc>
                         <w:tcPr>
-                          <w:tcW w:w="3427" w:type="dxa"/>
+                          <w:tcW w:w="3600" w:type="dxa"/>
                         </w:tcPr>
                         <w:sdt>
                           <w:sdtPr>
@@ -854,13 +963,15 @@
                             <w:sdtContent>
                               <w:tc>
                                 <w:tcPr>
-                                  <w:tcW w:w="10094" w:type="dxa"/>
+                                  <w:tcW w:w="10416" w:type="dxa"/>
                                   <w:gridSpan w:val="3"/>
                                 </w:tcPr>
                                 <w:p>
+                                  <w:proofErr w:type="spellStart"/>
                                   <w:r>
                                     <w:t>Field_LineCommentary</w:t>
                                   </w:r>
+                                  <w:proofErr w:type="spellEnd"/>
                                 </w:p>
                               </w:tc>
                             </w:sdtContent>
@@ -873,7 +984,7 @@
                 </w:tc>
                 <w:tc>
                   <w:tcPr>
-                    <w:tcW w:w="296" w:type="dxa"/>
+                    <w:tcW w:w="43" w:type="dxa"/>
                   </w:tcPr>
                   <w:p>
                     <w:pPr>
@@ -897,12 +1008,10 @@
       </w:pPr>
     </w:p>
     <w:sectPr>
-      <w:headerReference w:type="even" r:id="rId9"/>
-      <w:headerReference w:type="default" r:id="rId10"/>
-      <w:footerReference w:type="even" r:id="rId11"/>
-      <w:footerReference w:type="default" r:id="rId12"/>
-      <w:headerReference w:type="first" r:id="rId13"/>
-      <w:footerReference w:type="first" r:id="rId14"/>
+      <w:headerReference w:type="default" r:id="rId9"/>
+      <w:footerReference w:type="default" r:id="rId10"/>
+      <w:headerReference w:type="first" r:id="rId11"/>
+      <w:footerReference w:type="first" r:id="rId12"/>
       <w:pgSz w:w="11906" w:h="16838" w:code="9"/>
       <w:pgMar w:top="1890" w:right="720" w:bottom="1440" w:left="720" w:header="180" w:footer="0" w:gutter="0"/>
       <w:cols w:space="708"/>
@@ -940,16 +1049,6 @@
 
 <file path=word/footer1.xml><?xml version="1.0" encoding="utf-8"?>
 <w:ftr xmlns:wpc="http://schemas.microsoft.com/office/word/2010/wordprocessingCanvas" xmlns:cx="http://schemas.microsoft.com/office/drawing/2014/chartex" xmlns:cx1="http://schemas.microsoft.com/office/drawing/2015/9/8/chartex" xmlns:cx2="http://schemas.microsoft.com/office/drawing/2015/10/21/chartex" xmlns:cx3="http://schemas.microsoft.com/office/drawing/2016/5/9/chartex" xmlns:cx4="http://schemas.microsoft.com/office/drawing/2016/5/10/chartex" xmlns:cx5="http://schemas.microsoft.com/office/drawing/2016/5/11/chartex" xmlns:cx6="http://schemas.microsoft.com/office/drawing/2016/5/12/chartex" xmlns:cx7="http://schemas.microsoft.com/office/drawing/2016/5/13/chartex" xmlns:cx8="http://schemas.microsoft.com/office/drawing/2016/5/14/chartex" xmlns:mc="http://schemas.openxmlformats.org/markup-compatibility/2006" xmlns:aink="http://schemas.microsoft.com/office/drawing/2016/ink" xmlns:am3d="http://schemas.microsoft.com/office/drawing/2017/model3d" xmlns:o="urn:schemas-microsoft-com:office:office" xmlns:oel="http://schemas.microsoft.com/office/2019/extlst" xmlns:r="http://schemas.openxmlformats.org/officeDocument/2006/relationships" xmlns:m="http://schemas.openxmlformats.org/officeDocument/2006/math" xmlns:v="urn:schemas-microsoft-com:vml" xmlns:wp14="http://schemas.microsoft.com/office/word/2010/wordprocessingDrawing" xmlns:wp="http://schemas.openxmlformats.org/drawingml/2006/wordprocessingDrawing" xmlns:w10="urn:schemas-microsoft-com:office:word" xmlns:w="http://schemas.openxmlformats.org/wordprocessingml/2006/main" xmlns:w14="http://schemas.microsoft.com/office/word/2010/wordml" xmlns:w15="http://schemas.microsoft.com/office/word/2012/wordml" xmlns:w16cex="http://schemas.microsoft.com/office/word/2018/wordml/cex" xmlns:w16cid="http://schemas.microsoft.com/office/word/2016/wordml/cid" xmlns:w16="http://schemas.microsoft.com/office/word/2018/wordml" xmlns:w16du="http://schemas.microsoft.com/office/word/2023/wordml/word16du" xmlns:w16sdtdh="http://schemas.microsoft.com/office/word/2020/wordml/sdtdatahash" xmlns:w16sdtfl="http://schemas.microsoft.com/office/word/2024/wordml/sdtformatlock" xmlns:w16se="http://schemas.microsoft.com/office/word/2015/wordml/symex" xmlns:wpg="http://schemas.microsoft.com/office/word/2010/wordprocessingGroup" xmlns:wpi="http://schemas.microsoft.com/office/word/2010/wordprocessingInk" xmlns:wne="http://schemas.microsoft.com/office/word/2006/wordml" xmlns:wps="http://schemas.microsoft.com/office/word/2010/wordprocessingShape" mc:Ignorable="w14 w15 w16se w16cid w16 w16cex w16sdtdh w16sdtfl w16du wp14">
-  <w:p>
-    <w:pPr>
-      <w:pStyle w:val="Footer"/>
-    </w:pPr>
-  </w:p>
-</w:ftr>
-</file>
-
-<file path=word/footer2.xml><?xml version="1.0" encoding="utf-8"?>
-<w:ftr xmlns:wpc="http://schemas.microsoft.com/office/word/2010/wordprocessingCanvas" xmlns:cx="http://schemas.microsoft.com/office/drawing/2014/chartex" xmlns:cx1="http://schemas.microsoft.com/office/drawing/2015/9/8/chartex" xmlns:cx2="http://schemas.microsoft.com/office/drawing/2015/10/21/chartex" xmlns:cx3="http://schemas.microsoft.com/office/drawing/2016/5/9/chartex" xmlns:cx4="http://schemas.microsoft.com/office/drawing/2016/5/10/chartex" xmlns:cx5="http://schemas.microsoft.com/office/drawing/2016/5/11/chartex" xmlns:cx6="http://schemas.microsoft.com/office/drawing/2016/5/12/chartex" xmlns:cx7="http://schemas.microsoft.com/office/drawing/2016/5/13/chartex" xmlns:cx8="http://schemas.microsoft.com/office/drawing/2016/5/14/chartex" xmlns:mc="http://schemas.openxmlformats.org/markup-compatibility/2006" xmlns:aink="http://schemas.microsoft.com/office/drawing/2016/ink" xmlns:am3d="http://schemas.microsoft.com/office/drawing/2017/model3d" xmlns:o="urn:schemas-microsoft-com:office:office" xmlns:oel="http://schemas.microsoft.com/office/2019/extlst" xmlns:r="http://schemas.openxmlformats.org/officeDocument/2006/relationships" xmlns:m="http://schemas.openxmlformats.org/officeDocument/2006/math" xmlns:v="urn:schemas-microsoft-com:vml" xmlns:wp14="http://schemas.microsoft.com/office/word/2010/wordprocessingDrawing" xmlns:wp="http://schemas.openxmlformats.org/drawingml/2006/wordprocessingDrawing" xmlns:w10="urn:schemas-microsoft-com:office:word" xmlns:w="http://schemas.openxmlformats.org/wordprocessingml/2006/main" xmlns:w14="http://schemas.microsoft.com/office/word/2010/wordml" xmlns:w15="http://schemas.microsoft.com/office/word/2012/wordml" xmlns:w16cex="http://schemas.microsoft.com/office/word/2018/wordml/cex" xmlns:w16cid="http://schemas.microsoft.com/office/word/2016/wordml/cid" xmlns:w16="http://schemas.microsoft.com/office/word/2018/wordml" xmlns:w16du="http://schemas.microsoft.com/office/word/2023/wordml/word16du" xmlns:w16sdtdh="http://schemas.microsoft.com/office/word/2020/wordml/sdtdatahash" xmlns:w16sdtfl="http://schemas.microsoft.com/office/word/2024/wordml/sdtformatlock" xmlns:w16se="http://schemas.microsoft.com/office/word/2015/wordml/symex" xmlns:wpg="http://schemas.microsoft.com/office/word/2010/wordprocessingGroup" xmlns:wpi="http://schemas.microsoft.com/office/word/2010/wordprocessingInk" xmlns:wne="http://schemas.microsoft.com/office/word/2006/wordml" xmlns:wps="http://schemas.microsoft.com/office/word/2010/wordprocessingShape" mc:Ignorable="w14 w15 w16se w16cid w16 w16cex w16sdtdh w16sdtfl w16du wp14">
   <w:sdt>
     <w:sdtPr>
       <w:id w:val="1775671828"/>
@@ -970,11 +1069,36 @@
           <w:pStyle w:val="Style1"/>
           <w:jc w:val="right"/>
         </w:pPr>
+        <w:sdt>
+          <w:sdtPr>
+            <w:rPr>
+              <w:rStyle w:val="SidetalpaginaChar"/>
+            </w:rPr>
+            <w:alias w:val="PageLabel"/>
+            <w:tag w:val="#BC:InsertDataItem,Labels/PageLabel"/>
+            <w:id w:val="-1915702074"/>
+            <w:placeholder>
+              <w:docPart w:val="1BEAC63591D8421CBFD9F24D4CF63EEE"/>
+            </w:placeholder>
+            <w:dataBinding w:prefixMappings="xmlns:ns0='urn:microsoft-dynamics-nav/reports/Qlty_General_Purpose_Inspect/20405/'" w:xpath="/ns0:NavWordReportXmlPart[1]/ns0:Labels[1]/ns0:PageLabel[1]" w:storeItemID="{F00BF611-06BA-436C-902A-C0D5E8DF929B}"/>
+            <w:text/>
+          </w:sdtPr>
+          <w:sdtContent>
+            <w:proofErr w:type="spellStart"/>
+            <w:r>
+              <w:rPr>
+                <w:rStyle w:val="SidetalpaginaChar"/>
+              </w:rPr>
+              <w:t>PageLabel</w:t>
+            </w:r>
+            <w:proofErr w:type="spellEnd"/>
+          </w:sdtContent>
+        </w:sdt>
         <w:r>
           <w:rPr>
             <w:rStyle w:val="SidetalpaginaChar"/>
           </w:rPr>
-          <w:t xml:space="preserve">Page </w:t>
+          <w:t xml:space="preserve"> </w:t>
         </w:r>
         <w:r>
           <w:rPr>
@@ -1010,7 +1134,19 @@
           <w:rPr>
             <w:rStyle w:val="SidetalpaginaChar"/>
           </w:rPr>
-          <w:t xml:space="preserve"> of </w:t>
+          <w:t xml:space="preserve"> </w:t>
+        </w:r>
+        <w:r>
+          <w:rPr>
+            <w:rStyle w:val="SidetalpaginaChar"/>
+          </w:rPr>
+          <w:t>/</w:t>
+        </w:r>
+        <w:r>
+          <w:rPr>
+            <w:rStyle w:val="SidetalpaginaChar"/>
+          </w:rPr>
+          <w:t xml:space="preserve"> </w:t>
         </w:r>
         <w:r>
           <w:rPr>
@@ -1063,7 +1199,7 @@
 </w:ftr>
 </file>
 
-<file path=word/footer3.xml><?xml version="1.0" encoding="utf-8"?>
+<file path=word/footer2.xml><?xml version="1.0" encoding="utf-8"?>
 <w:ftr xmlns:wpc="http://schemas.microsoft.com/office/word/2010/wordprocessingCanvas" xmlns:cx="http://schemas.microsoft.com/office/drawing/2014/chartex" xmlns:cx1="http://schemas.microsoft.com/office/drawing/2015/9/8/chartex" xmlns:cx2="http://schemas.microsoft.com/office/drawing/2015/10/21/chartex" xmlns:cx3="http://schemas.microsoft.com/office/drawing/2016/5/9/chartex" xmlns:cx4="http://schemas.microsoft.com/office/drawing/2016/5/10/chartex" xmlns:cx5="http://schemas.microsoft.com/office/drawing/2016/5/11/chartex" xmlns:cx6="http://schemas.microsoft.com/office/drawing/2016/5/12/chartex" xmlns:cx7="http://schemas.microsoft.com/office/drawing/2016/5/13/chartex" xmlns:cx8="http://schemas.microsoft.com/office/drawing/2016/5/14/chartex" xmlns:mc="http://schemas.openxmlformats.org/markup-compatibility/2006" xmlns:aink="http://schemas.microsoft.com/office/drawing/2016/ink" xmlns:am3d="http://schemas.microsoft.com/office/drawing/2017/model3d" xmlns:o="urn:schemas-microsoft-com:office:office" xmlns:oel="http://schemas.microsoft.com/office/2019/extlst" xmlns:r="http://schemas.openxmlformats.org/officeDocument/2006/relationships" xmlns:m="http://schemas.openxmlformats.org/officeDocument/2006/math" xmlns:v="urn:schemas-microsoft-com:vml" xmlns:wp14="http://schemas.microsoft.com/office/word/2010/wordprocessingDrawing" xmlns:wp="http://schemas.openxmlformats.org/drawingml/2006/wordprocessingDrawing" xmlns:w10="urn:schemas-microsoft-com:office:word" xmlns:w="http://schemas.openxmlformats.org/wordprocessingml/2006/main" xmlns:w14="http://schemas.microsoft.com/office/word/2010/wordml" xmlns:w15="http://schemas.microsoft.com/office/word/2012/wordml" xmlns:w16cex="http://schemas.microsoft.com/office/word/2018/wordml/cex" xmlns:w16cid="http://schemas.microsoft.com/office/word/2016/wordml/cid" xmlns:w16="http://schemas.microsoft.com/office/word/2018/wordml" xmlns:w16du="http://schemas.microsoft.com/office/word/2023/wordml/word16du" xmlns:w16sdtdh="http://schemas.microsoft.com/office/word/2020/wordml/sdtdatahash" xmlns:w16sdtfl="http://schemas.microsoft.com/office/word/2024/wordml/sdtformatlock" xmlns:w16se="http://schemas.microsoft.com/office/word/2015/wordml/symex" xmlns:wpg="http://schemas.microsoft.com/office/word/2010/wordprocessingGroup" xmlns:wpi="http://schemas.microsoft.com/office/word/2010/wordprocessingInk" xmlns:wne="http://schemas.microsoft.com/office/word/2006/wordml" xmlns:wps="http://schemas.microsoft.com/office/word/2010/wordprocessingShape" mc:Ignorable="w14 w15 w16se w16cid w16 w16cex w16sdtdh w16sdtfl w16du wp14">
   <w:tbl>
     <w:tblPr>
@@ -1284,11 +1420,36 @@
               </w:rPr>
             </w:sdtEndPr>
             <w:sdtContent>
+              <w:sdt>
+                <w:sdtPr>
+                  <w:rPr>
+                    <w:rStyle w:val="SidetalpaginaChar"/>
+                  </w:rPr>
+                  <w:alias w:val="PageLabel"/>
+                  <w:tag w:val="#BC:InsertDataItem,Labels/PageLabel"/>
+                  <w:id w:val="-2060774807"/>
+                  <w:placeholder>
+                    <w:docPart w:val="284F04A4C5B44E9FAF1D142E96EE0688"/>
+                  </w:placeholder>
+                  <w:dataBinding w:prefixMappings="xmlns:ns0='urn:microsoft-dynamics-nav/reports/Qlty_General_Purpose_Inspect/20405/'" w:xpath="/ns0:NavWordReportXmlPart[1]/ns0:Labels[1]/ns0:PageLabel[1]" w:storeItemID="{F00BF611-06BA-436C-902A-C0D5E8DF929B}"/>
+                  <w:text/>
+                </w:sdtPr>
+                <w:sdtContent>
+                  <w:proofErr w:type="spellStart"/>
+                  <w:r>
+                    <w:rPr>
+                      <w:rStyle w:val="SidetalpaginaChar"/>
+                    </w:rPr>
+                    <w:t>PageLabel</w:t>
+                  </w:r>
+                  <w:proofErr w:type="spellEnd"/>
+                </w:sdtContent>
+              </w:sdt>
               <w:r>
                 <w:rPr>
                   <w:rStyle w:val="SidetalpaginaChar"/>
                 </w:rPr>
-                <w:t xml:space="preserve">Page </w:t>
+                <w:t xml:space="preserve"> </w:t>
               </w:r>
               <w:r>
                 <w:rPr>
@@ -1324,7 +1485,19 @@
                 <w:rPr>
                   <w:rStyle w:val="SidetalpaginaChar"/>
                 </w:rPr>
-                <w:t xml:space="preserve"> of </w:t>
+                <w:t xml:space="preserve"> </w:t>
+              </w:r>
+              <w:r>
+                <w:rPr>
+                  <w:rStyle w:val="SidetalpaginaChar"/>
+                </w:rPr>
+                <w:t>/</w:t>
+              </w:r>
+              <w:r>
+                <w:rPr>
+                  <w:rStyle w:val="SidetalpaginaChar"/>
+                </w:rPr>
+                <w:t xml:space="preserve"> </w:t>
               </w:r>
               <w:r>
                 <w:rPr>
@@ -1396,16 +1569,6 @@
 </file>
 
 <file path=word/header1.xml><?xml version="1.0" encoding="utf-8"?>
-<w:hdr xmlns:wpc="http://schemas.microsoft.com/office/word/2010/wordprocessingCanvas" xmlns:cx="http://schemas.microsoft.com/office/drawing/2014/chartex" xmlns:cx1="http://schemas.microsoft.com/office/drawing/2015/9/8/chartex" xmlns:cx2="http://schemas.microsoft.com/office/drawing/2015/10/21/chartex" xmlns:cx3="http://schemas.microsoft.com/office/drawing/2016/5/9/chartex" xmlns:cx4="http://schemas.microsoft.com/office/drawing/2016/5/10/chartex" xmlns:cx5="http://schemas.microsoft.com/office/drawing/2016/5/11/chartex" xmlns:cx6="http://schemas.microsoft.com/office/drawing/2016/5/12/chartex" xmlns:cx7="http://schemas.microsoft.com/office/drawing/2016/5/13/chartex" xmlns:cx8="http://schemas.microsoft.com/office/drawing/2016/5/14/chartex" xmlns:mc="http://schemas.openxmlformats.org/markup-compatibility/2006" xmlns:aink="http://schemas.microsoft.com/office/drawing/2016/ink" xmlns:am3d="http://schemas.microsoft.com/office/drawing/2017/model3d" xmlns:o="urn:schemas-microsoft-com:office:office" xmlns:oel="http://schemas.microsoft.com/office/2019/extlst" xmlns:r="http://schemas.openxmlformats.org/officeDocument/2006/relationships" xmlns:m="http://schemas.openxmlformats.org/officeDocument/2006/math" xmlns:v="urn:schemas-microsoft-com:vml" xmlns:wp14="http://schemas.microsoft.com/office/word/2010/wordprocessingDrawing" xmlns:wp="http://schemas.openxmlformats.org/drawingml/2006/wordprocessingDrawing" xmlns:w10="urn:schemas-microsoft-com:office:word" xmlns:w="http://schemas.openxmlformats.org/wordprocessingml/2006/main" xmlns:w14="http://schemas.microsoft.com/office/word/2010/wordml" xmlns:w15="http://schemas.microsoft.com/office/word/2012/wordml" xmlns:w16cex="http://schemas.microsoft.com/office/word/2018/wordml/cex" xmlns:w16cid="http://schemas.microsoft.com/office/word/2016/wordml/cid" xmlns:w16="http://schemas.microsoft.com/office/word/2018/wordml" xmlns:w16du="http://schemas.microsoft.com/office/word/2023/wordml/word16du" xmlns:w16sdtdh="http://schemas.microsoft.com/office/word/2020/wordml/sdtdatahash" xmlns:w16sdtfl="http://schemas.microsoft.com/office/word/2024/wordml/sdtformatlock" xmlns:w16se="http://schemas.microsoft.com/office/word/2015/wordml/symex" xmlns:wpg="http://schemas.microsoft.com/office/word/2010/wordprocessingGroup" xmlns:wpi="http://schemas.microsoft.com/office/word/2010/wordprocessingInk" xmlns:wne="http://schemas.microsoft.com/office/word/2006/wordml" xmlns:wps="http://schemas.microsoft.com/office/word/2010/wordprocessingShape" mc:Ignorable="w14 w15 w16se w16cid w16 w16cex w16sdtdh w16sdtfl w16du wp14">
-  <w:p>
-    <w:pPr>
-      <w:pStyle w:val="Header"/>
-    </w:pPr>
-  </w:p>
-</w:hdr>
-</file>
-
-<file path=word/header2.xml><?xml version="1.0" encoding="utf-8"?>
 <w:hdr xmlns:wpc="http://schemas.microsoft.com/office/word/2010/wordprocessingCanvas" xmlns:cx="http://schemas.microsoft.com/office/drawing/2014/chartex" xmlns:cx1="http://schemas.microsoft.com/office/drawing/2015/9/8/chartex" xmlns:cx2="http://schemas.microsoft.com/office/drawing/2015/10/21/chartex" xmlns:cx3="http://schemas.microsoft.com/office/drawing/2016/5/9/chartex" xmlns:cx4="http://schemas.microsoft.com/office/drawing/2016/5/10/chartex" xmlns:cx5="http://schemas.microsoft.com/office/drawing/2016/5/11/chartex" xmlns:cx6="http://schemas.microsoft.com/office/drawing/2016/5/12/chartex" xmlns:cx7="http://schemas.microsoft.com/office/drawing/2016/5/13/chartex" xmlns:cx8="http://schemas.microsoft.com/office/drawing/2016/5/14/chartex" xmlns:mc="http://schemas.openxmlformats.org/markup-compatibility/2006" xmlns:aink="http://schemas.microsoft.com/office/drawing/2016/ink" xmlns:am3d="http://schemas.microsoft.com/office/drawing/2017/model3d" xmlns:o="urn:schemas-microsoft-com:office:office" xmlns:oel="http://schemas.microsoft.com/office/2019/extlst" xmlns:r="http://schemas.openxmlformats.org/officeDocument/2006/relationships" xmlns:m="http://schemas.openxmlformats.org/officeDocument/2006/math" xmlns:v="urn:schemas-microsoft-com:vml" xmlns:wp14="http://schemas.microsoft.com/office/word/2010/wordprocessingDrawing" xmlns:wp="http://schemas.openxmlformats.org/drawingml/2006/wordprocessingDrawing" xmlns:w10="urn:schemas-microsoft-com:office:word" xmlns:w="http://schemas.openxmlformats.org/wordprocessingml/2006/main" xmlns:w14="http://schemas.microsoft.com/office/word/2010/wordml" xmlns:w15="http://schemas.microsoft.com/office/word/2012/wordml" xmlns:w16cex="http://schemas.microsoft.com/office/word/2018/wordml/cex" xmlns:w16cid="http://schemas.microsoft.com/office/word/2016/wordml/cid" xmlns:w16="http://schemas.microsoft.com/office/word/2018/wordml" xmlns:w16du="http://schemas.microsoft.com/office/word/2023/wordml/word16du" xmlns:w16sdtdh="http://schemas.microsoft.com/office/word/2020/wordml/sdtdatahash" xmlns:w16sdtfl="http://schemas.microsoft.com/office/word/2024/wordml/sdtformatlock" xmlns:w16se="http://schemas.microsoft.com/office/word/2015/wordml/symex" xmlns:wpg="http://schemas.microsoft.com/office/word/2010/wordprocessingGroup" xmlns:wpi="http://schemas.microsoft.com/office/word/2010/wordprocessingInk" xmlns:wne="http://schemas.microsoft.com/office/word/2006/wordml" xmlns:wps="http://schemas.microsoft.com/office/word/2010/wordprocessingShape" mc:Ignorable="w14 w15 w16se w16cid w16 w16cex w16sdtdh w16sdtfl w16du wp14">
   <w:p/>
   <w:tbl>
@@ -1509,6 +1672,110 @@
         </w:sdtContent>
       </w:sdt>
     </w:tr>
+    <w:tr>
+      <w:tc>
+        <w:tcPr>
+          <w:tcW w:w="5228" w:type="dxa"/>
+        </w:tcPr>
+        <w:sdt>
+          <w:sdtPr>
+            <w:alias w:val="QltyInspection_No"/>
+            <w:tag w:val="#BC:InsertDataItem,DataItems/CurrentInspection/QltyInspection_No"/>
+            <w:id w:val="-846173727"/>
+            <w:placeholder>
+              <w:docPart w:val="FC855B1C897846A49A609CA136B65228"/>
+            </w:placeholder>
+            <w:dataBinding w:prefixMappings="xmlns:ns0='urn:microsoft-dynamics-nav/reports/Qlty_General_Purpose_Inspect/20405/'" w:xpath="/ns0:NavWordReportXmlPart[1]/ns0:CurrentInspection[1]/ns0:QltyInspection_No[1]" w:storeItemID="{F00BF611-06BA-436C-902A-C0D5E8DF929B}"/>
+            <w15:color w:val="808080"/>
+            <w:text/>
+          </w:sdtPr>
+          <w:sdtContent>
+            <w:p>
+              <w:pPr>
+                <w:rPr>
+                  <w:rStyle w:val="Strong"/>
+                  <w:b w:val="0"/>
+                  <w:bCs w:val="0"/>
+                </w:rPr>
+              </w:pPr>
+              <w:proofErr w:type="spellStart"/>
+              <w:r>
+                <w:t>QltyInspection_No</w:t>
+              </w:r>
+              <w:proofErr w:type="spellEnd"/>
+            </w:p>
+          </w:sdtContent>
+        </w:sdt>
+      </w:tc>
+      <w:tc>
+        <w:tcPr>
+          <w:tcW w:w="5228" w:type="dxa"/>
+        </w:tcPr>
+        <w:p>
+          <w:pPr>
+            <w:pStyle w:val="Header"/>
+            <w:jc w:val="right"/>
+            <w:rPr>
+              <w:rStyle w:val="Strong"/>
+              <w:bCs w:val="0"/>
+            </w:rPr>
+          </w:pPr>
+        </w:p>
+      </w:tc>
+    </w:tr>
+    <w:tr>
+      <w:sdt>
+        <w:sdtPr>
+          <w:alias w:val="ReinspectionSequenceInformation"/>
+          <w:tag w:val="#BC:InsertDataItem,DataItems/CurrentInspection/ReinspectionSequenceInformation"/>
+          <w:id w:val="2112705256"/>
+          <w:placeholder>
+            <w:docPart w:val="42E191C0690647B191CC0223A92899C0"/>
+          </w:placeholder>
+          <w15:dataBinding w:prefixMappings="xmlns:ns0='urn:microsoft-dynamics-nav/reports/Qlty_Certificate_of_Analysis/20401/' " w:xpath="/ns0:NavWordReportXmlPart[1]/ns0:CurrentInspection[1]/ns0:ReinspectionSequenceInformation[1]" w:storeItemID="{F00BF611-06BA-436C-902A-C0D5E8DF929B}"/>
+        </w:sdtPr>
+        <w:sdtContent>
+          <w:tc>
+            <w:tcPr>
+              <w:tcW w:w="5228" w:type="dxa"/>
+            </w:tcPr>
+            <w:p>
+              <w:pPr>
+                <w:pStyle w:val="Headerfooterheadings"/>
+                <w:rPr>
+                  <w:rStyle w:val="Strong"/>
+                  <w:bCs w:val="0"/>
+                </w:rPr>
+              </w:pPr>
+              <w:proofErr w:type="spellStart"/>
+              <w:r>
+                <w:rPr>
+                  <w:b w:val="0"/>
+                  <w:bCs/>
+                </w:rPr>
+                <w:t>ReinspectionSequenceInformation</w:t>
+              </w:r>
+              <w:proofErr w:type="spellEnd"/>
+            </w:p>
+          </w:tc>
+        </w:sdtContent>
+      </w:sdt>
+      <w:tc>
+        <w:tcPr>
+          <w:tcW w:w="5228" w:type="dxa"/>
+        </w:tcPr>
+        <w:p>
+          <w:pPr>
+            <w:pStyle w:val="Header"/>
+            <w:jc w:val="right"/>
+            <w:rPr>
+              <w:rStyle w:val="Strong"/>
+              <w:bCs w:val="0"/>
+            </w:rPr>
+          </w:pPr>
+        </w:p>
+      </w:tc>
+    </w:tr>
   </w:tbl>
   <w:p>
     <w:pPr>
@@ -1523,7 +1790,7 @@
 </w:hdr>
 </file>
 
-<file path=word/header3.xml><?xml version="1.0" encoding="utf-8"?>
+<file path=word/header2.xml><?xml version="1.0" encoding="utf-8"?>
 <w:hdr xmlns:a="http://schemas.openxmlformats.org/drawingml/2006/main" xmlns:pic="http://schemas.openxmlformats.org/drawingml/2006/picture" xmlns:a14="http://schemas.microsoft.com/office/drawing/2010/main" xmlns:wpc="http://schemas.microsoft.com/office/word/2010/wordprocessingCanvas" xmlns:cx="http://schemas.microsoft.com/office/drawing/2014/chartex" xmlns:cx1="http://schemas.microsoft.com/office/drawing/2015/9/8/chartex" xmlns:cx2="http://schemas.microsoft.com/office/drawing/2015/10/21/chartex" xmlns:cx3="http://schemas.microsoft.com/office/drawing/2016/5/9/chartex" xmlns:cx4="http://schemas.microsoft.com/office/drawing/2016/5/10/chartex" xmlns:cx5="http://schemas.microsoft.com/office/drawing/2016/5/11/chartex" xmlns:cx6="http://schemas.microsoft.com/office/drawing/2016/5/12/chartex" xmlns:cx7="http://schemas.microsoft.com/office/drawing/2016/5/13/chartex" xmlns:cx8="http://schemas.microsoft.com/office/drawing/2016/5/14/chartex" xmlns:mc="http://schemas.openxmlformats.org/markup-compatibility/2006" xmlns:aink="http://schemas.microsoft.com/office/drawing/2016/ink" xmlns:am3d="http://schemas.microsoft.com/office/drawing/2017/model3d" xmlns:o="urn:schemas-microsoft-com:office:office" xmlns:oel="http://schemas.microsoft.com/office/2019/extlst" xmlns:r="http://schemas.openxmlformats.org/officeDocument/2006/relationships" xmlns:m="http://schemas.openxmlformats.org/officeDocument/2006/math" xmlns:v="urn:schemas-microsoft-com:vml" xmlns:wp14="http://schemas.microsoft.com/office/word/2010/wordprocessingDrawing" xmlns:wp="http://schemas.openxmlformats.org/drawingml/2006/wordprocessingDrawing" xmlns:w10="urn:schemas-microsoft-com:office:word" xmlns:w="http://schemas.openxmlformats.org/wordprocessingml/2006/main" xmlns:w14="http://schemas.microsoft.com/office/word/2010/wordml" xmlns:w15="http://schemas.microsoft.com/office/word/2012/wordml" xmlns:w16cex="http://schemas.microsoft.com/office/word/2018/wordml/cex" xmlns:w16cid="http://schemas.microsoft.com/office/word/2016/wordml/cid" xmlns:w16="http://schemas.microsoft.com/office/word/2018/wordml" xmlns:w16du="http://schemas.microsoft.com/office/word/2023/wordml/word16du" xmlns:w16sdtdh="http://schemas.microsoft.com/office/word/2020/wordml/sdtdatahash" xmlns:w16sdtfl="http://schemas.microsoft.com/office/word/2024/wordml/sdtformatlock" xmlns:w16se="http://schemas.microsoft.com/office/word/2015/wordml/symex" xmlns:wpg="http://schemas.microsoft.com/office/word/2010/wordprocessingGroup" xmlns:wpi="http://schemas.microsoft.com/office/word/2010/wordprocessingInk" xmlns:wne="http://schemas.microsoft.com/office/word/2006/wordml" xmlns:wps="http://schemas.microsoft.com/office/word/2010/wordprocessingShape" mc:Ignorable="w14 w15 w16se w16cid w16 w16cex w16sdtdh w16sdtfl w16du wp14">
   <w:tbl>
     <w:tblPr>
@@ -1543,7 +1810,7 @@
       <w:tc>
         <w:tcPr>
           <w:tcW w:w="5485" w:type="dxa"/>
-          <w:vAlign w:val="bottom"/>
+          <w:vAlign w:val="center"/>
         </w:tcPr>
         <w:p>
           <w:pPr>
@@ -1560,7 +1827,7 @@
               <w:placeholder>
                 <w:docPart w:val="0CCB450A212F4B07B5BC2C6439FCE639"/>
               </w:placeholder>
-              <w:dataBinding w:prefixMappings="xmlns:ns0='urn:microsoft-dynamics-nav/reports/Qlty_General_Purpose_Inspect/20405/'" w:xpath="/ns0:NavWordReportXmlPart[1]/ns0:Labels[1]/ns0:ReportTitleLabel[1]" w:storeItemID="{F00BF611-06BA-436C-902A-C0D5E8DF929B}"/>
+              <w:dataBinding w:prefixMappings="xmlns:ns0='urn:microsoft-dynamics-nav/reports/Qlty_General_Purpose_Inspect/20405/'" w:xpath="/ns0:NavWordReportXmlPart[1]/ns0:Labels[1]/ns0:ReportTitleLabel[1]" w:storeItemID="{17DA42EE-3024-4C2F-8931-9EB6F7151F21}"/>
               <w15:color w:val="808080"/>
               <w:text/>
             </w:sdtPr>
@@ -1620,7 +1887,7 @@
               <w:tag w:val="#Nav: Qlty_General_Purpose_Inspect/20405"/>
               <w:id w:val="757102674"/>
               <w:showingPlcHdr/>
-              <w:dataBinding w:prefixMappings="xmlns:ns0='urn:microsoft-dynamics-nav/reports/Qlty_General_Purpose_Inspect/20405/'" w:xpath="/ns0:NavWordReportXmlPart[1]/ns0:CurrentInspection[1]/ns0:CompanyLogo[1]" w:storeItemID="{F00BF611-06BA-436C-902A-C0D5E8DF929B}"/>
+              <w:dataBinding w:prefixMappings="xmlns:ns0='urn:microsoft-dynamics-nav/reports/Qlty_General_Purpose_Inspect/20405/'" w:xpath="/ns0:NavWordReportXmlPart[1]/ns0:CurrentInspection[1]/ns0:CompanyLogo[1]" w:storeItemID="{17DA42EE-3024-4C2F-8931-9EB6F7151F21}"/>
               <w:picture/>
             </w:sdtPr>
             <w:sdtContent>
@@ -1691,22 +1958,41 @@
       <w:trPr>
         <w:trHeight w:val="529"/>
       </w:trPr>
-      <w:tc>
-        <w:tcPr>
-          <w:tcW w:w="5485" w:type="dxa"/>
-        </w:tcPr>
-        <w:p>
-          <w:pPr>
-            <w:pStyle w:val="BodytekstinHeaderFooter"/>
-            <w:tabs>
-              <w:tab w:val="left" w:pos="1030"/>
-            </w:tabs>
-            <w:rPr>
-              <w:rStyle w:val="TitleChar"/>
-            </w:rPr>
-          </w:pPr>
-        </w:p>
-      </w:tc>
+      <w:sdt>
+        <w:sdtPr>
+          <w:alias w:val="COAContact_All"/>
+          <w:tag w:val="#BC:InsertDataItem,DataItems/COAContact_All"/>
+          <w:id w:val="-1661616009"/>
+          <w:placeholder>
+            <w:docPart w:val="9B3BA5505C4D49FE8933936B86513EDE"/>
+          </w:placeholder>
+          <w15:dataBinding w:prefixMappings="xmlns:ns0='urn:microsoft-dynamics-nav/reports/Qlty_Certificate_of_Analysis/20401/' " w:xpath="/ns0:NavWordReportXmlPart[1]/ns0:CurrentInspection[1]/ns0:COAContact_All[1]" w:storeItemID="{F00BF611-06BA-436C-902A-C0D5E8DF929B}"/>
+        </w:sdtPr>
+        <w:sdtContent>
+          <w:tc>
+            <w:tcPr>
+              <w:tcW w:w="5485" w:type="dxa"/>
+            </w:tcPr>
+            <w:p>
+              <w:pPr>
+                <w:pStyle w:val="BodytekstinHeaderFooter"/>
+                <w:tabs>
+                  <w:tab w:val="left" w:pos="1030"/>
+                </w:tabs>
+                <w:spacing w:before="240"/>
+                <w:rPr>
+                  <w:rStyle w:val="TitleChar"/>
+                </w:rPr>
+              </w:pPr>
+              <w:proofErr w:type="spellStart"/>
+              <w:r>
+                <w:t>COAContact_All</w:t>
+              </w:r>
+              <w:proofErr w:type="spellEnd"/>
+            </w:p>
+          </w:tc>
+        </w:sdtContent>
+      </w:sdt>
       <w:tc>
         <w:tcPr>
           <w:tcW w:w="4971" w:type="dxa"/>
@@ -1736,7 +2022,7 @@
               <w:placeholder>
                 <w:docPart w:val="675E1403F9EC401FA663C311051559CC"/>
               </w:placeholder>
-              <w:dataBinding w:prefixMappings="xmlns:ns0='urn:microsoft-dynamics-nav/reports/Qlty_General_Purpose_Inspect/20405/'" w:xpath="/ns0:NavWordReportXmlPart[1]/ns0:CurrentInspection[1]/ns0:CompanyInformation_All[1]" w:storeItemID="{F00BF611-06BA-436C-902A-C0D5E8DF929B}"/>
+              <w:dataBinding w:prefixMappings="xmlns:ns0='urn:microsoft-dynamics-nav/reports/Qlty_General_Purpose_Inspect/20405/'" w:xpath="/ns0:NavWordReportXmlPart[1]/ns0:CurrentInspection[1]/ns0:CompanyInformation_All[1]" w:storeItemID="{17DA42EE-3024-4C2F-8931-9EB6F7151F21}"/>
               <w15:color w:val="808080"/>
               <w:text/>
             </w:sdtPr>
@@ -3544,122 +3830,6 @@
     </w:docPart>
     <w:docPart>
       <w:docPartPr>
-        <w:name w:val="E52ED68ED8474EB38ABFD788E6B53E47"/>
-        <w:category>
-          <w:name w:val="General"/>
-          <w:gallery w:val="placeholder"/>
-        </w:category>
-        <w:types>
-          <w:type w:val="bbPlcHdr"/>
-        </w:types>
-        <w:behaviors>
-          <w:behavior w:val="content"/>
-        </w:behaviors>
-        <w:guid w:val="{0461BE74-307C-4975-B126-EF2E9226E5F1}"/>
-      </w:docPartPr>
-      <w:docPartBody>
-        <w:p>
-          <w:pPr>
-            <w:pStyle w:val="E52ED68ED8474EB38ABFD788E6B53E47"/>
-          </w:pPr>
-          <w:r>
-            <w:rPr>
-              <w:rStyle w:val="PlaceholderText"/>
-            </w:rPr>
-            <w:t>Click or tap here to enter text.</w:t>
-          </w:r>
-        </w:p>
-      </w:docPartBody>
-    </w:docPart>
-    <w:docPart>
-      <w:docPartPr>
-        <w:name w:val="5FD2338AE18C4054B136E89865F0D601"/>
-        <w:category>
-          <w:name w:val="General"/>
-          <w:gallery w:val="placeholder"/>
-        </w:category>
-        <w:types>
-          <w:type w:val="bbPlcHdr"/>
-        </w:types>
-        <w:behaviors>
-          <w:behavior w:val="content"/>
-        </w:behaviors>
-        <w:guid w:val="{F18B0075-6561-422D-BA41-190934F34577}"/>
-      </w:docPartPr>
-      <w:docPartBody>
-        <w:p>
-          <w:pPr>
-            <w:pStyle w:val="5FD2338AE18C4054B136E89865F0D601"/>
-          </w:pPr>
-          <w:r>
-            <w:rPr>
-              <w:rStyle w:val="PlaceholderText"/>
-            </w:rPr>
-            <w:t>Click or tap here to enter text.</w:t>
-          </w:r>
-        </w:p>
-      </w:docPartBody>
-    </w:docPart>
-    <w:docPart>
-      <w:docPartPr>
-        <w:name w:val="323AFCE67AAB4BB19FFC21B54EB0799A"/>
-        <w:category>
-          <w:name w:val="General"/>
-          <w:gallery w:val="placeholder"/>
-        </w:category>
-        <w:types>
-          <w:type w:val="bbPlcHdr"/>
-        </w:types>
-        <w:behaviors>
-          <w:behavior w:val="content"/>
-        </w:behaviors>
-        <w:guid w:val="{74D2FC64-A841-41E6-AC39-3566185BF70A}"/>
-      </w:docPartPr>
-      <w:docPartBody>
-        <w:p>
-          <w:pPr>
-            <w:pStyle w:val="323AFCE67AAB4BB19FFC21B54EB0799A"/>
-          </w:pPr>
-          <w:r>
-            <w:rPr>
-              <w:rStyle w:val="PlaceholderText"/>
-            </w:rPr>
-            <w:t>Click or tap here to enter text.</w:t>
-          </w:r>
-        </w:p>
-      </w:docPartBody>
-    </w:docPart>
-    <w:docPart>
-      <w:docPartPr>
-        <w:name w:val="E89AA59296584643BE2AFF07AA055572"/>
-        <w:category>
-          <w:name w:val="General"/>
-          <w:gallery w:val="placeholder"/>
-        </w:category>
-        <w:types>
-          <w:type w:val="bbPlcHdr"/>
-        </w:types>
-        <w:behaviors>
-          <w:behavior w:val="content"/>
-        </w:behaviors>
-        <w:guid w:val="{88CDEA37-F54B-4136-A4AD-E7B9B59C6B62}"/>
-      </w:docPartPr>
-      <w:docPartBody>
-        <w:p>
-          <w:pPr>
-            <w:pStyle w:val="E89AA59296584643BE2AFF07AA055572"/>
-          </w:pPr>
-          <w:r>
-            <w:rPr>
-              <w:rStyle w:val="PlaceholderText"/>
-            </w:rPr>
-            <w:t>Click or tap here to enter text.</w:t>
-          </w:r>
-        </w:p>
-      </w:docPartBody>
-    </w:docPart>
-    <w:docPart>
-      <w:docPartPr>
         <w:name w:val="0CCB450A212F4B07B5BC2C6439FCE639"/>
         <w:category>
           <w:name w:val="General"/>
@@ -3712,6 +3882,499 @@
               <w:rStyle w:val="PlaceholderText"/>
             </w:rPr>
             <w:t>Klik eller tryk her for at skrive tekst.</w:t>
+          </w:r>
+        </w:p>
+      </w:docPartBody>
+    </w:docPart>
+    <w:docPart>
+      <w:docPartPr>
+        <w:name w:val="9B3BA5505C4D49FE8933936B86513EDE"/>
+        <w:category>
+          <w:name w:val="General"/>
+          <w:gallery w:val="placeholder"/>
+        </w:category>
+        <w:types>
+          <w:type w:val="bbPlcHdr"/>
+        </w:types>
+        <w:behaviors>
+          <w:behavior w:val="content"/>
+        </w:behaviors>
+        <w:guid w:val="{04FA334E-1ED8-4E19-A0E5-20902614B211}"/>
+      </w:docPartPr>
+      <w:docPartBody>
+        <w:p>
+          <w:pPr>
+            <w:pStyle w:val="9B3BA5505C4D49FE8933936B86513EDE"/>
+          </w:pPr>
+          <w:r>
+            <w:rPr>
+              <w:rStyle w:val="PlaceholderText"/>
+            </w:rPr>
+            <w:t>Click or tap here to enter text.</w:t>
+          </w:r>
+        </w:p>
+      </w:docPartBody>
+    </w:docPart>
+    <w:docPart>
+      <w:docPartPr>
+        <w:name w:val="19F040F6864B48A599C11E15E63169CB"/>
+        <w:category>
+          <w:name w:val="General"/>
+          <w:gallery w:val="placeholder"/>
+        </w:category>
+        <w:types>
+          <w:type w:val="bbPlcHdr"/>
+        </w:types>
+        <w:behaviors>
+          <w:behavior w:val="content"/>
+        </w:behaviors>
+        <w:guid w:val="{30278205-2DFB-4258-8819-FCC45DC88486}"/>
+      </w:docPartPr>
+      <w:docPartBody>
+        <w:p>
+          <w:pPr>
+            <w:pStyle w:val="19F040F6864B48A599C11E15E63169CB"/>
+          </w:pPr>
+          <w:r>
+            <w:rPr>
+              <w:rStyle w:val="PlaceholderText"/>
+            </w:rPr>
+            <w:t>Click or tap here to enter text.</w:t>
+          </w:r>
+        </w:p>
+      </w:docPartBody>
+    </w:docPart>
+    <w:docPart>
+      <w:docPartPr>
+        <w:name w:val="79CF619905ED4A029E02394C5DB96A90"/>
+        <w:category>
+          <w:name w:val="General"/>
+          <w:gallery w:val="placeholder"/>
+        </w:category>
+        <w:types>
+          <w:type w:val="bbPlcHdr"/>
+        </w:types>
+        <w:behaviors>
+          <w:behavior w:val="content"/>
+        </w:behaviors>
+        <w:guid w:val="{199BF6A6-A820-41F9-AC59-1CE9B985BCA4}"/>
+      </w:docPartPr>
+      <w:docPartBody>
+        <w:p>
+          <w:pPr>
+            <w:pStyle w:val="79CF619905ED4A029E02394C5DB96A90"/>
+          </w:pPr>
+          <w:r>
+            <w:rPr>
+              <w:rStyle w:val="PlaceholderText"/>
+            </w:rPr>
+            <w:t>Klik eller tryk her for at skrive tekst.</w:t>
+          </w:r>
+        </w:p>
+      </w:docPartBody>
+    </w:docPart>
+    <w:docPart>
+      <w:docPartPr>
+        <w:name w:val="89A6856229794EB18EFD4B388834A3AE"/>
+        <w:category>
+          <w:name w:val="General"/>
+          <w:gallery w:val="placeholder"/>
+        </w:category>
+        <w:types>
+          <w:type w:val="bbPlcHdr"/>
+        </w:types>
+        <w:behaviors>
+          <w:behavior w:val="content"/>
+        </w:behaviors>
+        <w:guid w:val="{2BF57FA3-3F75-4B53-8681-94ABF9183A2A}"/>
+      </w:docPartPr>
+      <w:docPartBody>
+        <w:p>
+          <w:pPr>
+            <w:pStyle w:val="89A6856229794EB18EFD4B388834A3AE"/>
+          </w:pPr>
+          <w:r>
+            <w:rPr>
+              <w:rStyle w:val="PlaceholderText"/>
+            </w:rPr>
+            <w:t>Klik eller tryk her for at skrive tekst.</w:t>
+          </w:r>
+        </w:p>
+      </w:docPartBody>
+    </w:docPart>
+    <w:docPart>
+      <w:docPartPr>
+        <w:name w:val="76494A0D615A4F6F8CAF6506B0486BC6"/>
+        <w:category>
+          <w:name w:val="General"/>
+          <w:gallery w:val="placeholder"/>
+        </w:category>
+        <w:types>
+          <w:type w:val="bbPlcHdr"/>
+        </w:types>
+        <w:behaviors>
+          <w:behavior w:val="content"/>
+        </w:behaviors>
+        <w:guid w:val="{C88086C0-F4B6-4C04-AAF8-9D5C093F4FD0}"/>
+      </w:docPartPr>
+      <w:docPartBody>
+        <w:p>
+          <w:pPr>
+            <w:pStyle w:val="76494A0D615A4F6F8CAF6506B0486BC6"/>
+          </w:pPr>
+          <w:r>
+            <w:rPr>
+              <w:rStyle w:val="PlaceholderText"/>
+            </w:rPr>
+            <w:t>Click or tap here to enter text.</w:t>
+          </w:r>
+        </w:p>
+      </w:docPartBody>
+    </w:docPart>
+    <w:docPart>
+      <w:docPartPr>
+        <w:name w:val="F76A7EA3722A4A529E0451006182A3B0"/>
+        <w:category>
+          <w:name w:val="General"/>
+          <w:gallery w:val="placeholder"/>
+        </w:category>
+        <w:types>
+          <w:type w:val="bbPlcHdr"/>
+        </w:types>
+        <w:behaviors>
+          <w:behavior w:val="content"/>
+        </w:behaviors>
+        <w:guid w:val="{485382F0-84D0-48EB-8D6C-E5B4394A47F4}"/>
+      </w:docPartPr>
+      <w:docPartBody>
+        <w:p>
+          <w:pPr>
+            <w:pStyle w:val="F76A7EA3722A4A529E0451006182A3B0"/>
+          </w:pPr>
+          <w:r>
+            <w:rPr>
+              <w:rStyle w:val="PlaceholderText"/>
+            </w:rPr>
+            <w:t>Click or tap here to enter text.</w:t>
+          </w:r>
+        </w:p>
+      </w:docPartBody>
+    </w:docPart>
+    <w:docPart>
+      <w:docPartPr>
+        <w:name w:val="E2B6192B7C8B44698D0543E9A92C0267"/>
+        <w:category>
+          <w:name w:val="General"/>
+          <w:gallery w:val="placeholder"/>
+        </w:category>
+        <w:types>
+          <w:type w:val="bbPlcHdr"/>
+        </w:types>
+        <w:behaviors>
+          <w:behavior w:val="content"/>
+        </w:behaviors>
+        <w:guid w:val="{808B666B-1F31-42AD-9B0F-1275E791EA99}"/>
+      </w:docPartPr>
+      <w:docPartBody>
+        <w:p>
+          <w:pPr>
+            <w:pStyle w:val="E2B6192B7C8B44698D0543E9A92C0267"/>
+          </w:pPr>
+          <w:r>
+            <w:rPr>
+              <w:rStyle w:val="PlaceholderText"/>
+            </w:rPr>
+            <w:t>Klik eller tryk her for at skrive tekst.</w:t>
+          </w:r>
+        </w:p>
+      </w:docPartBody>
+    </w:docPart>
+    <w:docPart>
+      <w:docPartPr>
+        <w:name w:val="4B63C69D6D7C41D682DF1FFDD1EDEBC3"/>
+        <w:category>
+          <w:name w:val="General"/>
+          <w:gallery w:val="placeholder"/>
+        </w:category>
+        <w:types>
+          <w:type w:val="bbPlcHdr"/>
+        </w:types>
+        <w:behaviors>
+          <w:behavior w:val="content"/>
+        </w:behaviors>
+        <w:guid w:val="{2F8C4F13-7F00-40AC-8DFA-4087856DB32E}"/>
+      </w:docPartPr>
+      <w:docPartBody>
+        <w:p>
+          <w:pPr>
+            <w:pStyle w:val="4B63C69D6D7C41D682DF1FFDD1EDEBC3"/>
+          </w:pPr>
+          <w:r>
+            <w:rPr>
+              <w:rStyle w:val="PlaceholderText"/>
+            </w:rPr>
+            <w:t>Klik eller tryk her for at skrive tekst.</w:t>
+          </w:r>
+        </w:p>
+      </w:docPartBody>
+    </w:docPart>
+    <w:docPart>
+      <w:docPartPr>
+        <w:name w:val="DF66177CBFFA47388B872CD7936BD8FF"/>
+        <w:category>
+          <w:name w:val="General"/>
+          <w:gallery w:val="placeholder"/>
+        </w:category>
+        <w:types>
+          <w:type w:val="bbPlcHdr"/>
+        </w:types>
+        <w:behaviors>
+          <w:behavior w:val="content"/>
+        </w:behaviors>
+        <w:guid w:val="{513489C9-6B6F-4DFA-9E53-B4D65C55C76D}"/>
+      </w:docPartPr>
+      <w:docPartBody>
+        <w:p>
+          <w:pPr>
+            <w:pStyle w:val="DF66177CBFFA47388B872CD7936BD8FF"/>
+          </w:pPr>
+          <w:r>
+            <w:rPr>
+              <w:rStyle w:val="PlaceholderText"/>
+            </w:rPr>
+            <w:t>Klik eller tryk her for at skrive tekst.</w:t>
+          </w:r>
+        </w:p>
+      </w:docPartBody>
+    </w:docPart>
+    <w:docPart>
+      <w:docPartPr>
+        <w:name w:val="7427C850301144EDADD6A34A0BE51CB5"/>
+        <w:category>
+          <w:name w:val="General"/>
+          <w:gallery w:val="placeholder"/>
+        </w:category>
+        <w:types>
+          <w:type w:val="bbPlcHdr"/>
+        </w:types>
+        <w:behaviors>
+          <w:behavior w:val="content"/>
+        </w:behaviors>
+        <w:guid w:val="{9144B5C3-ABB4-4BDA-A64D-F26695D37DDF}"/>
+      </w:docPartPr>
+      <w:docPartBody>
+        <w:p>
+          <w:pPr>
+            <w:pStyle w:val="7427C850301144EDADD6A34A0BE51CB5"/>
+          </w:pPr>
+          <w:r>
+            <w:rPr>
+              <w:rStyle w:val="PlaceholderText"/>
+            </w:rPr>
+            <w:t>Klik eller tryk her for at skrive tekst.</w:t>
+          </w:r>
+        </w:p>
+      </w:docPartBody>
+    </w:docPart>
+    <w:docPart>
+      <w:docPartPr>
+        <w:name w:val="A25D382DC26A4A4FA94FF29C06D215F6"/>
+        <w:category>
+          <w:name w:val="General"/>
+          <w:gallery w:val="placeholder"/>
+        </w:category>
+        <w:types>
+          <w:type w:val="bbPlcHdr"/>
+        </w:types>
+        <w:behaviors>
+          <w:behavior w:val="content"/>
+        </w:behaviors>
+        <w:guid w:val="{C4892563-691F-4716-8E6B-845A78EE8907}"/>
+      </w:docPartPr>
+      <w:docPartBody>
+        <w:p>
+          <w:pPr>
+            <w:pStyle w:val="A25D382DC26A4A4FA94FF29C06D215F6"/>
+          </w:pPr>
+          <w:r>
+            <w:rPr>
+              <w:rStyle w:val="PlaceholderText"/>
+            </w:rPr>
+            <w:t>Click or tap here to enter text.</w:t>
+          </w:r>
+        </w:p>
+      </w:docPartBody>
+    </w:docPart>
+    <w:docPart>
+      <w:docPartPr>
+        <w:name w:val="1E896787607645E0ABB983BFD537574D"/>
+        <w:category>
+          <w:name w:val="General"/>
+          <w:gallery w:val="placeholder"/>
+        </w:category>
+        <w:types>
+          <w:type w:val="bbPlcHdr"/>
+        </w:types>
+        <w:behaviors>
+          <w:behavior w:val="content"/>
+        </w:behaviors>
+        <w:guid w:val="{335CDA74-F96C-4D02-AED2-57E36E573316}"/>
+      </w:docPartPr>
+      <w:docPartBody>
+        <w:p>
+          <w:pPr>
+            <w:pStyle w:val="1E896787607645E0ABB983BFD537574D"/>
+          </w:pPr>
+          <w:r>
+            <w:rPr>
+              <w:rStyle w:val="PlaceholderText"/>
+            </w:rPr>
+            <w:t>Click or tap here to enter text.</w:t>
+          </w:r>
+        </w:p>
+      </w:docPartBody>
+    </w:docPart>
+    <w:docPart>
+      <w:docPartPr>
+        <w:name w:val="E4B2EB81AEE240A29F9975B31C6BE17B"/>
+        <w:category>
+          <w:name w:val="General"/>
+          <w:gallery w:val="placeholder"/>
+        </w:category>
+        <w:types>
+          <w:type w:val="bbPlcHdr"/>
+        </w:types>
+        <w:behaviors>
+          <w:behavior w:val="content"/>
+        </w:behaviors>
+        <w:guid w:val="{5CE1D298-12DE-4660-A7E1-36A746C04F85}"/>
+      </w:docPartPr>
+      <w:docPartBody>
+        <w:p>
+          <w:pPr>
+            <w:pStyle w:val="E4B2EB81AEE240A29F9975B31C6BE17B"/>
+          </w:pPr>
+          <w:r>
+            <w:rPr>
+              <w:rStyle w:val="PlaceholderText"/>
+            </w:rPr>
+            <w:t>Click or tap here to enter text.</w:t>
+          </w:r>
+        </w:p>
+      </w:docPartBody>
+    </w:docPart>
+    <w:docPart>
+      <w:docPartPr>
+        <w:name w:val="284F04A4C5B44E9FAF1D142E96EE0688"/>
+        <w:category>
+          <w:name w:val="General"/>
+          <w:gallery w:val="placeholder"/>
+        </w:category>
+        <w:types>
+          <w:type w:val="bbPlcHdr"/>
+        </w:types>
+        <w:behaviors>
+          <w:behavior w:val="content"/>
+        </w:behaviors>
+        <w:guid w:val="{8FE04F39-0CF2-4A68-B372-CEF5336EC255}"/>
+      </w:docPartPr>
+      <w:docPartBody>
+        <w:p>
+          <w:pPr>
+            <w:pStyle w:val="284F04A4C5B44E9FAF1D142E96EE0688"/>
+          </w:pPr>
+          <w:r>
+            <w:rPr>
+              <w:rStyle w:val="PlaceholderText"/>
+            </w:rPr>
+            <w:t>Click or tap here to enter text.</w:t>
+          </w:r>
+        </w:p>
+      </w:docPartBody>
+    </w:docPart>
+    <w:docPart>
+      <w:docPartPr>
+        <w:name w:val="1BEAC63591D8421CBFD9F24D4CF63EEE"/>
+        <w:category>
+          <w:name w:val="General"/>
+          <w:gallery w:val="placeholder"/>
+        </w:category>
+        <w:types>
+          <w:type w:val="bbPlcHdr"/>
+        </w:types>
+        <w:behaviors>
+          <w:behavior w:val="content"/>
+        </w:behaviors>
+        <w:guid w:val="{05A4B8CD-3678-474C-A83C-337058791DCF}"/>
+      </w:docPartPr>
+      <w:docPartBody>
+        <w:p>
+          <w:pPr>
+            <w:pStyle w:val="1BEAC63591D8421CBFD9F24D4CF63EEE"/>
+          </w:pPr>
+          <w:r>
+            <w:rPr>
+              <w:rStyle w:val="PlaceholderText"/>
+            </w:rPr>
+            <w:t>Click or tap here to enter text.</w:t>
+          </w:r>
+        </w:p>
+      </w:docPartBody>
+    </w:docPart>
+    <w:docPart>
+      <w:docPartPr>
+        <w:name w:val="FC855B1C897846A49A609CA136B65228"/>
+        <w:category>
+          <w:name w:val="General"/>
+          <w:gallery w:val="placeholder"/>
+        </w:category>
+        <w:types>
+          <w:type w:val="bbPlcHdr"/>
+        </w:types>
+        <w:behaviors>
+          <w:behavior w:val="content"/>
+        </w:behaviors>
+        <w:guid w:val="{3E0139D1-EA05-4ECC-B69C-74EFAC360A5B}"/>
+      </w:docPartPr>
+      <w:docPartBody>
+        <w:p>
+          <w:pPr>
+            <w:pStyle w:val="FC855B1C897846A49A609CA136B65228"/>
+          </w:pPr>
+          <w:r>
+            <w:rPr>
+              <w:rStyle w:val="PlaceholderText"/>
+            </w:rPr>
+            <w:t>Click or tap here to enter text.</w:t>
+          </w:r>
+        </w:p>
+      </w:docPartBody>
+    </w:docPart>
+    <w:docPart>
+      <w:docPartPr>
+        <w:name w:val="42E191C0690647B191CC0223A92899C0"/>
+        <w:category>
+          <w:name w:val="General"/>
+          <w:gallery w:val="placeholder"/>
+        </w:category>
+        <w:types>
+          <w:type w:val="bbPlcHdr"/>
+        </w:types>
+        <w:behaviors>
+          <w:behavior w:val="content"/>
+        </w:behaviors>
+        <w:guid w:val="{E3C891E8-098D-4192-A5AE-1DBCEDC21438}"/>
+      </w:docPartPr>
+      <w:docPartBody>
+        <w:p>
+          <w:pPr>
+            <w:pStyle w:val="42E191C0690647B191CC0223A92899C0"/>
+          </w:pPr>
+          <w:r>
+            <w:rPr>
+              <w:rStyle w:val="PlaceholderText"/>
+            </w:rPr>
+            <w:t>Click or tap here to enter text.</w:t>
           </w:r>
         </w:p>
       </w:docPartBody>
@@ -3838,6 +4501,7 @@
     <w:rsid w:val="00406F79"/>
     <w:rsid w:val="004318A8"/>
     <w:rsid w:val="004638DD"/>
+    <w:rsid w:val="0046457D"/>
     <w:rsid w:val="00474D30"/>
     <w:rsid w:val="00487BC5"/>
     <w:rsid w:val="004A330D"/>
@@ -3865,6 +4529,7 @@
     <w:rsid w:val="00685D0C"/>
     <w:rsid w:val="006940B4"/>
     <w:rsid w:val="006A2319"/>
+    <w:rsid w:val="006A2D6F"/>
     <w:rsid w:val="006B1EAE"/>
     <w:rsid w:val="006C6748"/>
     <w:rsid w:val="007168A2"/>
@@ -3947,6 +4612,7 @@
     <w:rsid w:val="00E75EE9"/>
     <w:rsid w:val="00E80A28"/>
     <w:rsid w:val="00E86F96"/>
+    <w:rsid w:val="00E92DFB"/>
     <w:rsid w:val="00EA25C7"/>
     <w:rsid w:val="00EA5F0C"/>
     <w:rsid w:val="00EA68DA"/>
@@ -4420,18 +5086,18 @@
     <w:basedOn w:val="DefaultParagraphFont"/>
     <w:uiPriority w:val="99"/>
     <w:semiHidden/>
-    <w:rsid w:val="002D6D59"/>
+    <w:rsid w:val="006A2D6F"/>
     <w:rPr>
       <w:color w:val="666666"/>
     </w:rPr>
   </w:style>
-  <w:style w:type="paragraph" w:customStyle="1" w:styleId="F14F35E5DE5F4DE38617B9C7CCD1FCEF">
-    <w:name w:val="F14F35E5DE5F4DE38617B9C7CCD1FCEF"/>
-    <w:rsid w:val="00D855FC"/>
-  </w:style>
-  <w:style w:type="paragraph" w:customStyle="1" w:styleId="46A983F21FC54C78A9F8BBAD8E8D99F1">
-    <w:name w:val="46A983F21FC54C78A9F8BBAD8E8D99F1"/>
-    <w:rsid w:val="002D6D59"/>
+  <w:style w:type="paragraph" w:customStyle="1" w:styleId="9B3BA5505C4D49FE8933936B86513EDE">
+    <w:name w:val="9B3BA5505C4D49FE8933936B86513EDE"/>
+    <w:rsid w:val="006A2D6F"/>
+  </w:style>
+  <w:style w:type="paragraph" w:customStyle="1" w:styleId="6CA949F61E5A4BD9B06E5C8854ED0B19">
+    <w:name w:val="6CA949F61E5A4BD9B06E5C8854ED0B19"/>
+    <w:rsid w:val="006A2D6F"/>
   </w:style>
   <w:style w:type="paragraph" w:customStyle="1" w:styleId="0CCB450A212F4B07B5BC2C6439FCE639">
     <w:name w:val="0CCB450A212F4B07B5BC2C6439FCE639"/>
@@ -4464,6 +5130,118 @@
   <w:style w:type="paragraph" w:customStyle="1" w:styleId="E89AA59296584643BE2AFF07AA055572">
     <w:name w:val="E89AA59296584643BE2AFF07AA055572"/>
     <w:rsid w:val="00D773DD"/>
+  </w:style>
+  <w:style w:type="paragraph" w:customStyle="1" w:styleId="3767422DC5FC4D5E879DF08A3E24A73C">
+    <w:name w:val="3767422DC5FC4D5E879DF08A3E24A73C"/>
+    <w:rsid w:val="006A2D6F"/>
+  </w:style>
+  <w:style w:type="paragraph" w:customStyle="1" w:styleId="4BDD4EE7C2D44B38BB8DEC8350803133">
+    <w:name w:val="4BDD4EE7C2D44B38BB8DEC8350803133"/>
+    <w:rsid w:val="006A2D6F"/>
+  </w:style>
+  <w:style w:type="paragraph" w:customStyle="1" w:styleId="CB02297DBB444482BCC094CFFA584ED0">
+    <w:name w:val="CB02297DBB444482BCC094CFFA584ED0"/>
+    <w:rsid w:val="006A2D6F"/>
+  </w:style>
+  <w:style w:type="paragraph" w:customStyle="1" w:styleId="EFDD1BD50F1A4719A8AA11277396ACEC">
+    <w:name w:val="EFDD1BD50F1A4719A8AA11277396ACEC"/>
+    <w:rsid w:val="006A2D6F"/>
+  </w:style>
+  <w:style w:type="paragraph" w:customStyle="1" w:styleId="1CF05AC7D00040D1810CFE67842EB523">
+    <w:name w:val="1CF05AC7D00040D1810CFE67842EB523"/>
+    <w:rsid w:val="006A2D6F"/>
+  </w:style>
+  <w:style w:type="paragraph" w:customStyle="1" w:styleId="674DBCB2E2B34D9EADFAD667C15E6833">
+    <w:name w:val="674DBCB2E2B34D9EADFAD667C15E6833"/>
+    <w:rsid w:val="006A2D6F"/>
+  </w:style>
+  <w:style w:type="paragraph" w:customStyle="1" w:styleId="0E0B8666C66148889FD717D5ECF78938">
+    <w:name w:val="0E0B8666C66148889FD717D5ECF78938"/>
+    <w:rsid w:val="006A2D6F"/>
+  </w:style>
+  <w:style w:type="paragraph" w:customStyle="1" w:styleId="929AC50F4D7D42199EFF5F3BC00AECB2">
+    <w:name w:val="929AC50F4D7D42199EFF5F3BC00AECB2"/>
+    <w:rsid w:val="006A2D6F"/>
+  </w:style>
+  <w:style w:type="paragraph" w:customStyle="1" w:styleId="EDD6F12C48B843549BE15D06C403E9AD">
+    <w:name w:val="EDD6F12C48B843549BE15D06C403E9AD"/>
+    <w:rsid w:val="006A2D6F"/>
+  </w:style>
+  <w:style w:type="paragraph" w:customStyle="1" w:styleId="FBE4E9F8FED44457A2FC7FB55E72EBDE">
+    <w:name w:val="FBE4E9F8FED44457A2FC7FB55E72EBDE"/>
+    <w:rsid w:val="006A2D6F"/>
+  </w:style>
+  <w:style w:type="paragraph" w:customStyle="1" w:styleId="2B17CC4B7570456E80A5CC2C3BF01829">
+    <w:name w:val="2B17CC4B7570456E80A5CC2C3BF01829"/>
+    <w:rsid w:val="006A2D6F"/>
+  </w:style>
+  <w:style w:type="paragraph" w:customStyle="1" w:styleId="6221DDFC82E54D91B34E34B544386DA3">
+    <w:name w:val="6221DDFC82E54D91B34E34B544386DA3"/>
+    <w:rsid w:val="006A2D6F"/>
+  </w:style>
+  <w:style w:type="paragraph" w:customStyle="1" w:styleId="19F040F6864B48A599C11E15E63169CB">
+    <w:name w:val="19F040F6864B48A599C11E15E63169CB"/>
+    <w:rsid w:val="006A2D6F"/>
+  </w:style>
+  <w:style w:type="paragraph" w:customStyle="1" w:styleId="79CF619905ED4A029E02394C5DB96A90">
+    <w:name w:val="79CF619905ED4A029E02394C5DB96A90"/>
+    <w:rsid w:val="006A2D6F"/>
+  </w:style>
+  <w:style w:type="paragraph" w:customStyle="1" w:styleId="89A6856229794EB18EFD4B388834A3AE">
+    <w:name w:val="89A6856229794EB18EFD4B388834A3AE"/>
+    <w:rsid w:val="006A2D6F"/>
+  </w:style>
+  <w:style w:type="paragraph" w:customStyle="1" w:styleId="76494A0D615A4F6F8CAF6506B0486BC6">
+    <w:name w:val="76494A0D615A4F6F8CAF6506B0486BC6"/>
+    <w:rsid w:val="006A2D6F"/>
+  </w:style>
+  <w:style w:type="paragraph" w:customStyle="1" w:styleId="F76A7EA3722A4A529E0451006182A3B0">
+    <w:name w:val="F76A7EA3722A4A529E0451006182A3B0"/>
+    <w:rsid w:val="006A2D6F"/>
+  </w:style>
+  <w:style w:type="paragraph" w:customStyle="1" w:styleId="E2B6192B7C8B44698D0543E9A92C0267">
+    <w:name w:val="E2B6192B7C8B44698D0543E9A92C0267"/>
+    <w:rsid w:val="006A2D6F"/>
+  </w:style>
+  <w:style w:type="paragraph" w:customStyle="1" w:styleId="4B63C69D6D7C41D682DF1FFDD1EDEBC3">
+    <w:name w:val="4B63C69D6D7C41D682DF1FFDD1EDEBC3"/>
+    <w:rsid w:val="006A2D6F"/>
+  </w:style>
+  <w:style w:type="paragraph" w:customStyle="1" w:styleId="DF66177CBFFA47388B872CD7936BD8FF">
+    <w:name w:val="DF66177CBFFA47388B872CD7936BD8FF"/>
+    <w:rsid w:val="006A2D6F"/>
+  </w:style>
+  <w:style w:type="paragraph" w:customStyle="1" w:styleId="7427C850301144EDADD6A34A0BE51CB5">
+    <w:name w:val="7427C850301144EDADD6A34A0BE51CB5"/>
+    <w:rsid w:val="006A2D6F"/>
+  </w:style>
+  <w:style w:type="paragraph" w:customStyle="1" w:styleId="A25D382DC26A4A4FA94FF29C06D215F6">
+    <w:name w:val="A25D382DC26A4A4FA94FF29C06D215F6"/>
+    <w:rsid w:val="006A2D6F"/>
+  </w:style>
+  <w:style w:type="paragraph" w:customStyle="1" w:styleId="1E896787607645E0ABB983BFD537574D">
+    <w:name w:val="1E896787607645E0ABB983BFD537574D"/>
+    <w:rsid w:val="006A2D6F"/>
+  </w:style>
+  <w:style w:type="paragraph" w:customStyle="1" w:styleId="E4B2EB81AEE240A29F9975B31C6BE17B">
+    <w:name w:val="E4B2EB81AEE240A29F9975B31C6BE17B"/>
+    <w:rsid w:val="006A2D6F"/>
+  </w:style>
+  <w:style w:type="paragraph" w:customStyle="1" w:styleId="284F04A4C5B44E9FAF1D142E96EE0688">
+    <w:name w:val="284F04A4C5B44E9FAF1D142E96EE0688"/>
+    <w:rsid w:val="006A2D6F"/>
+  </w:style>
+  <w:style w:type="paragraph" w:customStyle="1" w:styleId="1BEAC63591D8421CBFD9F24D4CF63EEE">
+    <w:name w:val="1BEAC63591D8421CBFD9F24D4CF63EEE"/>
+    <w:rsid w:val="006A2D6F"/>
+  </w:style>
+  <w:style w:type="paragraph" w:customStyle="1" w:styleId="FC855B1C897846A49A609CA136B65228">
+    <w:name w:val="FC855B1C897846A49A609CA136B65228"/>
+    <w:rsid w:val="006A2D6F"/>
+  </w:style>
+  <w:style w:type="paragraph" w:customStyle="1" w:styleId="42E191C0690647B191CC0223A92899C0">
+    <w:name w:val="42E191C0690647B191CC0223A92899C0"/>
+    <w:rsid w:val="006A2D6F"/>
   </w:style>
 </w:styles>
 </file>
@@ -4810,954 +5588,952 @@
 </we:webextension>
 </file>
 
-<file path=customXml/item1.xml><?xml version="1.0" encoding="utf-8"?>
+<file path=customXml/item1.xml>��< ? x m l   v e r s i o n = " 1 . 0 "   e n c o d i n g = " u t f - 1 6 " ? > + 
+ < N a v W o r d R e p o r t X m l P a r t   x m l n s = " u r n : m i c r o s o f t - d y n a m i c s - n a v / r e p o r t s / Q l t y _ G e n e r a l _ P u r p o s e _ I n s p e c t / 2 0 4 0 5 / " > + 
+     < B C R e p o r t I n f o r m a t i o n > + 
+         < R e p o r t M e t a d a t a > + 
+             < E x t e n s i o n I d > E x t e n s i o n   I D < / E x t e n s i o n I d > + 
+             < E x t e n s i o n N a m e > E x t e n s i o n   N a m e < / E x t e n s i o n N a m e > + 
+             < E x t e n s i o n P u b l i s h e r > E x t e n s i o n   P u b l i s h e r < / E x t e n s i o n P u b l i s h e r > + 
+             < E x t e n s i o n V e r s i o n > E x t e n s i o n   V e r s i o n < / E x t e n s i o n V e r s i o n > + 
+             < R e p o r t I d > R e p o r t   I D < / R e p o r t I d > + 
+             < R e p o r t N a m e > R e p o r t   N a m e < / R e p o r t N a m e > + 
+             < A b o u t T h i s R e p o r t T i t l e > A b o u t   T h i s   R e p o r t   T i t l e < / A b o u t T h i s R e p o r t T i t l e > + 
+             < A b o u t T h i s R e p o r t T e x t > A b o u t   T h i s   R e p o r t   T e x t < / A b o u t T h i s R e p o r t T e x t > + 
+             < R e p o r t H e l p L i n k > R e p o r t   H e l p   L i n k < / R e p o r t H e l p L i n k > + 
+         < / R e p o r t M e t a d a t a > + 
+         < R e p o r t R e q u e s t > + 
+             < T e n a n t E n t r a I d > T e n a n t   E n t r a   I d < / T e n a n t E n t r a I d > + 
+             < E n v i r o n m e n t N a m e > E n v i r o n m e n t   N a m e < / E n v i r o n m e n t N a m e > + 
+             < E n v i r o n m e n t T y p e > E n v i r o n m e n t   T y p e < / E n v i r o n m e n t T y p e > + 
+             < C o m p a n y N a m e > C o m p a n y   N a m e < / C o m p a n y N a m e > + 
+             < C o m p a n y D i s p l a y N a m e > C o m p a n y   D i s p l a y   N a m e < / C o m p a n y D i s p l a y N a m e > + 
+             < C o m p a n y I d > C o m p a n y   I D < / C o m p a n y I d > + 
+             < U s e r N a m e > U s e r   N a m e < / U s e r N a m e > + 
+             < D a t e A n d T i m e > D a t e   a n d   T i m e < / D a t e A n d T i m e > + 
+             < L a n g u a g e > L a n g u a g e < / L a n g u a g e > + 
+             < F o r m a t R e g i o n > F o r m a t   R e g i o n < / F o r m a t R e g i o n > + 
+             < D a t e T i m e V a l u e s > + 
+                 < Y e a r > Y e a r < / Y e a r > + 
+                 < M o n t h N u m b e r > M o n t h   N u m b e r < / M o n t h N u m b e r > + 
+                 < D a y N u m b e r > D a y   N u m b e r < / D a y N u m b e r > + 
+                 < H o u r > H o u r < / H o u r > + 
+                 < M i n u t e > M i n u t e < / M i n u t e > + 
+             < / D a t e T i m e V a l u e s > + 
+         < / R e p o r t R e q u e s t > + 
+     < / B C R e p o r t I n f o r m a t i o n > + 
+     < L a b e l s > + 
+         < D a t e L a b e l > D a t e L a b e l < / D a t e L a b e l > + 
+         < F i n i s h e d B y L a b e l > F i n i s h e d B y L a b e l < / F i n i s h e d B y L a b e l > + 
+         < F i n i s h e d O n L a b e l > F i n i s h e d O n L a b e l < / F i n i s h e d O n L a b e l > + 
+         < I n s p e c t i o n L a b e l > I n s p e c t i o n L a b e l < / I n s p e c t i o n L a b e l > + 
+         < I t e m L a b e l > I t e m L a b e l < / I t e m L a b e l > + 
+         < I t e m T r a c k i n g L a b e l > I t e m T r a c k i n g L a b e l < / I t e m T r a c k i n g L a b e l > + 
+         < L a s t M o d i f i e d B y L a b e l > L a s t M o d i f i e d B y L a b e l < / L a s t M o d i f i e d B y L a b e l > + 
+         < P a g e L a b e l > P a g e L a b e l < / P a g e L a b e l > + 
+         < R e p o r t T i t l e L a b e l > R e p o r t T i t l e L a b e l < / R e p o r t T i t l e L a b e l > + 
+         < R e s u l t L a b e l > R e s u l t L a b e l < / R e s u l t L a b e l > + 
+         < T e s t L a b e l > T e s t L a b e l < / T e s t L a b e l > + 
+         < T e s t V a l u e L a b e l > T e s t V a l u e L a b e l < / T e s t V a l u e L a b e l > + 
+     < / L a b e l s > + 
+     < C u r r e n t I n s p e c t i o n > + 
+         < A p p r o v e r N a m e L a b e l > A p p r o v e r N a m e L a b e l < / A p p r o v e r N a m e L a b e l > + 
+         < A p p r o v e r S i g n a t u r e L a b e l > A p p r o v e r S i g n a t u r e L a b e l < / A p p r o v e r S i g n a t u r e L a b e l > + 
+         < C O A C o n t a c t _ A l l > C O A C o n t a c t _ A l l < / C O A C o n t a c t _ A l l > + 
+         < C O A C o n t a c t _ R o w 1 > C O A C o n t a c t _ R o w 1 < / C O A C o n t a c t _ R o w 1 > + 
+         < C O A C o n t a c t _ R o w 2 > C O A C o n t a c t _ R o w 2 < / C O A C o n t a c t _ R o w 2 > + 
+         < C O A C o n t a c t _ R o w 3 > C O A C o n t a c t _ R o w 3 < / C O A C o n t a c t _ R o w 3 > + 
+         < C O A C o n t a c t _ R o w 4 > C O A C o n t a c t _ R o w 4 < / C O A C o n t a c t _ R o w 4 > + 
+         < C O A C o n t a c t _ R o w 5 > C O A C o n t a c t _ R o w 5 < / C O A C o n t a c t _ R o w 5 > + 
+         < C O A C o n t a c t _ R o w 6 > C O A C o n t a c t _ R o w 6 < / C O A C o n t a c t _ R o w 6 > + 
+         < C O A C o n t a c t _ R o w 7 > C O A C o n t a c t _ R o w 7 < / C O A C o n t a c t _ R o w 7 > + 
+         < C O A C o n t a c t _ R o w 8 > C O A C o n t a c t _ R o w 8 < / C O A C o n t a c t _ R o w 8 > + 
+         < C o m p a n y I n f o r m a t i o n _ A l l > C o m p a n y I n f o r m a t i o n _ A l l < / C o m p a n y I n f o r m a t i o n _ A l l > + 
+         < C o m p a n y I n f o r m a t i o n _ R o w 1 > C o m p a n y I n f o r m a t i o n _ R o w 1 < / C o m p a n y I n f o r m a t i o n _ R o w 1 > + 
+         < C o m p a n y I n f o r m a t i o n _ R o w 2 > C o m p a n y I n f o r m a t i o n _ R o w 2 < / C o m p a n y I n f o r m a t i o n _ R o w 2 > + 
+         < C o m p a n y I n f o r m a t i o n _ R o w 3 > C o m p a n y I n f o r m a t i o n _ R o w 3 < / C o m p a n y I n f o r m a t i o n _ R o w 3 > + 
+         < C o m p a n y I n f o r m a t i o n _ R o w 4 > C o m p a n y I n f o r m a t i o n _ R o w 4 < / C o m p a n y I n f o r m a t i o n _ R o w 4 > + 
+         < C o m p a n y I n f o r m a t i o n _ R o w 5 > C o m p a n y I n f o r m a t i o n _ R o w 5 < / C o m p a n y I n f o r m a t i o n _ R o w 5 > + 
+         < C o m p a n y I n f o r m a t i o n _ R o w 6 > C o m p a n y I n f o r m a t i o n _ R o w 6 < / C o m p a n y I n f o r m a t i o n _ R o w 6 > + 
+         < C o m p a n y I n f o r m a t i o n _ R o w 7 > C o m p a n y I n f o r m a t i o n _ R o w 7 < / C o m p a n y I n f o r m a t i o n _ R o w 7 > + 
+         < C o m p a n y I n f o r m a t i o n _ R o w 8 > C o m p a n y I n f o r m a t i o n _ R o w 8 < / C o m p a n y I n f o r m a t i o n _ R o w 8 > + 
+         < C o m p a n y L o g o   / > + 
+         < E m a i l L a b e l > E m a i l L a b e l < / E m a i l L a b e l > + 
+         < E m a i l V a l u e > E m a i l V a l u e < / E m a i l V a l u e > + 
+         < F i n i s h e d B y N a m e L a b e l > F i n i s h e d B y N a m e L a b e l < / F i n i s h e d B y N a m e L a b e l > + 
+         < F i n i s h e d B y S i g n a t u r e L a b e l > F i n i s h e d B y S i g n a t u r e L a b e l < / F i n i s h e d B y S i g n a t u r e L a b e l > + 
+         < H o m e P a g e L a b e l > H o m e P a g e L a b e l < / H o m e P a g e L a b e l > + 
+         < H o m e P a g e V a l u e > H o m e P a g e V a l u e < / H o m e P a g e V a l u e > + 
+         < I n s p e c t i o n I n f o r m a t i o n > I n s p e c t i o n I n f o r m a t i o n < / I n s p e c t i o n I n f o r m a t i o n > + 
+         < I t e m D e s c r i p t i o n > I t e m D e s c r i p t i o n < / I t e m D e s c r i p t i o n > + 
+         < I t e m T r a c k i n g D e s c r i p t i o n > I t e m T r a c k i n g D e s c r i p t i o n < / I t e m T r a c k i n g D e s c r i p t i o n > + 
+         < P h o n e N o L a b e l > P h o n e N o L a b e l < / P h o n e N o L a b e l > + 
+         < P h o n e N o V a l u e > P h o n e N o V a l u e < / P h o n e N o V a l u e > + 
+         < Q l t y I n s p e c t i o n T e m p l a t e _ D e s c r i p t i o n > Q l t y I n s p e c t i o n T e m p l a t e _ D e s c r i p t i o n < / Q l t y I n s p e c t i o n T e m p l a t e _ D e s c r i p t i o n > + 
+         < Q l t y I n s p e c t i o n _ A p p r o v e r _ N a m e > Q l t y I n s p e c t i o n _ A p p r o v e r _ N a m e < / Q l t y I n s p e c t i o n _ A p p r o v e r _ N a m e > + 
+         < Q l t y I n s p e c t i o n _ A p p r o v e r _ T i t l e > Q l t y I n s p e c t i o n _ A p p r o v e r _ T i t l e < / Q l t y I n s p e c t i o n _ A p p r o v e r _ T i t l e > + 
+         < Q l t y I n s p e c t i o n _ D e s c r i p t i o n > Q l t y I n s p e c t i o n _ D e s c r i p t i o n < / Q l t y I n s p e c t i o n _ D e s c r i p t i o n > + 
+         < Q l t y I n s p e c t i o n _ F i n i s h e d _ B y _ E m a i l > Q l t y I n s p e c t i o n _ F i n i s h e d _ B y _ E m a i l < / Q l t y I n s p e c t i o n _ F i n i s h e d _ B y _ E m a i l > + 
+         < Q l t y I n s p e c t i o n _ F i n i s h e d _ B y _ P h o n e > Q l t y I n s p e c t i o n _ F i n i s h e d _ B y _ P h o n e < / Q l t y I n s p e c t i o n _ F i n i s h e d _ B y _ P h o n e > + 
+         < Q l t y I n s p e c t i o n _ F i n i s h e d _ B y _ T i t l e > Q l t y I n s p e c t i o n _ F i n i s h e d _ B y _ T i t l e < / Q l t y I n s p e c t i o n _ F i n i s h e d _ B y _ T i t l e > + 
+         < Q l t y I n s p e c t i o n _ F i n i s h e d _ B y _ U s e r N a m e > Q l t y I n s p e c t i o n _ F i n i s h e d _ B y _ U s e r N a m e < / Q l t y I n s p e c t i o n _ F i n i s h e d _ B y _ U s e r N a m e > + 
+         < Q l t y I n s p e c t i o n _ F i n i s h e d _ B y _ U s e r _ I D > Q l t y I n s p e c t i o n _ F i n i s h e d _ B y _ U s e r _ I D < / Q l t y I n s p e c t i o n _ F i n i s h e d _ B y _ U s e r _ I D > + 
+         < Q l t y I n s p e c t i o n _ F i n i s h e d _ D a t e > Q l t y I n s p e c t i o n _ F i n i s h e d _ D a t e < / Q l t y I n s p e c t i o n _ F i n i s h e d _ D a t e > + 
+         < Q l t y I n s p e c t i o n _ N o > Q l t y I n s p e c t i o n _ N o < / Q l t y I n s p e c t i o n _ N o > + 
+         < Q l t y I n s p e c t i o n _ R e i n s p e c t i o n N o > Q l t y I n s p e c t i o n _ R e i n s p e c t i o n N o < / Q l t y I n s p e c t i o n _ R e i n s p e c t i o n N o > + 
+         < Q l t y I n s p e c t i o n _ R e s u l t _ C o d e > Q l t y I n s p e c t i o n _ R e s u l t _ C o d e < / Q l t y I n s p e c t i o n _ R e s u l t _ C o d e > + 
+         < Q l t y I n s p e c t i o n _ R e s u l t _ D e s c r i p t i o n > Q l t y I n s p e c t i o n _ R e s u l t _ D e s c r i p t i o n < / Q l t y I n s p e c t i o n _ R e s u l t _ D e s c r i p t i o n > + 
+         < Q l t y I n s p e c t i o n _ S o u r c e _ C u s t o m _ 1 > Q l t y I n s p e c t i o n _ S o u r c e _ C u s t o m _ 1 < / Q l t y I n s p e c t i o n _ S o u r c e _ C u s t o m _ 1 > + 
+         < Q l t y I n s p e c t i o n _ S o u r c e _ C u s t o m _ 1 0 > Q l t y I n s p e c t i o n _ S o u r c e _ C u s t o m _ 1 0 < / Q l t y I n s p e c t i o n _ S o u r c e _ C u s t o m _ 1 0 > + 
+         < Q l t y I n s p e c t i o n _ S o u r c e _ C u s t o m _ 2 > Q l t y I n s p e c t i o n _ S o u r c e _ C u s t o m _ 2 < / Q l t y I n s p e c t i o n _ S o u r c e _ C u s t o m _ 2 > + 
+         < Q l t y I n s p e c t i o n _ S o u r c e _ C u s t o m _ 3 > Q l t y I n s p e c t i o n _ S o u r c e _ C u s t o m _ 3 < / Q l t y I n s p e c t i o n _ S o u r c e _ C u s t o m _ 3 > + 
+         < Q l t y I n s p e c t i o n _ S o u r c e _ C u s t o m _ 4 > Q l t y I n s p e c t i o n _ S o u r c e _ C u s t o m _ 4 < / Q l t y I n s p e c t i o n _ S o u r c e _ C u s t o m _ 4 > + 
+         < Q l t y I n s p e c t i o n _ S o u r c e _ C u s t o m _ 5 > Q l t y I n s p e c t i o n _ S o u r c e _ C u s t o m _ 5 < / Q l t y I n s p e c t i o n _ S o u r c e _ C u s t o m _ 5 > + 
+         < Q l t y I n s p e c t i o n _ S o u r c e _ C u s t o m _ 6 > Q l t y I n s p e c t i o n _ S o u r c e _ C u s t o m _ 6 < / Q l t y I n s p e c t i o n _ S o u r c e _ C u s t o m _ 6 > + 
+         < Q l t y I n s p e c t i o n _ S o u r c e _ C u s t o m _ 7 > Q l t y I n s p e c t i o n _ S o u r c e _ C u s t o m _ 7 < / Q l t y I n s p e c t i o n _ S o u r c e _ C u s t o m _ 7 > + 
+         < Q l t y I n s p e c t i o n _ S o u r c e _ C u s t o m _ 8 > Q l t y I n s p e c t i o n _ S o u r c e _ C u s t o m _ 8 < / Q l t y I n s p e c t i o n _ S o u r c e _ C u s t o m _ 8 > + 
+         < Q l t y I n s p e c t i o n _ S o u r c e _ C u s t o m _ 9 > Q l t y I n s p e c t i o n _ S o u r c e _ C u s t o m _ 9 < / Q l t y I n s p e c t i o n _ S o u r c e _ C u s t o m _ 9 > + 
+         < Q l t y I n s p e c t i o n _ S o u r c e _ D o c u m e n t _ N o _ > Q l t y I n s p e c t i o n _ S o u r c e _ D o c u m e n t _ N o _ < / Q l t y I n s p e c t i o n _ S o u r c e _ D o c u m e n t _ N o _ > + 
+         < Q l t y I n s p e c t i o n _ S o u r c e _ I t e m _ D e s c r i p t i o n > Q l t y I n s p e c t i o n _ S o u r c e _ I t e m _ D e s c r i p t i o n < / Q l t y I n s p e c t i o n _ S o u r c e _ I t e m _ D e s c r i p t i o n > + 
+         < Q l t y I n s p e c t i o n _ S o u r c e _ I t e m _ D e s c r i p t i o n 2 > Q l t y I n s p e c t i o n _ S o u r c e _ I t e m _ D e s c r i p t i o n 2 < / Q l t y I n s p e c t i o n _ S o u r c e _ I t e m _ D e s c r i p t i o n 2 > + 
+         < Q l t y I n s p e c t i o n _ S o u r c e _ I t e m _ N o _ > Q l t y I n s p e c t i o n _ S o u r c e _ I t e m _ N o _ < / Q l t y I n s p e c t i o n _ S o u r c e _ I t e m _ N o _ > + 
+         < Q l t y I n s p e c t i o n _ S o u r c e _ L o t _ N o _ > Q l t y I n s p e c t i o n _ S o u r c e _ L o t _ N o _ < / Q l t y I n s p e c t i o n _ S o u r c e _ L o t _ N o _ > + 
+         < Q l t y I n s p e c t i o n _ S o u r c e _ P a c k a g e _ N o _ > Q l t y I n s p e c t i o n _ S o u r c e _ P a c k a g e _ N o _ < / Q l t y I n s p e c t i o n _ S o u r c e _ P a c k a g e _ N o _ > + 
+         < Q l t y I n s p e c t i o n _ S o u r c e _ S e r i a l _ N o _ > Q l t y I n s p e c t i o n _ S o u r c e _ S e r i a l _ N o _ < / Q l t y I n s p e c t i o n _ S o u r c e _ S e r i a l _ N o _ > + 
+         < Q l t y I n s p e c t i o n _ S o u r c e _ T a s k _ N o _ > Q l t y I n s p e c t i o n _ S o u r c e _ T a s k _ N o _ < / Q l t y I n s p e c t i o n _ S o u r c e _ T a s k _ N o _ > + 
+         < Q l t y I n s p e c t i o n _ S o u r c e _ V a r i a n t _ C o d e > Q l t y I n s p e c t i o n _ S o u r c e _ V a r i a n t _ C o d e < / Q l t y I n s p e c t i o n _ S o u r c e _ V a r i a n t _ C o d e > + 
+         < Q l t y I n s p e c t i o n _ S t a t u s > Q l t y I n s p e c t i o n _ S t a t u s < / Q l t y I n s p e c t i o n _ S t a t u s > + 
+         < R e i n s p e c t i o n S e q u e n c e I n f o r m a t i o n > R e i n s p e c t i o n S e q u e n c e I n f o r m a t i o n < / R e i n s p e c t i o n S e q u e n c e I n f o r m a t i o n > + 
+         < C u r r e n t I n s p e c t i o n L i n e > + 
+             < C a r r i a g e R e t u r n P e r s o n F i e l d D e t a i l s > C a r r i a g e R e t u r n P e r s o n F i e l d D e t a i l s < / C a r r i a g e R e t u r n P e r s o n F i e l d D e t a i l s > + 
+             < C o n d i t i o n L a b e l _ 1 > C o n d i t i o n L a b e l _ 1 < / C o n d i t i o n L a b e l _ 1 > + 
+             < C o n d i t i o n L a b e l _ 2 > C o n d i t i o n L a b e l _ 2 < / C o n d i t i o n L a b e l _ 2 > + 
+             < F i e l d _ C o d e > F i e l d _ C o d e < / F i e l d _ C o d e > + 
+             < F i e l d _ D e s c r i p t i o n > F i e l d _ D e s c r i p t i o n < / F i e l d _ D e s c r i p t i o n > + 
+             < F i e l d _ E n t e r e d B y N a m e A n d T i m e s t a m p > F i e l d _ E n t e r e d B y N a m e A n d T i m e s t a m p < / F i e l d _ E n t e r e d B y N a m e A n d T i m e s t a m p > + 
+             < F i e l d _ H a s E n t e r e d V a l u e > F i e l d _ H a s E n t e r e d V a l u e < / F i e l d _ H a s E n t e r e d V a l u e > + 
+             < F i e l d _ I f P e r s o n E m a i l > F i e l d _ I f P e r s o n E m a i l < / F i e l d _ I f P e r s o n E m a i l > + 
+             < F i e l d _ I f P e r s o n N a m e > F i e l d _ I f P e r s o n N a m e < / F i e l d _ I f P e r s o n N a m e > + 
+             < F i e l d _ I f P e r s o n P h o n e > F i e l d _ I f P e r s o n P h o n e < / F i e l d _ I f P e r s o n P h o n e > + 
+             < F i e l d _ I f P e r s o n T i t l e > F i e l d _ I f P e r s o n T i t l e < / F i e l d _ I f P e r s o n T i t l e > + 
+             < F i e l d _ I s L a b e l > F i e l d _ I s L a b e l < / F i e l d _ I s L a b e l > + 
+             < F i e l d _ I s P e r s o n F i e l d > F i e l d _ I s P e r s o n F i e l d < / F i e l d _ I s P e r s o n F i e l d > + 
+             < F i e l d _ I s T e x t > F i e l d _ I s T e x t < / F i e l d _ I s T e x t > + 
+             < F i e l d _ L i n e C o m m e n t a r y > F i e l d _ L i n e C o m m e n t a r y < / F i e l d _ L i n e C o m m e n t a r y > + 
+             < F i e l d _ M o d i f i e d B y U s e r E m a i l > F i e l d _ M o d i f i e d B y U s e r E m a i l < / F i e l d _ M o d i f i e d B y U s e r E m a i l > + 
+             < F i e l d _ M o d i f i e d B y U s e r I D > F i e l d _ M o d i f i e d B y U s e r I D < / F i e l d _ M o d i f i e d B y U s e r I D > + 
+             < F i e l d _ M o d i f i e d B y U s e r J o b T i t l e > F i e l d _ M o d i f i e d B y U s e r J o b T i t l e < / F i e l d _ M o d i f i e d B y U s e r J o b T i t l e > + 
+             < F i e l d _ M o d i f i e d B y U s e r N a m e > F i e l d _ M o d i f i e d B y U s e r N a m e < / F i e l d _ M o d i f i e d B y U s e r N a m e > + 
+             < F i e l d _ M o d i f i e d B y U s e r P h o n e > F i e l d _ M o d i f i e d B y U s e r P h o n e < / F i e l d _ M o d i f i e d B y U s e r P h o n e > + 
+             < F i e l d _ M o d i f i e d D a t e T i m e > F i e l d _ M o d i f i e d D a t e T i m e < / F i e l d _ M o d i f i e d D a t e T i m e > + 
+             < F i e l d _ T y p e > F i e l d _ T y p e < / F i e l d _ T y p e > + 
+             < I f P e r s o n D e s c r i p t i o n > I f P e r s o n D e s c r i p t i o n < / I f P e r s o n D e s c r i p t i o n > + 
+             < I f P e r s o n M o d i f i e d B y U s e r E m a i l > I f P e r s o n M o d i f i e d B y U s e r E m a i l < / I f P e r s o n M o d i f i e d B y U s e r E m a i l > + 
+             < I f P e r s o n M o d i f i e d D a t e T i m e > I f P e r s o n M o d i f i e d D a t e T i m e < / I f P e r s o n M o d i f i e d D a t e T i m e > + 
+             < L a b e l F i e l d _ D e s c r i p t i o n > L a b e l F i e l d _ D e s c r i p t i o n < / L a b e l F i e l d _ D e s c r i p t i o n > + 
+             < N u m e r i c _ V a l u e > N u m e r i c _ V a l u e < / N u m e r i c _ V a l u e > + 
+             < P r o m p t e d R e s u l t C a p t i o n _ 1 > P r o m p t e d R e s u l t C a p t i o n _ 1 < / P r o m p t e d R e s u l t C a p t i o n _ 1 > + 
+             < P r o m p t e d R e s u l t C a p t i o n _ 1 0 > P r o m p t e d R e s u l t C a p t i o n _ 1 0 < / P r o m p t e d R e s u l t C a p t i o n _ 1 0 > + 
+             < P r o m p t e d R e s u l t C a p t i o n _ 2 > P r o m p t e d R e s u l t C a p t i o n _ 2 < / P r o m p t e d R e s u l t C a p t i o n _ 2 > + 
+             < P r o m p t e d R e s u l t C a p t i o n _ 3 > P r o m p t e d R e s u l t C a p t i o n _ 3 < / P r o m p t e d R e s u l t C a p t i o n _ 3 > + 
+             < P r o m p t e d R e s u l t C a p t i o n _ 4 > P r o m p t e d R e s u l t C a p t i o n _ 4 < / P r o m p t e d R e s u l t C a p t i o n _ 4 > + 
+             < P r o m p t e d R e s u l t C a p t i o n _ 5 > P r o m p t e d R e s u l t C a p t i o n _ 5 < / P r o m p t e d R e s u l t C a p t i o n _ 5 > + 
+             < P r o m p t e d R e s u l t C a p t i o n _ 6 > P r o m p t e d R e s u l t C a p t i o n _ 6 < / P r o m p t e d R e s u l t C a p t i o n _ 6 > + 
+             < P r o m p t e d R e s u l t C a p t i o n _ 7 > P r o m p t e d R e s u l t C a p t i o n _ 7 < / P r o m p t e d R e s u l t C a p t i o n _ 7 > + 
+             < P r o m p t e d R e s u l t C a p t i o n _ 8 > P r o m p t e d R e s u l t C a p t i o n _ 8 < / P r o m p t e d R e s u l t C a p t i o n _ 8 > + 
+             < P r o m p t e d R e s u l t C a p t i o n _ 9 > P r o m p t e d R e s u l t C a p t i o n _ 9 < / P r o m p t e d R e s u l t C a p t i o n _ 9 > + 
+             < P r o m p t e d R e s u l t C o n d i t i o n D e s c r i p t i o n _ 1 > P r o m p t e d R e s u l t C o n d i t i o n D e s c r i p t i o n _ 1 < / P r o m p t e d R e s u l t C o n d i t i o n D e s c r i p t i o n _ 1 > + 
+             < P r o m p t e d R e s u l t C o n d i t i o n D e s c r i p t i o n _ 1 0 > P r o m p t e d R e s u l t C o n d i t i o n D e s c r i p t i o n _ 1 0 < / P r o m p t e d R e s u l t C o n d i t i o n D e s c r i p t i o n _ 1 0 > + 
+             < P r o m p t e d R e s u l t C o n d i t i o n D e s c r i p t i o n _ 2 > P r o m p t e d R e s u l t C o n d i t i o n D e s c r i p t i o n _ 2 < / P r o m p t e d R e s u l t C o n d i t i o n D e s c r i p t i o n _ 2 > + 
+             < P r o m p t e d R e s u l t C o n d i t i o n D e s c r i p t i o n _ 3 > P r o m p t e d R e s u l t C o n d i t i o n D e s c r i p t i o n _ 3 < / P r o m p t e d R e s u l t C o n d i t i o n D e s c r i p t i o n _ 3 > + 
+             < P r o m p t e d R e s u l t C o n d i t i o n D e s c r i p t i o n _ 4 > P r o m p t e d R e s u l t C o n d i t i o n D e s c r i p t i o n _ 4 < / P r o m p t e d R e s u l t C o n d i t i o n D e s c r i p t i o n _ 4 > + 
+             < P r o m p t e d R e s u l t C o n d i t i o n D e s c r i p t i o n _ 5 > P r o m p t e d R e s u l t C o n d i t i o n D e s c r i p t i o n _ 5 < / P r o m p t e d R e s u l t C o n d i t i o n D e s c r i p t i o n _ 5 > + 
+             < P r o m p t e d R e s u l t C o n d i t i o n D e s c r i p t i o n _ 6 > P r o m p t e d R e s u l t C o n d i t i o n D e s c r i p t i o n _ 6 < / P r o m p t e d R e s u l t C o n d i t i o n D e s c r i p t i o n _ 6 > + 
+             < P r o m p t e d R e s u l t C o n d i t i o n D e s c r i p t i o n _ 7 > P r o m p t e d R e s u l t C o n d i t i o n D e s c r i p t i o n _ 7 < / P r o m p t e d R e s u l t C o n d i t i o n D e s c r i p t i o n _ 7 > + 
+             < P r o m p t e d R e s u l t C o n d i t i o n D e s c r i p t i o n _ 8 > P r o m p t e d R e s u l t C o n d i t i o n D e s c r i p t i o n _ 8 < / P r o m p t e d R e s u l t C o n d i t i o n D e s c r i p t i o n _ 8 > + 
+             < P r o m p t e d R e s u l t C o n d i t i o n D e s c r i p t i o n _ 9 > P r o m p t e d R e s u l t C o n d i t i o n D e s c r i p t i o n _ 9 < / P r o m p t e d R e s u l t C o n d i t i o n D e s c r i p t i o n _ 9 > + 
+             < P r o m p t e d R e s u l t V i s i b l e _ 1 > P r o m p t e d R e s u l t V i s i b l e _ 1 < / P r o m p t e d R e s u l t V i s i b l e _ 1 > + 
+             < P r o m p t e d R e s u l t V i s i b l e _ 1 0 > P r o m p t e d R e s u l t V i s i b l e _ 1 0 < / P r o m p t e d R e s u l t V i s i b l e _ 1 0 > + 
+             < P r o m p t e d R e s u l t V i s i b l e _ 2 > P r o m p t e d R e s u l t V i s i b l e _ 2 < / P r o m p t e d R e s u l t V i s i b l e _ 2 > + 
+             < P r o m p t e d R e s u l t V i s i b l e _ 3 > P r o m p t e d R e s u l t V i s i b l e _ 3 < / P r o m p t e d R e s u l t V i s i b l e _ 3 > + 
+             < P r o m p t e d R e s u l t V i s i b l e _ 4 > P r o m p t e d R e s u l t V i s i b l e _ 4 < / P r o m p t e d R e s u l t V i s i b l e _ 4 > + 
+             < P r o m p t e d R e s u l t V i s i b l e _ 5 > P r o m p t e d R e s u l t V i s i b l e _ 5 < / P r o m p t e d R e s u l t V i s i b l e _ 5 > + 
+             < P r o m p t e d R e s u l t V i s i b l e _ 6 > P r o m p t e d R e s u l t V i s i b l e _ 6 < / P r o m p t e d R e s u l t V i s i b l e _ 6 > + 
+             < P r o m p t e d R e s u l t V i s i b l e _ 7 > P r o m p t e d R e s u l t V i s i b l e _ 7 < / P r o m p t e d R e s u l t V i s i b l e _ 7 > + 
+             < P r o m p t e d R e s u l t V i s i b l e _ 8 > P r o m p t e d R e s u l t V i s i b l e _ 8 < / P r o m p t e d R e s u l t V i s i b l e _ 8 > + 
+             < P r o m p t e d R e s u l t V i s i b l e _ 9 > P r o m p t e d R e s u l t V i s i b l e _ 9 < / P r o m p t e d R e s u l t V i s i b l e _ 9 > + 
+             < T e s t _ R e s u l t > T e s t _ R e s u l t < / T e s t _ R e s u l t > + 
+             < T e s t _ R e s u l t D e s c r i p t i o n > T e s t _ R e s u l t D e s c r i p t i o n < / T e s t _ R e s u l t D e s c r i p t i o n > + 
+             < T e s t _ V a l u e > T e s t _ V a l u e < / T e s t _ V a l u e > + 
+             < W o r d D e s c r i p t i o n > W o r d D e s c r i p t i o n < / W o r d D e s c r i p t i o n > + 
+             < W o r d M o d i f i e d B y U s e r N a m e > W o r d M o d i f i e d B y U s e r N a m e < / W o r d M o d i f i e d B y U s e r N a m e > + 
+             < W o r d M o d i f i e d D a t e T i m e > W o r d M o d i f i e d D a t e T i m e < / W o r d M o d i f i e d D a t e T i m e > + 
+             < W o r d T e s t V a l u e > W o r d T e s t V a l u e < / W o r d T e s t V a l u e > + 
+         < / C u r r e n t I n s p e c t i o n L i n e > + 
+     < / C u r r e n t I n s p e c t i o n > + 
+ < / N a v W o r d R e p o r t X m l P a r t > 
+</file>
+
+<file path=customXml/item2.xml>��< ? x m l   v e r s i o n = " 1 . 0 "   e n c o d i n g = " u t f - 1 6 " ? > < N a v W o r d R e p o r t X m l P a r t   x m l n s = " u r n : m i c r o s o f t - d y n a m i c s - b u s i n e s s c e n t r a l / i n t e r n a l / e x t e n d e d / r e p o r t s / Q l t y _ G e n e r a l _ P u r p o s e _ I n s p e c t / 2 0 4 0 5 / " > + 
+     < B C R e p o r t I n f o r m a t i o n > + 
+         < R e p o r t M e t a d a t a > + 
+             < E x t e n s i o n I d > E x t e n s i o n   I D < / E x t e n s i o n I d > + 
+             < E x t e n s i o n N a m e > E x t e n s i o n   N a m e < / E x t e n s i o n N a m e > + 
+             < E x t e n s i o n P u b l i s h e r > E x t e n s i o n   P u b l i s h e r < / E x t e n s i o n P u b l i s h e r > + 
+             < E x t e n s i o n V e r s i o n > E x t e n s i o n   V e r s i o n < / E x t e n s i o n V e r s i o n > + 
+             < R e p o r t I d > R e p o r t   I D < / R e p o r t I d > + 
+             < R e p o r t N a m e > R e p o r t   N a m e < / R e p o r t N a m e > + 
+             < A b o u t T h i s R e p o r t T i t l e > A b o u t   T h i s   R e p o r t   T i t l e < / A b o u t T h i s R e p o r t T i t l e > + 
+             < A b o u t T h i s R e p o r t T e x t > A b o u t   T h i s   R e p o r t   T e x t < / A b o u t T h i s R e p o r t T e x t > + 
+             < R e p o r t H e l p L i n k > R e p o r t   H e l p   L i n k < / R e p o r t H e l p L i n k > + 
+         < / R e p o r t M e t a d a t a > + 
+         < R e p o r t R e q u e s t > + 
+             < T e n a n t E n t r a I d > T e n a n t   E n t r a   I d < / T e n a n t E n t r a I d > + 
+             < E n v i r o n m e n t N a m e > E n v i r o n m e n t   N a m e < / E n v i r o n m e n t N a m e > + 
+             < E n v i r o n m e n t T y p e > E n v i r o n m e n t   T y p e < / E n v i r o n m e n t T y p e > + 
+             < C o m p a n y N a m e > C o m p a n y   N a m e < / C o m p a n y N a m e > + 
+             < C o m p a n y D i s p l a y N a m e > C o m p a n y   D i s p l a y   N a m e < / C o m p a n y D i s p l a y N a m e > + 
+             < C o m p a n y I d > C o m p a n y   I D < / C o m p a n y I d > + 
+             < U s e r N a m e > U s e r   N a m e < / U s e r N a m e > + 
+             < D a t e A n d T i m e > D a t e   a n d   T i m e < / D a t e A n d T i m e > + 
+             < L a n g u a g e > L a n g u a g e < / L a n g u a g e > + 
+             < F o r m a t R e g i o n > F o r m a t   R e g i o n < / F o r m a t R e g i o n > + 
+             < D a t e T i m e V a l u e s > + 
+                 < Y e a r > Y e a r < / Y e a r > + 
+                 < M o n t h N u m b e r > M o n t h   N u m b e r < / M o n t h N u m b e r > + 
+                 < D a y N u m b e r > D a y   N u m b e r < / D a y N u m b e r > + 
+                 < H o u r > H o u r < / H o u r > + 
+                 < M i n u t e > M i n u t e < / M i n u t e > + 
+             < / D a t e T i m e V a l u e s > + 
+         < / R e p o r t R e q u e s t > + 
+     < / B C R e p o r t I n f o r m a t i o n > + 
+     < L a b e l s > + 
+         < D a t e L a b e l   E l e m e n t T y p e = " P a r a m e t e r "   E l e m e n t I d = " 7 9 3 8 1 7 7 7 7 "   D a t a T y p e = " S t r i n g " > D a t e L a b e l < / D a t e L a b e l > + 
+         < F i n i s h e d B y L a b e l   E l e m e n t T y p e = " P a r a m e t e r "   E l e m e n t I d = " 1 2 1 8 3 5 9 1 8 "   D a t a T y p e = " S t r i n g " > F i n i s h e d B y L a b e l < / F i n i s h e d B y L a b e l > + 
+         < F i n i s h e d O n L a b e l   E l e m e n t T y p e = " P a r a m e t e r "   E l e m e n t I d = " 1 9 3 5 3 2 6 4 3 2 "   D a t a T y p e = " S t r i n g " > F i n i s h e d O n L a b e l < / F i n i s h e d O n L a b e l > + 
+         < I n s p e c t i o n L a b e l   E l e m e n t T y p e = " P a r a m e t e r "   E l e m e n t I d = " 1 5 4 9 8 3 1 5 2 5 "   D a t a T y p e = " S t r i n g " > I n s p e c t i o n L a b e l < / I n s p e c t i o n L a b e l > + 
+         < I t e m L a b e l   E l e m e n t T y p e = " P a r a m e t e r "   E l e m e n t I d = " 1 0 8 2 0 2 8 9 7 4 "   D a t a T y p e = " S t r i n g " > I t e m L a b e l < / I t e m L a b e l > + 
+         < I t e m T r a c k i n g L a b e l   E l e m e n t T y p e = " P a r a m e t e r "   E l e m e n t I d = " 9 3 5 5 3 4 6 7 1 "   D a t a T y p e = " S t r i n g " > I t e m T r a c k i n g L a b e l < / I t e m T r a c k i n g L a b e l > + 
+         < L a s t M o d i f i e d B y L a b e l   E l e m e n t T y p e = " P a r a m e t e r "   E l e m e n t I d = " 9 3 1 4 2 8 2 9 1 "   D a t a T y p e = " S t r i n g " > L a s t M o d i f i e d B y L a b e l < / L a s t M o d i f i e d B y L a b e l > + 
+         < P a g e L a b e l   E l e m e n t T y p e = " P a r a m e t e r "   E l e m e n t I d = " 1 8 8 0 8 2 7 5 0 4 "   D a t a T y p e = " S t r i n g " > P a g e L a b e l < / P a g e L a b e l > + 
+         < R e p o r t T i t l e L a b e l   E l e m e n t T y p e = " P a r a m e t e r "   E l e m e n t I d = " 1 2 9 7 0 8 9 6 2 7 "   D a t a T y p e = " S t r i n g " > R e p o r t T i t l e L a b e l < / R e p o r t T i t l e L a b e l > + 
+         < R e s u l t L a b e l   E l e m e n t T y p e = " P a r a m e t e r "   E l e m e n t I d = " 4 0 7 6 0 6 8 8 6 "   D a t a T y p e = " S t r i n g " > R e s u l t L a b e l < / R e s u l t L a b e l > + 
+         < T e s t L a b e l   E l e m e n t T y p e = " P a r a m e t e r "   E l e m e n t I d = " 1 5 2 2 4 8 5 9 "   D a t a T y p e = " S t r i n g " > T e s t L a b e l < / T e s t L a b e l > + 
+         < T e s t V a l u e L a b e l   E l e m e n t T y p e = " P a r a m e t e r "   E l e m e n t I d = " 1 1 6 2 1 3 2 5 7 0 "   D a t a T y p e = " S t r i n g " > T e s t V a l u e L a b e l < / T e s t V a l u e L a b e l > + 
+     < / L a b e l s > + 
+     < T o o l t i p s > + 
+         < T o o l t i p   c o l u m n = " Q l t y I n s p e c t i o n T e m p l a t e _ D e s c r i p t i o n "   E l e m e n t I d = " 1 6 5 2 0 6 9 5 9 8 " > + 
+             < T o o l t i p T e x t   l a n g = " e n - U S " > S p e c i f i e s   a n   e x p l a n a t i o n   o f   t h e   Q u a l i t y   I n s p e c t i o n   T e m p l a t e .   Y o u   c a n   e n t e r   a   m a x i m u m   o f   1 0 0   c h a r a c t e r s ,   b o t h   n u m b e r s   a n d   l e t t e r s . < / T o o l t i p T e x t > + 
+         < / T o o l t i p > + 
+         < T o o l t i p   c o l u m n = " Q l t y I n s p e c t i o n _ D e s c r i p t i o n "   E l e m e n t I d = " 7 3 9 0 1 9 9 1 0 " > + 
+             < T o o l t i p T e x t   l a n g = " e n - U S " > S p e c i f i e s   a   d e s c r i p t i o n   o f   t h e   Q u a l i t y   I n s p e c t i o n   i t s e l f . < / T o o l t i p T e x t > + 
+         < / T o o l t i p > + 
+         < T o o l t i p   c o l u m n = " Q l t y I n s p e c t i o n _ S t a t u s "   E l e m e n t I d = " 8 5 1 7 5 2 7 6 8 " > + 
+             < T o o l t i p T e x t   l a n g = " e n - U S " > S p e c i f i e s   t h e   s t a t u s   o f   t h e   i n s p e c t i o n .   N o   a d d i t i o n a l   c h a n g e s   c a n   b e   m a d e   t o   a   f i n i s h e d   Q u a l i t y   I n s p e c t i o n . < / T o o l t i p T e x t > + 
+         < / T o o l t i p > + 
+         < T o o l t i p   c o l u m n = " Q l t y I n s p e c t i o n _ R e s u l t _ C o d e "   E l e m e n t I d = " 1 8 0 7 0 7 7 0 6 5 " > + 
+             < T o o l t i p T e x t   l a n g = " e n - U S " > S p e c i f i e s   t h e   r e s u l t   i s   a u t o m a t i c a l l y   d e t e r m i n e d   b a s e d   o n   t h e   t e s t   v a l u e   a n d   r e s u l t   c o n f i g u r a t i o n . < / T o o l t i p T e x t > + 
+         < / T o o l t i p > + 
+         < T o o l t i p   c o l u m n = " Q l t y I n s p e c t i o n _ R e s u l t _ D e s c r i p t i o n "   E l e m e n t I d = " 8 1 0 5 3 8 1 8 8 " > + 
+             < T o o l t i p T e x t   l a n g = " e n - U S " > S p e c i f i e s   t h e   r e s u l t   d e s c r i p t i o n   f o r   t h i s   t e s t   r e s u l t .   T h e   r e s u l t   i s   a u t o m a t i c a l l y   d e t e r m i n e d   b a s e d   o n   t h e   t e s t   v a l u e   a n d   r e s u l t   c o n f i g u r a t i o n . < / T o o l t i p T e x t > + 
+         < / T o o l t i p > + 
+         < T o o l t i p   c o l u m n = " Q l t y I n s p e c t i o n _ N o "   E l e m e n t I d = " 2 1 2 0 6 1 5 7 4 9 " > + 
+             < T o o l t i p T e x t   l a n g = " e n - U S " > S p e c i f i e s   t h e   q u a l i t y   i n s p e c t i o n   d o c u m e n t   n u m b e r . < / T o o l t i p T e x t > + 
+         < / T o o l t i p > + 
+         < T o o l t i p   c o l u m n = " Q l t y I n s p e c t i o n _ R e i n s p e c t i o n N o "   E l e m e n t I d = " 7 5 1 7 3 5 6 " > + 
+             < T o o l t i p T e x t   l a n g = " e n - U S " > S p e c i f i e s   t h e   r e - i n s p e c t i o n   c o u n t e r . < / T o o l t i p T e x t > + 
+         < / T o o l t i p > + 
+         < T o o l t i p   c o l u m n = " Q l t y I n s p e c t i o n _ F i n i s h e d _ B y _ U s e r _ I D "   E l e m e n t I d = " 1 7 5 0 5 1 6 3 3 8 " > + 
+             < T o o l t i p T e x t   l a n g = " e n - U S " > S p e c i f i e s   t h e   u s e r   t h a t   f i n i s h e d   t h e   i n s p e c t i o n . < / T o o l t i p T e x t > + 
+         < / T o o l t i p > + 
+         < T o o l t i p   c o l u m n = " Q l t y I n s p e c t i o n _ F i n i s h e d _ D a t e "   E l e m e n t I d = " 1 8 3 4 1 2 2 7 6 5 " > + 
+             < T o o l t i p T e x t   l a n g = " e n - U S " > S p e c i f i e s   t h e   d a t e   t h a t   t h e   i n s p e c t i o n   w a s   f i n i s h e d . < / T o o l t i p T e x t > + 
+         < / T o o l t i p > + 
+         < T o o l t i p   c o l u m n = " Q l t y I n s p e c t i o n _ S o u r c e _ I t e m _ N o _ "   E l e m e n t I d = " 1 2 6 8 0 5 0 5 1 8 " > + 
+             < T o o l t i p T e x t   l a n g = " e n - U S " > S p e c i f i e s   t h e   i t e m   t h a t   t h e   Q u a l i t y   I n s p e c t i o n   i s   f o r .   W h e n   u s e d   w i t h   p r o d u c t i o n   o r d e r s   t h i s   t y p i c a l l y   r e f e r s   t o   t h e   i t e m   b e i n g   p r o d u c e d . < / T o o l t i p T e x t > + 
+         < / T o o l t i p > + 
+         < T o o l t i p   c o l u m n = " Q l t y I n s p e c t i o n _ S o u r c e _ I t e m _ D e s c r i p t i o n "   E l e m e n t I d = " 6 4 6 8 9 0 6 3 0 " > + 
+             < T o o l t i p T e x t   l a n g = " e n - U S " > S p e c i f i e s   a   d e s c r i p t i o n   o f   t h e   i t e m . < / T o o l t i p T e x t > + 
+         < / T o o l t i p > + 
+         < T o o l t i p   c o l u m n = " Q l t y I n s p e c t i o n _ S o u r c e _ I t e m _ D e s c r i p t i o n 2 "   E l e m e n t I d = " 1 2 7 9 3 6 9 3 5 2 " > + 
+             < T o o l t i p T e x t   l a n g = " e n - U S " > S p e c i f i e s   i n f o r m a t i o n   i n   a d d i t i o n   t o   t h e   d e s c r i p t i o n . < / T o o l t i p T e x t > + 
+         < / T o o l t i p > + 
+         < T o o l t i p   c o l u m n = " Q l t y I n s p e c t i o n _ S o u r c e _ V a r i a n t _ C o d e "   E l e m e n t I d = " 1 6 0 8 4 0 3 8 2 1 " > + 
+             < T o o l t i p T e x t   l a n g = " e n - U S " > S p e c i f i e s   t h e   i t e m   v a r i a n t   t h a t   t h e   Q u a l i t y   I n s p e c t i o n   i s   f o r .   W h e n   u s e d   w i t h   p r o d u c t i o n   o r d e r s   t h i s   t y p i c a l l y   r e f e r s   t o   t h e   i t e m   b e i n g   p r o d u c e d . < / T o o l t i p T e x t > + 
+         < / T o o l t i p > + 
+         < T o o l t i p   c o l u m n = " Q l t y I n s p e c t i o n _ S o u r c e _ L o t _ N o _ "   E l e m e n t I d = " 1 1 2 3 5 5 1 3 1 2 " > + 
+             < T o o l t i p T e x t   l a n g = " e n - U S " > S p e c i f i e s   t h e   l o t   n u m b e r   t h a t   t h e   q u a l i t y   i n s p e c t i o n   i s   f o r .   T h i s   i s   o n l y   u s e d   f o r   l o t   t r a c k e d   i t e m s . < / T o o l t i p T e x t > + 
+         < / T o o l t i p > + 
+         < T o o l t i p   c o l u m n = " Q l t y I n s p e c t i o n _ S o u r c e _ S e r i a l _ N o _ "   E l e m e n t I d = " 1 5 2 0 5 9 1 4 4 7 " > + 
+             < T o o l t i p T e x t   l a n g = " e n - U S " > S p e c i f i e s   t h e   s e r i a l   n u m b e r   t h a t   t h e   q u a l i t y   i n s p e c t i o n   i s   f o r .   T h i s   i s   o n l y   u s e d   f o r   s e r i a l   t r a c k e d   i t e m s . < / T o o l t i p T e x t > + 
+         < / T o o l t i p > + 
+         < T o o l t i p   c o l u m n = " Q l t y I n s p e c t i o n _ S o u r c e _ P a c k a g e _ N o _ "   E l e m e n t I d = " 1 9 6 1 1 2 9 9 7 " > + 
+             < T o o l t i p T e x t   l a n g = " e n - U S " > S p e c i f i e s   t h e   p a c k a g e   n u m b e r   t h a t   t h e   q u a l i t y   i n s p e c t i o n   i s   f o r .   T h i s   i s   o n l y   u s e d   f o r   p a c k a g e   t r a c k e d   i t e m s . < / T o o l t i p T e x t > + 
+         < / T o o l t i p > + 
+         < T o o l t i p   c o l u m n = " Q l t y I n s p e c t i o n _ S o u r c e _ D o c u m e n t _ N o _ "   E l e m e n t I d = " 1 6 7 5 9 1 6 2 8 8 " > + 
+             < T o o l t i p T e x t   l a n g = " e n - U S " > S p e c i f i e s   a   r e f e r e n c e   t o   t h e   d o c u m e n t   t h a t   t h i s   Q u a l i t y   I n s p e c t i o n   i s   r e f e r r i n g   t o .   T h i s   t y p i c a l l y   r e f e r s   t o   a   p r o d u c t i o n   o r d e r   d o c u m e n t   n u m b e r . < / T o o l t i p T e x t > + 
+         < / T o o l t i p > + 
+         < T o o l t i p   c o l u m n = " Q l t y I n s p e c t i o n _ S o u r c e _ T a s k _ N o _ "   E l e m e n t I d = " 3 8 4 6 4 4 1 8 2 " > + 
+             < T o o l t i p T e x t   l a n g = " e n - U S " > S p e c i f i e s   a   r e f e r e n c e   t o   t h e   s o u r c e   t a s k   n o .   t h a t   t h i s   Q u a l i t y   I n s p e c t i o n   i s   r e f e r r i n g   t o .   T h i s   t y p i c a l l y   r e f e r s   t o   a n   o p e r a t i o n . < / T o o l t i p T e x t > + 
+         < / T o o l t i p > + 
+         < T o o l t i p   c o l u m n = " Q l t y I n s p e c t i o n _ S o u r c e _ C u s t o m _ 1 "   E l e m e n t I d = " 5 4 6 4 5 3 7 6 5 " > + 
+             < T o o l t i p T e x t   l a n g = " e n - U S " > S p e c i f i e s   a d d i t i o n a l   i n f o r m a t i o n   f r o m   a   s o u r c e   r e c o r d . < / T o o l t i p T e x t > + 
+         < / T o o l t i p > + 
+         < T o o l t i p   c o l u m n = " Q l t y I n s p e c t i o n _ S o u r c e _ C u s t o m _ 2 "   E l e m e n t I d = " 1 8 3 5 4 2 3 6 8 0 " > + 
+             < T o o l t i p T e x t   l a n g = " e n - U S " > S p e c i f i e s   a d d i t i o n a l   i n f o r m a t i o n   f r o m   a   s o u r c e   r e c o r d . < / T o o l t i p T e x t > + 
+         < / T o o l t i p > + 
+         < T o o l t i p   c o l u m n = " Q l t y I n s p e c t i o n _ S o u r c e _ C u s t o m _ 3 "   E l e m e n t I d = " 1 8 2 1 8 4 6 9 9 9 " > + 
+             < T o o l t i p T e x t   l a n g = " e n - U S " > S p e c i f i e s   a d d i t i o n a l   i n f o r m a t i o n   f r o m   a   s o u r c e   r e c o r d . < / T o o l t i p T e x t > + 
+         < / T o o l t i p > + 
+         < T o o l t i p   c o l u m n = " Q l t y I n s p e c t i o n _ S o u r c e _ C u s t o m _ 4 "   E l e m e n t I d = " 1 3 6 6 6 3 6 0 8 6 " > + 
+             < T o o l t i p T e x t   l a n g = " e n - U S " > S p e c i f i e s   a d d i t i o n a l   i n f o r m a t i o n   f r o m   a   s o u r c e   r e c o r d . < / T o o l t i p T e x t > + 
+         < / T o o l t i p > + 
+         < T o o l t i p   c o l u m n = " Q l t y I n s p e c t i o n _ S o u r c e _ C u s t o m _ 5 "   E l e m e n t I d = " 2 0 0 4 3 3 2 7 0 3 " > + 
+             < T o o l t i p T e x t   l a n g = " e n - U S " > S p e c i f i e s   a d d i t i o n a l   i n f o r m a t i o n   f r o m   a   s o u r c e   r e c o r d . < / T o o l t i p T e x t > + 
+         < / T o o l t i p > + 
+         < T o o l t i p   c o l u m n = " Q l t y I n s p e c t i o n _ S o u r c e _ C u s t o m _ 6 "   E l e m e n t I d = " 9 1 2 4 2 8 5 2 " > + 
+             < T o o l t i p T e x t   l a n g = " e n - U S " > S p e c i f i e s   a d d i t i o n a l   i n f o r m a t i o n   f r o m   a   s o u r c e   r e c o r d . < / T o o l t i p T e x t > + 
+         < / T o o l t i p > + 
+         < T o o l t i p   c o l u m n = " Q l t y I n s p e c t i o n _ S o u r c e _ C u s t o m _ 7 "   E l e m e n t I d = " 7 2 8 9 3 9 4 6 9 " > + 
+             < T o o l t i p T e x t   l a n g = " e n - U S " > S p e c i f i e s   a d d i t i o n a l   i n f o r m a t i o n   f r o m   a   s o u r c e   r e c o r d . < / T o o l t i p T e x t > + 
+         < / T o o l t i p > + 
+         < T o o l t i p   c o l u m n = " Q l t y I n s p e c t i o n _ S o u r c e _ C u s t o m _ 8 "   E l e m e n t I d = " 3 7 7 5 4 4 7 4 2 " > + 
+             < T o o l t i p T e x t   l a n g = " e n - U S " > S p e c i f i e s   a d d i t i o n a l   i n f o r m a t i o n   f r o m   a   s o u r c e   r e c o r d . < / T o o l t i p T e x t > + 
+         < / T o o l t i p > + 
+         < T o o l t i p   c o l u m n = " Q l t y I n s p e c t i o n _ S o u r c e _ C u s t o m _ 9 "   E l e m e n t I d = " 2 6 0 1 5 1 8 7 5 " > + 
+             < T o o l t i p T e x t   l a n g = " e n - U S " > S p e c i f i e s   a d d i t i o n a l   i n f o r m a t i o n   f r o m   a   s o u r c e   r e c o r d . < / T o o l t i p T e x t > + 
+         < / T o o l t i p > + 
+         < T o o l t i p   c o l u m n = " Q l t y I n s p e c t i o n _ S o u r c e _ C u s t o m _ 1 0 "   E l e m e n t I d = " 1 5 3 7 6 5 2 9 2 5 " > + 
+             < T o o l t i p T e x t   l a n g = " e n - U S " > S p e c i f i e s   a d d i t i o n a l   i n f o r m a t i o n   f r o m   a   s o u r c e   r e c o r d . < / T o o l t i p T e x t > + 
+         < / T o o l t i p > + 
+         < T o o l t i p   c o l u m n = " F i e l d _ C o d e "   E l e m e n t I d = " 1 3 2 7 2 5 5 7 3 " > + 
+             < T o o l t i p T e x t   l a n g = " e n - U S " > S p e c i f i e s   t h e   f i e l d / q u e s t i o n / m e t r i c   i n   t h i s   t e s t . < / T o o l t i p T e x t > + 
+         < / T o o l t i p > + 
+         < T o o l t i p   c o l u m n = " F i e l d _ D e s c r i p t i o n "   E l e m e n t I d = " 1 4 6 8 6 2 1 2 9 8 " > + 
+             < T o o l t i p T e x t   l a n g = " e n - U S " > S p e c i f i e s   a   d e s c r i p t i o n   o f   t h e   f i e l d   a s   i t   i s   u s e d   o n   t h e   t e s t . < / T o o l t i p T e x t > + 
+         < / T o o l t i p > + 
+         < T o o l t i p   c o l u m n = " N u m e r i c _ V a l u e "   E l e m e n t I d = " 4 6 0 4 1 2 6 4 6 " > + 
+             < T o o l t i p T e x t   l a n g = " e n - U S " > S p e c i f i e s   a n   e v a l u a t e d   n u m e r i c   v a l u e   o f   T e s t   V a l u e   f o r   u s e   i n   c a l c u l a t i o n s   a n d   a n a l y s i s .   T h i s   v a l u e   i s   a u t o m a t i c a l l y   c a l c u l a t e d   w h e n   t h e   T e s t   V a l u e   i s   e n t e r e d   o r   m o d i f i e d   b a s e d   o n   t h e   c o n f i g u r a t i o n   o f   t h e   T e s t   V a l u e   a n d   i s   n o t   d i r e c t l y   e d i t a b l e . < / T o o l t i p T e x t > + 
+         < / T o o l t i p > + 
+         < T o o l t i p   c o l u m n = " F i e l d _ T y p e "   E l e m e n t I d = " 1 3 2 8 1 6 4 0 1 6 " > + 
+             < T o o l t i p T e x t   l a n g = " e n - U S " > S p e c i f i e s   t h e   d a t a   t y p e   o f   t h e   v a l u e s   y o u   c a n   e n t e r   o r   s e l e c t   f o r   t h i s   t e s t .   U s e   D e c i m a l   f o r   n u m e r i c a l   m e a s u r e m e n t s .   U s e   C h o i c e   t o   g i v e   a   l i s t   o f   o p t i o n s   t o   c h o o s e   f r o m .   I f   y o u   w a n t   t o   c h o o s e   o p t i o n s   f r o m   a n   e x i s t i n g   t a b l e ,   u s e   T a b l e   L o o k u p . < / T o o l t i p T e x t > + 
+         < / T o o l t i p > + 
+         < T o o l t i p   c o l u m n = " T e s t _ R e s u l t "   E l e m e n t I d = " 1 2 7 1 0 6 2 1 4 1 " > + 
+             < T o o l t i p T e x t   l a n g = " e n - U S " > S p e c i f i e s   t h e   r e s u l t   i s   a u t o m a t i c a l l y   d e t e r m i n e d   b a s e d   o n   t h e   t e s t   v a l u e   a n d   r e s u l t   c o n f i g u r a t i o n . < / T o o l t i p T e x t > + 
+         < / T o o l t i p > + 
+     < / T o o l t i p s > + 
+     < C u r r e n t I n s p e c t i o n   E l e m e n t T y p e = " D a t a I t e m "   E l e m e n t I d = " 1 7 4 7 8 9 7 9 7 8 " > + 
+         < A p p r o v e r N a m e L a b e l   E l e m e n t T y p e = " C o l u m n "   E l e m e n t I d = " 1 8 9 7 9 9 2 7 8 5 "   D a t a T y p e = " T e x t " > A p p r o v e r N a m e L a b e l < / A p p r o v e r N a m e L a b e l > + 
+         < A p p r o v e r S i g n a t u r e L a b e l   E l e m e n t T y p e = " C o l u m n "   E l e m e n t I d = " 1 0 3 4 5 1 7 9 4 "   D a t a T y p e = " T e x t " > A p p r o v e r S i g n a t u r e L a b e l < / A p p r o v e r S i g n a t u r e L a b e l > + 
+         < C O A C o n t a c t _ A l l   E l e m e n t T y p e = " C o l u m n "   E l e m e n t I d = " 1 5 9 3 9 3 0 3 4 6 "   D a t a T y p e = " T e x t " > C O A C o n t a c t _ A l l < / C O A C o n t a c t _ A l l > + 
+         < C O A C o n t a c t _ R o w 1   E l e m e n t T y p e = " C o l u m n "   E l e m e n t I d = " 1 2 7 0 2 3 9 7 3 2 "   D a t a T y p e = " T e x t " > C O A C o n t a c t _ R o w 1 < / C O A C o n t a c t _ R o w 1 > + 
+         < C O A C o n t a c t _ R o w 2   E l e m e n t T y p e = " C o l u m n "   E l e m e n t I d = " 6 4 2 8 5 0 1 1 9 "   D a t a T y p e = " T e x t " > C O A C o n t a c t _ R o w 2 < / C O A C o n t a c t _ R o w 2 > + 
+         < C O A C o n t a c t _ R o w 3   E l e m e n t T y p e = " C o l u m n "   E l e m e n t I d = " 5 1 5 3 5 0 2 "   D a t a T y p e = " T e x t " > C O A C o n t a c t _ R o w 3 < / C O A C o n t a c t _ R o w 3 > + 
+         < C O A C o n t a c t _ R o w 4   E l e m e n t T y p e = " C o l u m n "   E l e m e n t I d = " 1 1 1 1 6 3 7 7 1 3 "   D a t a T y p e = " T e x t " > C O A C o n t a c t _ R o w 4 < / C O A C o n t a c t _ R o w 4 > + 
+         < C O A C o n t a c t _ R o w 5   E l e m e n t T y p e = " C o l u m n "   E l e m e n t I d = " 4 7 3 9 4 1 0 9 6 "   D a t a T y p e = " T e x t " > C O A C o n t a c t _ R o w 5 < / C O A C o n t a c t _ R o w 5 > + 
+         < C O A C o n t a c t _ R o w 6   E l e m e n t T y p e = " C o l u m n "   E l e m e n t I d = " 1 9 0 7 9 3 6 3 4 9 "   D a t a T y p e = " T e x t " > C O A C o n t a c t _ R o w 6 < / C O A C o n t a c t _ R o w 6 > + 
+         < C O A C o n t a c t _ R o w 7   E l e m e n t T y p e = " C o l u m n "   E l e m e n t I d = " 1 7 4 9 3 3 4 3 3 0 "   D a t a T y p e = " T e x t " > C O A C o n t a c t _ R o w 7 < / C O A C o n t a c t _ R o w 7 > + 
+         < C O A C o n t a c t _ R o w 8   E l e m e n t T y p e = " C o l u m n "   E l e m e n t I d = " 1 4 3 9 1 4 8 7 5 5 "   D a t a T y p e = " T e x t " > C O A C o n t a c t _ R o w 8 < / C O A C o n t a c t _ R o w 8 > + 
+         < C o m p a n y I n f o r m a t i o n _ A l l   E l e m e n t T y p e = " C o l u m n "   E l e m e n t I d = " 7 6 1 9 7 4 8 2 4 "   D a t a T y p e = " T e x t " > C o m p a n y I n f o r m a t i o n _ A l l < / C o m p a n y I n f o r m a t i o n _ A l l > + 
+         < C o m p a n y I n f o r m a t i o n _ R o w 1   E l e m e n t T y p e = " C o l u m n "   E l e m e n t I d = " 1 8 4 3 2 1 2 8 9 4 "   D a t a T y p e = " T e x t " > C o m p a n y I n f o r m a t i o n _ R o w 1 < / C o m p a n y I n f o r m a t i o n _ R o w 1 > + 
+         < C o m p a n y I n f o r m a t i o n _ R o w 2   E l e m e n t T y p e = " C o l u m n "   E l e m e n t I d = " 1 8 1 4 0 5 7 7 8 5 "   D a t a T y p e = " T e x t " > C o m p a n y I n f o r m a t i o n _ R o w 2 < / C o m p a n y I n f o r m a t i o n _ R o w 2 > + 
+         < C o m p a n y I n f o r m a t i o n _ R o w 3   E l e m e n t T y p e = " C o l u m n "   E l e m e n t I d = " 1 1 7 6 3 6 1 1 6 8 "   D a t a T y p e = " T e x t " > C o m p a n y I n f o r m a t i o n _ R o w 3 < / C o m p a n y I n f o r m a t i o n _ R o w 3 > + 
+         < C o m p a n y I n f o r m a t i o n _ R o w 4   E l e m e n t T y p e = " C o l u m n "   E l e m e n t I d = " 1 3 4 5 2 7 0 1 9 1 "   D a t a T y p e = " T e x t " > C o m p a n y I n f o r m a t i o n _ R o w 4 < / C o m p a n y I n f o r m a t i o n _ R o w 4 > + 
+         < C o m p a n y I n f o r m a t i o n _ R o w 5   E l e m e n t T y p e = " C o l u m n "   E l e m e n t I d = " 7 0 7 5 7 3 5 7 4 "   D a t a T y p e = " T e x t " > C o m p a n y I n f o r m a t i o n _ R o w 5 < / C o m p a n y I n f o r m a t i o n _ R o w 5 > + 
+         < C o m p a n y I n f o r m a t i o n _ R o w 6   E l e m e n t T y p e = " C o l u m n "   E l e m e n t I d = " 6 9 8 7 6 9 5 7 "   D a t a T y p e = " T e x t " > C o m p a n y I n f o r m a t i o n _ R o w 6 < / C o m p a n y I n f o r m a t i o n _ R o w 6 > + 
+         < C o m p a n y I n f o r m a t i o n _ R o w 7   E l e m e n t T y p e = " C o l u m n "   E l e m e n t I d = " 5 6 7 8 1 9 6 6 0 "   D a t a T y p e = " T e x t " > C o m p a n y I n f o r m a t i o n _ R o w 7 < / C o m p a n y I n f o r m a t i o n _ R o w 7 > + 
+         < C o m p a n y I n f o r m a t i o n _ R o w 8   E l e m e n t T y p e = " C o l u m n "   E l e m e n t I d = " 3 9 8 9 1 0 6 3 7 "   D a t a T y p e = " T e x t " > C o m p a n y I n f o r m a t i o n _ R o w 8 < / C o m p a n y I n f o r m a t i o n _ R o w 8 > + 
+         < C o m p a n y L o g o   E l e m e n t T y p e = " C o l u m n "   E l e m e n t I d = " 2 3 7 6 9 1 5 1 "   D a t a T y p e = " B l o b " / > + 
+         < E m a i l L a b e l   E l e m e n t T y p e = " C o l u m n "   E l e m e n t I d = " 7 7 1 8 8 7 1 3 5 "   D a t a T y p e = " T e x t " > E m a i l L a b e l < / E m a i l L a b e l > + 
+         < E m a i l V a l u e   E l e m e n t T y p e = " C o l u m n "   E l e m e n t I d = " 3 8 8 1 2 2 7 6 2 "   D a t a T y p e = " T e x t " > E m a i l V a l u e < / E m a i l V a l u e > + 
+         < F i n i s h e d B y N a m e L a b e l   E l e m e n t T y p e = " C o l u m n "   E l e m e n t I d = " 2 1 0 1 0 0 9 6 5 1 "   D a t a T y p e = " T e x t " > F i n i s h e d B y N a m e L a b e l < / F i n i s h e d B y N a m e L a b e l > + 
+         < F i n i s h e d B y S i g n a t u r e L a b e l   E l e m e n t T y p e = " C o l u m n "   E l e m e n t I d = " 2 0 7 1 3 1 2 7 2 2 "   D a t a T y p e = " T e x t " > F i n i s h e d B y S i g n a t u r e L a b e l < / F i n i s h e d B y S i g n a t u r e L a b e l > + 
+         < H o m e P a g e L a b e l   E l e m e n t T y p e = " C o l u m n "   E l e m e n t I d = " 4 6 2 3 7 4 2 3 1 "   D a t a T y p e = " T e x t " > H o m e P a g e L a b e l < / H o m e P a g e L a b e l > + 
+         < H o m e P a g e V a l u e   E l e m e n t T y p e = " C o l u m n "   E l e m e n t I d = " 5 3 3 5 1 4 0 3 4 "   D a t a T y p e = " T e x t " > H o m e P a g e V a l u e < / H o m e P a g e V a l u e > + 
+         < I n s p e c t i o n I n f o r m a t i o n   E l e m e n t T y p e = " C o l u m n "   E l e m e n t I d = " 1 5 3 2 8 6 0 1 9 9 "   D a t a T y p e = " T e x t " > I n s p e c t i o n I n f o r m a t i o n < / I n s p e c t i o n I n f o r m a t i o n > + 
+         < I t e m D e s c r i p t i o n   E l e m e n t T y p e = " C o l u m n "   E l e m e n t I d = " 1 9 6 5 3 9 3 7 9 0 "   D a t a T y p e = " T e x t " > I t e m D e s c r i p t i o n < / I t e m D e s c r i p t i o n > + 
+         < I t e m T r a c k i n g D e s c r i p t i o n   E l e m e n t T y p e = " C o l u m n "   E l e m e n t I d = " 1 1 1 7 1 0 3 3 4 5 "   D a t a T y p e = " T e x t " > I t e m T r a c k i n g D e s c r i p t i o n < / I t e m T r a c k i n g D e s c r i p t i o n > + 
+         < P h o n e N o L a b e l   E l e m e n t T y p e = " C o l u m n "   E l e m e n t I d = " 1 6 1 4 5 2 6 0 7 8 "   D a t a T y p e = " T e x t " > P h o n e N o L a b e l < / P h o n e N o L a b e l > + 
+         < P h o n e N o V a l u e   E l e m e n t T y p e = " C o l u m n "   E l e m e n t I d = " 1 2 8 6 6 4 9 7 8 1 "   D a t a T y p e = " T e x t " > P h o n e N o V a l u e < / P h o n e N o V a l u e > + 
+         < Q l t y I n s p e c t i o n T e m p l a t e _ D e s c r i p t i o n   E l e m e n t T y p e = " C o l u m n "   E l e m e n t I d = " 1 6 5 2 0 6 9 5 9 8 "   D a t a T y p e = " T e x t " > Q l t y I n s p e c t i o n T e m p l a t e _ D e s c r i p t i o n < / Q l t y I n s p e c t i o n T e m p l a t e _ D e s c r i p t i o n > + 
+         < Q l t y I n s p e c t i o n _ A p p r o v e r _ N a m e   E l e m e n t T y p e = " C o l u m n "   E l e m e n t I d = " 2 0 5 9 0 7 9 3 2 1 "   D a t a T y p e = " T e x t " > Q l t y I n s p e c t i o n _ A p p r o v e r _ N a m e < / Q l t y I n s p e c t i o n _ A p p r o v e r _ N a m e > + 
+         < Q l t y I n s p e c t i o n _ A p p r o v e r _ T i t l e   E l e m e n t T y p e = " C o l u m n "   E l e m e n t I d = " 4 7 5 7 2 7 8 9 8 "   D a t a T y p e = " T e x t " > Q l t y I n s p e c t i o n _ A p p r o v e r _ T i t l e < / Q l t y I n s p e c t i o n _ A p p r o v e r _ T i t l e > + 
+         < Q l t y I n s p e c t i o n _ D e s c r i p t i o n   E l e m e n t T y p e = " C o l u m n "   E l e m e n t I d = " 7 3 9 0 1 9 9 1 0 "   D a t a T y p e = " T e x t " > Q l t y I n s p e c t i o n _ D e s c r i p t i o n < / Q l t y I n s p e c t i o n _ D e s c r i p t i o n > + 
+         < Q l t y I n s p e c t i o n _ F i n i s h e d _ B y _ E m a i l   E l e m e n t T y p e = " C o l u m n "   E l e m e n t I d = " 1 5 2 1 1 3 4 6 3 1 "   D a t a T y p e = " T e x t " > Q l t y I n s p e c t i o n _ F i n i s h e d _ B y _ E m a i l < / Q l t y I n s p e c t i o n _ F i n i s h e d _ B y _ E m a i l > + 
+         < Q l t y I n s p e c t i o n _ F i n i s h e d _ B y _ P h o n e   E l e m e n t T y p e = " C o l u m n "   E l e m e n t I d = " 3 4 7 5 5 7 6 2 5 "   D a t a T y p e = " T e x t " > Q l t y I n s p e c t i o n _ F i n i s h e d _ B y _ P h o n e < / Q l t y I n s p e c t i o n _ F i n i s h e d _ B y _ P h o n e > + 
+         < Q l t y I n s p e c t i o n _ F i n i s h e d _ B y _ T i t l e   E l e m e n t T y p e = " C o l u m n "   E l e m e n t I d = " 4 6 0 0 4 5 6 8 3 "   D a t a T y p e = " T e x t " > Q l t y I n s p e c t i o n _ F i n i s h e d _ B y _ T i t l e < / Q l t y I n s p e c t i o n _ F i n i s h e d _ B y _ T i t l e > + 
+         < Q l t y I n s p e c t i o n _ F i n i s h e d _ B y _ U s e r N a m e   E l e m e n t T y p e = " C o l u m n "   E l e m e n t I d = " 1 9 5 3 6 1 2 5 3 1 "   D a t a T y p e = " T e x t " > Q l t y I n s p e c t i o n _ F i n i s h e d _ B y _ U s e r N a m e < / Q l t y I n s p e c t i o n _ F i n i s h e d _ B y _ U s e r N a m e > + 
+         < Q l t y I n s p e c t i o n _ F i n i s h e d _ B y _ U s e r _ I D   E l e m e n t T y p e = " C o l u m n "   E l e m e n t I d = " 1 7 5 0 5 1 6 3 3 8 "   D a t a T y p e = " C o d e " > Q l t y I n s p e c t i o n _ F i n i s h e d _ B y _ U s e r _ I D < / Q l t y I n s p e c t i o n _ F i n i s h e d _ B y _ U s e r _ I D > + 
+         < Q l t y I n s p e c t i o n _ F i n i s h e d _ D a t e   E l e m e n t T y p e = " C o l u m n "   E l e m e n t I d = " 1 8 3 4 1 2 2 7 6 5 "   D a t a T y p e = " D a t e T i m e " > Q l t y I n s p e c t i o n _ F i n i s h e d _ D a t e < / Q l t y I n s p e c t i o n _ F i n i s h e d _ D a t e > + 
+         < Q l t y I n s p e c t i o n _ N o   E l e m e n t T y p e = " C o l u m n "   E l e m e n t I d = " 2 1 2 0 6 1 5 7 4 9 "   D a t a T y p e = " C o d e " > Q l t y I n s p e c t i o n _ N o < / Q l t y I n s p e c t i o n _ N o > + 
+         < Q l t y I n s p e c t i o n _ R e i n s p e c t i o n N o   E l e m e n t T y p e = " C o l u m n "   E l e m e n t I d = " 7 5 1 7 3 5 6 "   D a t a T y p e = " I n t e g e r " > Q l t y I n s p e c t i o n _ R e i n s p e c t i o n N o < / Q l t y I n s p e c t i o n _ R e i n s p e c t i o n N o > + 
+         < Q l t y I n s p e c t i o n _ R e s u l t _ C o d e   E l e m e n t T y p e = " C o l u m n "   E l e m e n t I d = " 1 8 0 7 0 7 7 0 6 5 "   D a t a T y p e = " C o d e " > Q l t y I n s p e c t i o n _ R e s u l t _ C o d e < / Q l t y I n s p e c t i o n _ R e s u l t _ C o d e > + 
+         < Q l t y I n s p e c t i o n _ R e s u l t _ D e s c r i p t i o n   E l e m e n t T y p e = " C o l u m n "   E l e m e n t I d = " 8 1 0 5 3 8 1 8 8 "   D a t a T y p e = " T e x t " > Q l t y I n s p e c t i o n _ R e s u l t _ D e s c r i p t i o n < / Q l t y I n s p e c t i o n _ R e s u l t _ D e s c r i p t i o n > + 
+         < Q l t y I n s p e c t i o n _ S o u r c e _ C u s t o m _ 1   E l e m e n t T y p e = " C o l u m n "   E l e m e n t I d = " 5 4 6 4 5 3 7 6 5 "   D a t a T y p e = " T e x t " > Q l t y I n s p e c t i o n _ S o u r c e _ C u s t o m _ 1 < / Q l t y I n s p e c t i o n _ S o u r c e _ C u s t o m _ 1 > + 
+         < Q l t y I n s p e c t i o n _ S o u r c e _ C u s t o m _ 1 0   E l e m e n t T y p e = " C o l u m n "   E l e m e n t I d = " 1 5 3 7 6 5 2 9 2 5 "   D a t a T y p e = " D e c i m a l " > Q l t y I n s p e c t i o n _ S o u r c e _ C u s t o m _ 1 0 < / Q l t y I n s p e c t i o n _ S o u r c e _ C u s t o m _ 1 0 > + 
+         < Q l t y I n s p e c t i o n _ S o u r c e _ C u s t o m _ 2   E l e m e n t T y p e = " C o l u m n "   E l e m e n t I d = " 1 8 3 5 4 2 3 6 8 0 "   D a t a T y p e = " T e x t " > Q l t y I n s p e c t i o n _ S o u r c e _ C u s t o m _ 2 < / Q l t y I n s p e c t i o n _ S o u r c e _ C u s t o m _ 2 > + 
+         < Q l t y I n s p e c t i o n _ S o u r c e _ C u s t o m _ 3   E l e m e n t T y p e = " C o l u m n "   E l e m e n t I d = " 1 8 2 1 8 4 6 9 9 9 "   D a t a T y p e = " T e x t " > Q l t y I n s p e c t i o n _ S o u r c e _ C u s t o m _ 3 < / Q l t y I n s p e c t i o n _ S o u r c e _ C u s t o m _ 3 > + 
+         < Q l t y I n s p e c t i o n _ S o u r c e _ C u s t o m _ 4   E l e m e n t T y p e = " C o l u m n "   E l e m e n t I d = " 1 3 6 6 6 3 6 0 8 6 "   D a t a T y p e = " T e x t " > Q l t y I n s p e c t i o n _ S o u r c e _ C u s t o m _ 4 < / Q l t y I n s p e c t i o n _ S o u r c e _ C u s t o m _ 4 > + 
+         < Q l t y I n s p e c t i o n _ S o u r c e _ C u s t o m _ 5   E l e m e n t T y p e = " C o l u m n "   E l e m e n t I d = " 2 0 0 4 3 3 2 7 0 3 "   D a t a T y p e = " T e x t " > Q l t y I n s p e c t i o n _ S o u r c e _ C u s t o m _ 5 < / Q l t y I n s p e c t i o n _ S o u r c e _ C u s t o m _ 5 > + 
+         < Q l t y I n s p e c t i o n _ S o u r c e _ C u s t o m _ 6   E l e m e n t T y p e = " C o l u m n "   E l e m e n t I d = " 9 1 2 4 2 8 5 2 "   D a t a T y p e = " T e x t " > Q l t y I n s p e c t i o n _ S o u r c e _ C u s t o m _ 6 < / Q l t y I n s p e c t i o n _ S o u r c e _ C u s t o m _ 6 > + 
+         < Q l t y I n s p e c t i o n _ S o u r c e _ C u s t o m _ 7   E l e m e n t T y p e = " C o l u m n "   E l e m e n t I d = " 7 2 8 9 3 9 4 6 9 "   D a t a T y p e = " I n t e g e r " > Q l t y I n s p e c t i o n _ S o u r c e _ C u s t o m _ 7 < / Q l t y I n s p e c t i o n _ S o u r c e _ C u s t o m _ 7 > + 
+         < Q l t y I n s p e c t i o n _ S o u r c e _ C u s t o m _ 8   E l e m e n t T y p e = " C o l u m n "   E l e m e n t I d = " 3 7 7 5 4 4 7 4 2 "   D a t a T y p e = " I n t e g e r " > Q l t y I n s p e c t i o n _ S o u r c e _ C u s t o m _ 8 < / Q l t y I n s p e c t i o n _ S o u r c e _ C u s t o m _ 8 > + 
+         < Q l t y I n s p e c t i o n _ S o u r c e _ C u s t o m _ 9   E l e m e n t T y p e = " C o l u m n "   E l e m e n t I d = " 2 6 0 1 5 1 8 7 5 "   D a t a T y p e = " D e c i m a l " > Q l t y I n s p e c t i o n _ S o u r c e _ C u s t o m _ 9 < / Q l t y I n s p e c t i o n _ S o u r c e _ C u s t o m _ 9 > + 
+         < Q l t y I n s p e c t i o n _ S o u r c e _ D o c u m e n t _ N o _   E l e m e n t T y p e = " C o l u m n "   E l e m e n t I d = " 1 6 7 5 9 1 6 2 8 8 "   D a t a T y p e = " C o d e " > Q l t y I n s p e c t i o n _ S o u r c e _ D o c u m e n t _ N o _ < / Q l t y I n s p e c t i o n _ S o u r c e _ D o c u m e n t _ N o _ > + 
+         < Q l t y I n s p e c t i o n _ S o u r c e _ I t e m _ D e s c r i p t i o n   E l e m e n t T y p e = " C o l u m n "   E l e m e n t I d = " 6 4 6 8 9 0 6 3 0 "   D a t a T y p e = " T e x t " > Q l t y I n s p e c t i o n _ S o u r c e _ I t e m _ D e s c r i p t i o n < / Q l t y I n s p e c t i o n _ S o u r c e _ I t e m _ D e s c r i p t i o n > + 
+         < Q l t y I n s p e c t i o n _ S o u r c e _ I t e m _ D e s c r i p t i o n 2   E l e m e n t T y p e = " C o l u m n "   E l e m e n t I d = " 1 2 7 9 3 6 9 3 5 2 "   D a t a T y p e = " T e x t " > Q l t y I n s p e c t i o n _ S o u r c e _ I t e m _ D e s c r i p t i o n 2 < / Q l t y I n s p e c t i o n _ S o u r c e _ I t e m _ D e s c r i p t i o n 2 > + 
+         < Q l t y I n s p e c t i o n _ S o u r c e _ I t e m _ N o _   E l e m e n t T y p e = " C o l u m n "   E l e m e n t I d = " 1 2 6 8 0 5 0 5 1 8 "   D a t a T y p e = " C o d e " > Q l t y I n s p e c t i o n _ S o u r c e _ I t e m _ N o _ < / Q l t y I n s p e c t i o n _ S o u r c e _ I t e m _ N o _ > + 
+         < Q l t y I n s p e c t i o n _ S o u r c e _ L o t _ N o _   E l e m e n t T y p e = " C o l u m n "   E l e m e n t I d = " 1 1 2 3 5 5 1 3 1 2 "   D a t a T y p e = " C o d e " > Q l t y I n s p e c t i o n _ S o u r c e _ L o t _ N o _ < / Q l t y I n s p e c t i o n _ S o u r c e _ L o t _ N o _ > + 
+         < Q l t y I n s p e c t i o n _ S o u r c e _ P a c k a g e _ N o _   E l e m e n t T y p e = " C o l u m n "   E l e m e n t I d = " 1 9 6 1 1 2 9 9 7 "   D a t a T y p e = " C o d e " > Q l t y I n s p e c t i o n _ S o u r c e _ P a c k a g e _ N o _ < / Q l t y I n s p e c t i o n _ S o u r c e _ P a c k a g e _ N o _ > + 
+         < Q l t y I n s p e c t i o n _ S o u r c e _ S e r i a l _ N o _   E l e m e n t T y p e = " C o l u m n "   E l e m e n t I d = " 1 5 2 0 5 9 1 4 4 7 "   D a t a T y p e = " C o d e " > Q l t y I n s p e c t i o n _ S o u r c e _ S e r i a l _ N o _ < / Q l t y I n s p e c t i o n _ S o u r c e _ S e r i a l _ N o _ > + 
+         < Q l t y I n s p e c t i o n _ S o u r c e _ T a s k _ N o _   E l e m e n t T y p e = " C o l u m n "   E l e m e n t I d = " 3 8 4 6 4 4 1 8 2 "   D a t a T y p e = " C o d e " > Q l t y I n s p e c t i o n _ S o u r c e _ T a s k _ N o _ < / Q l t y I n s p e c t i o n _ S o u r c e _ T a s k _ N o _ > + 
+         < Q l t y I n s p e c t i o n _ S o u r c e _ V a r i a n t _ C o d e   E l e m e n t T y p e = " C o l u m n "   E l e m e n t I d = " 1 6 0 8 4 0 3 8 2 1 "   D a t a T y p e = " C o d e " > Q l t y I n s p e c t i o n _ S o u r c e _ V a r i a n t _ C o d e < / Q l t y I n s p e c t i o n _ S o u r c e _ V a r i a n t _ C o d e > + 
+         < Q l t y I n s p e c t i o n _ S t a t u s   E l e m e n t T y p e = " C o l u m n "   E l e m e n t I d = " 8 5 1 7 5 2 7 6 8 "   D a t a T y p e = " E n u m " > Q l t y I n s p e c t i o n _ S t a t u s < / Q l t y I n s p e c t i o n _ S t a t u s > + 
+         < R e i n s p e c t i o n S e q u e n c e I n f o r m a t i o n   E l e m e n t T y p e = " C o l u m n "   E l e m e n t I d = " 7 4 9 5 1 6 5 4 3 "   D a t a T y p e = " T e x t " > R e i n s p e c t i o n S e q u e n c e I n f o r m a t i o n < / R e i n s p e c t i o n S e q u e n c e I n f o r m a t i o n > + 
+         < C u r r e n t I n s p e c t i o n L i n e   E l e m e n t T y p e = " D a t a I t e m "   E l e m e n t I d = " 1 1 9 3 2 1 9 5 9 6 " > + 
+             < C a r r i a g e R e t u r n P e r s o n F i e l d D e t a i l s   E l e m e n t T y p e = " C o l u m n "   E l e m e n t I d = " 9 9 8 2 6 3 6 9 8 "   D a t a T y p e = " T e x t " > C a r r i a g e R e t u r n P e r s o n F i e l d D e t a i l s < / C a r r i a g e R e t u r n P e r s o n F i e l d D e t a i l s > + 
+             < C o n d i t i o n L a b e l _ 1   E l e m e n t T y p e = " C o l u m n "   E l e m e n t I d = " 1 2 2 7 8 8 1 1 9 4 "   D a t a T y p e = " T e x t " > C o n d i t i o n L a b e l _ 1 < / C o n d i t i o n L a b e l _ 1 > + 
+             < C o n d i t i o n L a b e l _ 2   E l e m e n t T y p e = " C o l u m n "   E l e m e n t I d = " 1 8 6 5 5 7 7 8 1 1 "   D a t a T y p e = " T e x t " > C o n d i t i o n L a b e l _ 2 < / C o n d i t i o n L a b e l _ 2 > + 
+             < F i e l d _ C o d e   E l e m e n t T y p e = " C o l u m n "   E l e m e n t I d = " 1 3 2 7 2 5 5 7 3 "   D a t a T y p e = " C o d e " > F i e l d _ C o d e < / F i e l d _ C o d e > + 
+             < F i e l d _ D e s c r i p t i o n   E l e m e n t T y p e = " C o l u m n "   E l e m e n t I d = " 1 4 6 8 6 2 1 2 9 8 "   D a t a T y p e = " T e x t " > F i e l d _ D e s c r i p t i o n < / F i e l d _ D e s c r i p t i o n > + 
+             < F i e l d _ E n t e r e d B y N a m e A n d T i m e s t a m p   E l e m e n t T y p e = " C o l u m n "   E l e m e n t I d = " 1 0 6 8 4 2 0 5 9 2 "   D a t a T y p e = " T e x t " > F i e l d _ E n t e r e d B y N a m e A n d T i m e s t a m p < / F i e l d _ E n t e r e d B y N a m e A n d T i m e s t a m p > + 
+             < F i e l d _ H a s E n t e r e d V a l u e   E l e m e n t T y p e = " C o l u m n "   E l e m e n t I d = " 1 7 1 6 2 6 5 8 2 4 "   D a t a T y p e = " B o o l e a n " > F i e l d _ H a s E n t e r e d V a l u e < / F i e l d _ H a s E n t e r e d V a l u e > + 
+             < F i e l d _ I f P e r s o n E m a i l   E l e m e n t T y p e = " C o l u m n "   E l e m e n t I d = " 1 3 4 6 0 5 7 6 5 0 "   D a t a T y p e = " T e x t " > F i e l d _ I f P e r s o n E m a i l < / F i e l d _ I f P e r s o n E m a i l > + 
+             < F i e l d _ I f P e r s o n N a m e   E l e m e n t T y p e = " C o l u m n "   E l e m e n t I d = " 4 1 4 7 0 2 4 4 3 "   D a t a T y p e = " T e x t " > F i e l d _ I f P e r s o n N a m e < / F i e l d _ I f P e r s o n N a m e > + 
+             < F i e l d _ I f P e r s o n P h o n e   E l e m e n t T y p e = " C o l u m n "   E l e m e n t I d = " 1 9 7 4 1 8 8 4 6 2 "   D a t a T y p e = " T e x t " > F i e l d _ I f P e r s o n P h o n e < / F i e l d _ I f P e r s o n P h o n e > + 
+             < F i e l d _ I f P e r s o n T i t l e   E l e m e n t T y p e = " C o l u m n "   E l e m e n t I d = " 1 0 0 4 6 0 9 5 4 2 "   D a t a T y p e = " T e x t " > F i e l d _ I f P e r s o n T i t l e < / F i e l d _ I f P e r s o n T i t l e > + 
+             < F i e l d _ I s L a b e l   E l e m e n t T y p e = " C o l u m n "   E l e m e n t I d = " 2 0 4 3 1 9 3 9 4 0 "   D a t a T y p e = " B o o l e a n " > F i e l d _ I s L a b e l < / F i e l d _ I s L a b e l > + 
+             < F i e l d _ I s P e r s o n F i e l d   E l e m e n t T y p e = " C o l u m n "   E l e m e n t I d = " 4 3 4 5 4 6 6 1 1 "   D a t a T y p e = " B o o l e a n " > F i e l d _ I s P e r s o n F i e l d < / F i e l d _ I s P e r s o n F i e l d > + 
+             < F i e l d _ I s T e x t   E l e m e n t T y p e = " C o l u m n "   E l e m e n t I d = " 5 9 3 6 9 2 0 1 "   D a t a T y p e = " B o o l e a n " > F i e l d _ I s T e x t < / F i e l d _ I s T e x t > + 
+             < F i e l d _ L i n e C o m m e n t a r y   E l e m e n t T y p e = " C o l u m n "   E l e m e n t I d = " 1 8 5 3 8 0 0 2 5 7 "   D a t a T y p e = " T e x t " > F i e l d _ L i n e C o m m e n t a r y < / F i e l d _ L i n e C o m m e n t a r y > + 
+             < F i e l d _ M o d i f i e d B y U s e r E m a i l   E l e m e n t T y p e = " C o l u m n "   E l e m e n t I d = " 2 0 5 3 4 9 0 5 4 5 "   D a t a T y p e = " T e x t " > F i e l d _ M o d i f i e d B y U s e r E m a i l < / F i e l d _ M o d i f i e d B y U s e r E m a i l > + 
+             < F i e l d _ M o d i f i e d B y U s e r I D   E l e m e n t T y p e = " C o l u m n "   E l e m e n t I d = " 1 3 6 3 9 8 7 2 2 2 "   D a t a T y p e = " C o d e " > F i e l d _ M o d i f i e d B y U s e r I D < / F i e l d _ M o d i f i e d B y U s e r I D > + 
+             < F i e l d _ M o d i f i e d B y U s e r J o b T i t l e   E l e m e n t T y p e = " C o l u m n "   E l e m e n t I d = " 7 1 3 3 5 4 3 4 0 "   D a t a T y p e = " T e x t " > F i e l d _ M o d i f i e d B y U s e r J o b T i t l e < / F i e l d _ M o d i f i e d B y U s e r J o b T i t l e > + 
+             < F i e l d _ M o d i f i e d B y U s e r N a m e   E l e m e n t T y p e = " C o l u m n "   E l e m e n t I d = " 7 9 8 2 2 1 9 1 6 "   D a t a T y p e = " T e x t " > F i e l d _ M o d i f i e d B y U s e r N a m e < / F i e l d _ M o d i f i e d B y U s e r N a m e > + 
+             < F i e l d _ M o d i f i e d B y U s e r P h o n e   E l e m e n t T y p e = " C o l u m n "   E l e m e n t I d = " 1 2 9 4 9 7 8 5 4 5 "   D a t a T y p e = " T e x t " > F i e l d _ M o d i f i e d B y U s e r P h o n e < / F i e l d _ M o d i f i e d B y U s e r P h o n e > + 
+             < F i e l d _ M o d i f i e d D a t e T i m e   E l e m e n t T y p e = " C o l u m n "   E l e m e n t I d = " 1 6 5 4 4 9 3 6 9 6 "   D a t a T y p e = " D a t e T i m e " > F i e l d _ M o d i f i e d D a t e T i m e < / F i e l d _ M o d i f i e d D a t e T i m e > + 
+             < F i e l d _ T y p e   E l e m e n t T y p e = " C o l u m n "   E l e m e n t I d = " 1 3 2 8 1 6 4 0 1 6 "   D a t a T y p e = " E n u m " > F i e l d _ T y p e < / F i e l d _ T y p e > + 
+             < I f P e r s o n D e s c r i p t i o n   E l e m e n t T y p e = " C o l u m n "   E l e m e n t I d = " 1 9 0 1 4 5 5 0 2 5 "   D a t a T y p e = " T e x t " > I f P e r s o n D e s c r i p t i o n < / I f P e r s o n D e s c r i p t i o n > + 
+             < I f P e r s o n M o d i f i e d B y U s e r E m a i l   E l e m e n t T y p e = " C o l u m n "   E l e m e n t I d = " 4 4 0 5 4 0 4 6 4 "   D a t a T y p e = " T e x t " > I f P e r s o n M o d i f i e d B y U s e r E m a i l < / I f P e r s o n M o d i f i e d B y U s e r E m a i l > + 
+             < I f P e r s o n M o d i f i e d D a t e T i m e   E l e m e n t T y p e = " C o l u m n "   E l e m e n t I d = " 8 1 4 8 1 3 6 2 3 "   D a t a T y p e = " T e x t " > I f P e r s o n M o d i f i e d D a t e T i m e < / I f P e r s o n M o d i f i e d D a t e T i m e > + 
+             < L a b e l F i e l d _ D e s c r i p t i o n   E l e m e n t T y p e = " C o l u m n "   E l e m e n t I d = " 3 2 9 5 4 9 8 4 0 "   D a t a T y p e = " T e x t " > L a b e l F i e l d _ D e s c r i p t i o n < / L a b e l F i e l d _ D e s c r i p t i o n > + 
+             < N u m e r i c _ V a l u e   E l e m e n t T y p e = " C o l u m n "   E l e m e n t I d = " 4 6 0 4 1 2 6 4 6 "   D a t a T y p e = " D e c i m a l " > N u m e r i c _ V a l u e < / N u m e r i c _ V a l u e > + 
+             < P r o m p t e d R e s u l t C a p t i o n _ 1   E l e m e n t T y p e = " C o l u m n "   E l e m e n t I d = " 1 5 4 8 2 0 5 1 6 9 "   D a t a T y p e = " T e x t " > P r o m p t e d R e s u l t C a p t i o n _ 1 < / P r o m p t e d R e s u l t C a p t i o n _ 1 > + 
+             < P r o m p t e d R e s u l t C a p t i o n _ 1 0   E l e m e n t T y p e = " C o l u m n "   E l e m e n t I d = " 6 6 5 1 3 7 3 2 1 "   D a t a T y p e = " T e x t " > P r o m p t e d R e s u l t C a p t i o n _ 1 0 < / P r o m p t e d R e s u l t C a p t i o n _ 1 0 > + 
+             < P r o m p t e d R e s u l t C a p t i o n _ 2   E l e m e n t T y p e = " C o l u m n "   E l e m e n t I d = " 2 1 0 9 0 6 5 5 1 0 "   D a t a T y p e = " T e x t " > P r o m p t e d R e s u l t C a p t i o n _ 2 < / P r o m p t e d R e s u l t C a p t i o n _ 2 > + 
+             < P r o m p t e d R e s u l t C a p t i o n _ 3   E l e m e n t T y p e = " C o l u m n "   E l e m e n t I d = " 1 4 7 1 3 6 8 8 9 3 "   D a t a T y p e = " T e x t " > P r o m p t e d R e s u l t C a p t i o n _ 3 < / P r o m p t e d R e s u l t C a p t i o n _ 3 > + 
+             < P r o m p t e d R e s u l t C a p t i o n _ 4   E l e m e n t T y p e = " C o l u m n "   E l e m e n t I d = " 8 3 3 6 7 2 2 7 6 "   D a t a T y p e = " T e x t " > P r o m p t e d R e s u l t C a p t i o n _ 4 < / P r o m p t e d R e s u l t C a p t i o n _ 4 > + 
+             < P r o m p t e d R e s u l t C a p t i o n _ 5   E l e m e n t T y p e = " C o l u m n "   E l e m e n t I d = " 1 9 5 9 7 5 6 5 9 "   D a t a T y p e = " T e x t " > P r o m p t e d R e s u l t C a p t i o n _ 5 < / P r o m p t e d R e s u l t C a p t i o n _ 5 > + 
+             < P r o m p t e d R e s u l t C a p t i o n _ 6   E l e m e n t T y p e = " C o l u m n "   E l e m e n t I d = " 4 4 1 7 2 0 9 5 8 "   D a t a T y p e = " T e x t " > P r o m p t e d R e s u l t C a p t i o n _ 6 < / P r o m p t e d R e s u l t C a p t i o n _ 6 > + 
+             < P r o m p t e d R e s u l t C a p t i o n _ 7   E l e m e n t T y p e = " C o l u m n "   E l e m e n t I d = " 1 0 7 9 4 1 7 5 7 5 "   D a t a T y p e = " T e x t " > P r o m p t e d R e s u l t C a p t i o n _ 7 < / P r o m p t e d R e s u l t C a p t i o n _ 7 > + 
+             < P r o m p t e d R e s u l t C a p t i o n _ 8   E l e m e n t T y p e = " C o l u m n "   E l e m e n t I d = " 1 0 3 9 0 2 9 1 2 "   D a t a T y p e = " T e x t " > P r o m p t e d R e s u l t C a p t i o n _ 8 < / P r o m p t e d R e s u l t C a p t i o n _ 8 > + 
+             < P r o m p t e d R e s u l t C a p t i o n _ 9   E l e m e n t T y p e = " C o l u m n "   E l e m e n t I d = " 7 4 1 5 9 9 5 2 9 "   D a t a T y p e = " T e x t " > P r o m p t e d R e s u l t C a p t i o n _ 9 < / P r o m p t e d R e s u l t C a p t i o n _ 9 > + 
+             < P r o m p t e d R e s u l t C o n d i t i o n D e s c r i p t i o n _ 1   E l e m e n t T y p e = " C o l u m n "   E l e m e n t I d = " 1 7 7 6 7 4 4 4 3 4 "   D a t a T y p e = " T e x t " > P r o m p t e d R e s u l t C o n d i t i o n D e s c r i p t i o n _ 1 < / P r o m p t e d R e s u l t C o n d i t i o n D e s c r i p t i o n _ 1 > + 
+             < P r o m p t e d R e s u l t C o n d i t i o n D e s c r i p t i o n _ 1 0   E l e m e n t T y p e = " C o l u m n "   E l e m e n t I d = " 1 0 2 8 7 8 8 8 8 2 "   D a t a T y p e = " T e x t " > P r o m p t e d R e s u l t C o n d i t i o n D e s c r i p t i o n _ 1 0 < / P r o m p t e d R e s u l t C o n d i t i o n D e s c r i p t i o n _ 1 0 > + 
+             < P r o m p t e d R e s u l t C o n d i t i o n D e s c r i p t i o n _ 2   E l e m e n t T y p e = " C o l u m n "   E l e m e n t I d = " 1 1 3 9 0 4 7 8 1 7 "   D a t a T y p e = " T e x t " > P r o m p t e d R e s u l t C o n d i t i o n D e s c r i p t i o n _ 2 < / P r o m p t e d R e s u l t C o n d i t i o n D e s c r i p t i o n _ 2 > + 
+             < P r o m p t e d R e s u l t C o n d i t i o n D e s c r i p t i o n _ 3   E l e m e n t T y p e = " C o l u m n "   E l e m e n t I d = " 5 0 1 3 5 1 2 0 0 "   D a t a T y p e = " T e x t " > P r o m p t e d R e s u l t C o n d i t i o n D e s c r i p t i o n _ 3 < / P r o m p t e d R e s u l t C o n d i t i o n D e s c r i p t i o n _ 3 > + 
+             < P r o m p t e d R e s u l t C o n d i t i o n D e s c r i p t i o n _ 4   E l e m e n t T y p e = " C o l u m n "   E l e m e n t I d = " 6 7 0 2 6 0 2 2 3 "   D a t a T y p e = " T e x t " > P r o m p t e d R e s u l t C o n d i t i o n D e s c r i p t i o n _ 4 < / P r o m p t e d R e s u l t C o n d i t i o n D e s c r i p t i o n _ 4 > + 
+             < P r o m p t e d R e s u l t C o n d i t i o n D e s c r i p t i o n _ 5   E l e m e n t T y p e = " C o l u m n "   E l e m e n t I d = " 3 2 5 6 3 6 0 6 "   D a t a T y p e = " T e x t " > P r o m p t e d R e s u l t C o n d i t i o n D e s c r i p t i o n _ 5 < / P r o m p t e d R e s u l t C o n d i t i o n D e s c r i p t i o n _ 5 > + 
+             < P r o m p t e d R e s u l t C o n d i t i o n D e s c r i p t i o n _ 6   E l e m e n t T y p e = " C o l u m n "   E l e m e n t I d = " 6 0 5 1 3 3 0 1 1 "   D a t a T y p e = " T e x t " > P r o m p t e d R e s u l t C o n d i t i o n D e s c r i p t i o n _ 6 < / P r o m p t e d R e s u l t C o n d i t i o n D e s c r i p t i o n _ 6 > + 
+             < P r o m p t e d R e s u l t C o n d i t i o n D e s c r i p t i o n _ 7   E l e m e n t T y p e = " C o l u m n "   E l e m e n t I d = " 1 2 4 2 8 2 9 6 2 8 "   D a t a T y p e = " T e x t " > P r o m p t e d R e s u l t C o n d i t i o n D e s c r i p t i o n _ 7 < / P r o m p t e d R e s u l t C o n d i t i o n D e s c r i p t i o n _ 7 > + 
+             < P r o m p t e d R e s u l t C o n d i t i o n D e s c r i p t i o n _ 8   E l e m e n t T y p e = " C o l u m n "   E l e m e n t I d = " 1 0 7 3 9 2 0 6 0 5 "   D a t a T y p e = " T e x t " > P r o m p t e d R e s u l t C o n d i t i o n D e s c r i p t i o n _ 8 < / P r o m p t e d R e s u l t C o n d i t i o n D e s c r i p t i o n _ 8 > + 
+             < P r o m p t e d R e s u l t C o n d i t i o n D e s c r i p t i o n _ 9   E l e m e n t T y p e = " C o l u m n "   E l e m e n t I d = " 1 7 1 1 6 1 7 2 2 2 "   D a t a T y p e = " T e x t " > P r o m p t e d R e s u l t C o n d i t i o n D e s c r i p t i o n _ 9 < / P r o m p t e d R e s u l t C o n d i t i o n D e s c r i p t i o n _ 9 > + 
+             < P r o m p t e d R e s u l t V i s i b l e _ 1   E l e m e n t T y p e = " C o l u m n "   E l e m e n t I d = " 1 3 9 9 7 0 4 4 1 7 "   D a t a T y p e = " B o o l e a n " > P r o m p t e d R e s u l t V i s i b l e _ 1 < / P r o m p t e d R e s u l t V i s i b l e _ 1 > + 
+             < P r o m p t e d R e s u l t V i s i b l e _ 1 0   E l e m e n t T y p e = " C o l u m n "   E l e m e n t I d = " 6 6 3 6 8 2 6 1 7 "   D a t a T y p e = " B o o l e a n " > P r o m p t e d R e s u l t V i s i b l e _ 1 0 < / P r o m p t e d R e s u l t V i s i b l e _ 1 0 > + 
+             < P r o m p t e d R e s u l t V i s i b l e _ 2   E l e m e n t T y p e = " C o l u m n "   E l e m e n t I d = " 2 0 3 7 4 0 1 0 3 4 "   D a t a T y p e = " B o o l e a n " > P r o m p t e d R e s u l t V i s i b l e _ 2 < / P r o m p t e d R e s u l t V i s i b l e _ 2 > + 
+             < P r o m p t e d R e s u l t V i s i b l e _ 3   E l e m e n t T y p e = " C o l u m n "   E l e m e n t I d = " 1 6 1 9 8 6 9 6 4 5 "   D a t a T y p e = " B o o l e a n " > P r o m p t e d R e s u l t V i s i b l e _ 3 < / P r o m p t e d R e s u l t V i s i b l e _ 3 > + 
+             < P r o m p t e d R e s u l t V i s i b l e _ 4   E l e m e n t T y p e = " C o l u m n "   E l e m e n t I d = " 9 8 2 1 7 3 0 2 8 "   D a t a T y p e = " B o o l e a n " > P r o m p t e d R e s u l t V i s i b l e _ 4 < / P r o m p t e d R e s u l t V i s i b l e _ 4 > + 
+             < P r o m p t e d R e s u l t V i s i b l e _ 5   E l e m e n t T y p e = " C o l u m n "   E l e m e n t I d = " 3 4 4 4 7 6 4 1 1 "   D a t a T y p e = " B o o l e a n " > P r o m p t e d R e s u l t V i s i b l e _ 5 < / P r o m p t e d R e s u l t V i s i b l e _ 5 > + 
+             < P r o m p t e d R e s u l t V i s i b l e _ 6   E l e m e n t T y p e = " C o l u m n "   E l e m e n t I d = " 2 9 3 2 2 0 2 0 6 "   D a t a T y p e = " B o o l e a n " > P r o m p t e d R e s u l t V i s i b l e _ 6 < / P r o m p t e d R e s u l t V i s i b l e _ 6 > + 
+             < P r o m p t e d R e s u l t V i s i b l e _ 7   E l e m e n t T y p e = " C o l u m n "   E l e m e n t I d = " 9 3 0 9 1 6 8 2 3 "   D a t a T y p e = " B o o l e a n " > P r o m p t e d R e s u l t V i s i b l e _ 7 < / P r o m p t e d R e s u l t V i s i b l e _ 7 > + 
+             < P r o m p t e d R e s u l t V i s i b l e _ 8   E l e m e n t T y p e = " C o l u m n "   E l e m e n t I d = " 4 4 5 9 7 8 4 0 "   D a t a T y p e = " B o o l e a n " > P r o m p t e d R e s u l t V i s i b l e _ 8 < / P r o m p t e d R e s u l t V i s i b l e _ 8 > + 
+             < P r o m p t e d R e s u l t V i s i b l e _ 9   E l e m e n t T y p e = " C o l u m n "   E l e m e n t I d = " 5 9 3 0 9 8 7 7 7 "   D a t a T y p e = " B o o l e a n " > P r o m p t e d R e s u l t V i s i b l e _ 9 < / P r o m p t e d R e s u l t V i s i b l e _ 9 > + 
+             < T e s t _ R e s u l t   E l e m e n t T y p e = " C o l u m n "   E l e m e n t I d = " 1 2 7 1 0 6 2 1 4 1 "   D a t a T y p e = " C o d e " > T e s t _ R e s u l t < / T e s t _ R e s u l t > + 
+             < T e s t _ R e s u l t D e s c r i p t i o n   E l e m e n t T y p e = " C o l u m n "   E l e m e n t I d = " 1 9 4 3 4 5 8 6 8 5 "   D a t a T y p e = " T e x t " > T e s t _ R e s u l t D e s c r i p t i o n < / T e s t _ R e s u l t D e s c r i p t i o n > + 
+             < T e s t _ V a l u e   E l e m e n t T y p e = " C o l u m n "   E l e m e n t I d = " 8 1 3 5 6 4 5 2 1 "   D a t a T y p e = " T e x t " > T e s t _ V a l u e < / T e s t _ V a l u e > + 
+             < W o r d D e s c r i p t i o n   E l e m e n t T y p e = " C o l u m n "   E l e m e n t I d = " 5 4 4 0 8 2 0 6 7 "   D a t a T y p e = " T e x t " > W o r d D e s c r i p t i o n < / W o r d D e s c r i p t i o n > + 
+             < W o r d M o d i f i e d B y U s e r N a m e   E l e m e n t T y p e = " C o l u m n "   E l e m e n t I d = " 1 6 2 5 9 3 3 4 7 9 "   D a t a T y p e = " T e x t " > W o r d M o d i f i e d B y U s e r N a m e < / W o r d M o d i f i e d B y U s e r N a m e > + 
+             < W o r d M o d i f i e d D a t e T i m e   E l e m e n t T y p e = " C o l u m n "   E l e m e n t I d = " 2 0 8 1 0 1 2 8 7 5 "   D a t a T y p e = " T e x t " > W o r d M o d i f i e d D a t e T i m e < / W o r d M o d i f i e d D a t e T i m e > + 
+             < W o r d T e s t V a l u e   E l e m e n t T y p e = " C o l u m n "   E l e m e n t I d = " 1 4 4 7 8 2 4 1 2 2 "   D a t a T y p e = " T e x t " > W o r d T e s t V a l u e < / W o r d T e s t V a l u e > + 
+         < / C u r r e n t I n s p e c t i o n L i n e > + 
+     < / C u r r e n t I n s p e c t i o n > + 
+ < / N a v W o r d R e p o r t X m l P a r t > 
+</file>
+
+<file path=customXml/item3.xml><?xml version="1.0" encoding="utf-8"?>
 <b:Sources xmlns:b="http://schemas.openxmlformats.org/officeDocument/2006/bibliography" xmlns="http://schemas.openxmlformats.org/officeDocument/2006/bibliography" SelectedStyle="\APASixthEditionOfficeOnline.xsl" StyleName="APA" Version="6"/>
 </file>
 
-<file path=customXml/item2.xml>��< ? x m l   v e r s i o n = " 1 . 0 "   e n c o d i n g = " u t f - 1 6 " ? > - 
- < N a v W o r d R e p o r t X m l P a r t   x m l n s = " u r n : m i c r o s o f t - d y n a m i c s - b u s i n e s s c e n t r a l / i n t e r n a l / e x t e n d e d / r e p o r t s / Q l t y _ G e n e r a l _ P u r p o s e _ I n s p e c t / 2 0 4 0 5 / " > - 
-     < B C R e p o r t I n f o r m a t i o n > - 
-         < R e p o r t M e t a d a t a > - 
-             < E x t e n s i o n I d > E x t e n s i o n   I D < / E x t e n s i o n I d > - 
-             < E x t e n s i o n N a m e > E x t e n s i o n   N a m e < / E x t e n s i o n N a m e > - 
-             < E x t e n s i o n P u b l i s h e r > E x t e n s i o n   P u b l i s h e r < / E x t e n s i o n P u b l i s h e r > - 
-             < E x t e n s i o n V e r s i o n > E x t e n s i o n   V e r s i o n < / E x t e n s i o n V e r s i o n > - 
-             < R e p o r t I d > R e p o r t   I D < / R e p o r t I d > - 
-             < R e p o r t N a m e > R e p o r t   N a m e < / R e p o r t N a m e > - 
-             < A b o u t T h i s R e p o r t T i t l e > A b o u t   T h i s   R e p o r t   T i t l e < / A b o u t T h i s R e p o r t T i t l e > - 
-             < A b o u t T h i s R e p o r t T e x t > A b o u t   T h i s   R e p o r t   T e x t < / A b o u t T h i s R e p o r t T e x t > - 
-             < R e p o r t H e l p L i n k > R e p o r t   H e l p   L i n k < / R e p o r t H e l p L i n k > - 
-         < / R e p o r t M e t a d a t a > - 
-         < R e p o r t R e q u e s t > - 
-             < T e n a n t E n t r a I d > T e n a n t   E n t r a   I d < / T e n a n t E n t r a I d > - 
-             < E n v i r o n m e n t N a m e > E n v i r o n m e n t   N a m e < / E n v i r o n m e n t N a m e > - 
-             < E n v i r o n m e n t T y p e > E n v i r o n m e n t   T y p e < / E n v i r o n m e n t T y p e > - 
-             < C o m p a n y N a m e > C o m p a n y   N a m e < / C o m p a n y N a m e > - 
-             < C o m p a n y D i s p l a y N a m e > C o m p a n y   D i s p l a y   N a m e < / C o m p a n y D i s p l a y N a m e > - 
-             < C o m p a n y I d > C o m p a n y   I D < / C o m p a n y I d > - 
-             < U s e r N a m e > U s e r   N a m e < / U s e r N a m e > - 
-             < D a t e A n d T i m e > D a t e   a n d   T i m e < / D a t e A n d T i m e > - 
-             < L a n g u a g e > L a n g u a g e < / L a n g u a g e > - 
-             < F o r m a t R e g i o n > F o r m a t   R e g i o n < / F o r m a t R e g i o n > - 
-             < D a t e T i m e V a l u e s > - 
-                 < Y e a r > Y e a r < / Y e a r > - 
-                 < M o n t h N u m b e r > M o n t h   N u m b e r < / M o n t h N u m b e r > - 
-                 < D a y N u m b e r > D a y   N u m b e r < / D a y N u m b e r > - 
-                 < H o u r > H o u r < / H o u r > - 
-                 < M i n u t e > M i n u t e < / M i n u t e > - 
-             < / D a t e T i m e V a l u e s > - 
-         < / R e p o r t R e q u e s t > - 
-     < / B C R e p o r t I n f o r m a t i o n > - 
-     < L a b e l s > - 
-         < C o m p l e t e d B y L a b e l   E l e m e n t T y p e = " P a r a m e t e r "   E l e m e n t I d = " 9 2 6 8 6 1 7 7 3 "   D a t a T y p e = " S t r i n g " > C o m p l e t e d B y L a b e l < / C o m p l e t e d B y L a b e l > - 
-         < C o m p l e t e d D a t e L a b e l   E l e m e n t T y p e = " P a r a m e t e r "   E l e m e n t I d = " 1 4 6 7 6 7 4 5 7 8 "   D a t a T y p e = " S t r i n g " > C o m p l e t e d D a t e L a b e l < / C o m p l e t e d D a t e L a b e l > - 
-         < D a t e L a b e l   E l e m e n t T y p e = " P a r a m e t e r "   E l e m e n t I d = " 7 9 3 8 1 7 7 7 7 "   D a t a T y p e = " S t r i n g " > D a t e L a b e l < / D a t e L a b e l > - 
-         < F i e l d L a b e l   E l e m e n t T y p e = " P a r a m e t e r "   E l e m e n t I d = " 1 9 6 1 6 4 7 3 9 9 "   D a t a T y p e = " S t r i n g " > F i e l d L a b e l < / F i e l d L a b e l > - 
-         < I n s p e c t i o n L a b e l   E l e m e n t T y p e = " P a r a m e t e r "   E l e m e n t I d = " 1 5 4 9 8 3 1 5 2 5 "   D a t a T y p e = " S t r i n g " > I n s p e c t i o n L a b e l < / I n s p e c t i o n L a b e l > - 
-         < I t e m L a b e l   E l e m e n t T y p e = " P a r a m e t e r "   E l e m e n t I d = " 1 0 8 2 0 2 8 9 7 4 "   D a t a T y p e = " S t r i n g " > I t e m L a b e l < / I t e m L a b e l > - 
-         < I t e m T r a c k i n g L a b e l   E l e m e n t T y p e = " P a r a m e t e r "   E l e m e n t I d = " 9 3 5 5 3 4 6 7 1 "   D a t a T y p e = " S t r i n g " > I t e m T r a c k i n g L a b e l < / I t e m T r a c k i n g L a b e l > - 
-         < L a s t M o d i f i e d B y L a b e l   E l e m e n t T y p e = " P a r a m e t e r "   E l e m e n t I d = " 9 3 1 4 2 8 2 9 1 "   D a t a T y p e = " S t r i n g " > L a s t M o d i f i e d B y L a b e l < / L a s t M o d i f i e d B y L a b e l > - 
-         < R e p o r t T i t l e L a b e l   E l e m e n t T y p e = " P a r a m e t e r "   E l e m e n t I d = " 1 2 9 7 0 8 9 6 2 7 "   D a t a T y p e = " S t r i n g " > R e p o r t T i t l e L a b e l < / R e p o r t T i t l e L a b e l > - 
-         < R e s u l t L a b e l   E l e m e n t T y p e = " P a r a m e t e r "   E l e m e n t I d = " 4 0 7 6 0 6 8 8 6 "   D a t a T y p e = " S t r i n g " > R e s u l t L a b e l < / R e s u l t L a b e l > - 
-         < T e s t D o c u m e n t N o L a b e l   E l e m e n t T y p e = " P a r a m e t e r "   E l e m e n t I d = " 1 6 2 2 1 4 2 9 2 3 "   D a t a T y p e = " S t r i n g " > T e s t D o c u m e n t N o L a b e l < / T e s t D o c u m e n t N o L a b e l > - 
-     < / L a b e l s > - 
-     < T o o l t i p s > - 
-         < T o o l t i p   c o l u m n = " Q l t y I n s p e c t i o n T e m p l a t e _ D e s c r i p t i o n "   E l e m e n t I d = " 1 6 5 2 0 6 9 5 9 8 " > - 
-             < T o o l t i p T e x t   l a n g = " e n - U S " > S p e c i f i e s   a n   e x p l a n a t i o n   o f   t h e   Q u a l i t y   I n s p e c t i o n   T e m p l a t e .   Y o u   c a n   e n t e r   a   m a x i m u m   o f   1 0 0   c h a r a c t e r s ,   b o t h   n u m b e r s   a n d   l e t t e r s . < / T o o l t i p T e x t > - 
-         < / T o o l t i p > - 
-         < T o o l t i p   c o l u m n = " Q l t y I n s p e c t i o n _ D e s c r i p t i o n "   E l e m e n t I d = " 7 3 9 0 1 9 9 1 0 " > - 
-             < T o o l t i p T e x t   l a n g = " e n - U S " > S p e c i f i e s   a   d e s c r i p t i o n   o f   t h e   Q u a l i t y   I n s p e c t i o n   i t s e l f . < / T o o l t i p T e x t > - 
-         < / T o o l t i p > - 
-         < T o o l t i p   c o l u m n = " Q l t y I n s p e c t i o n _ S t a t u s "   E l e m e n t I d = " 8 5 1 7 5 2 7 6 8 " > - 
-             < T o o l t i p T e x t   l a n g = " e n - U S " > S p e c i f i e s   t h e   s t a t u s   o f   t h e   i n s p e c t i o n .   N o   a d d i t i o n a l   c h a n g e s   c a n   b e   m a d e   t o   a   f i n i s h e d   Q u a l i t y   I n s p e c t i o n . < / T o o l t i p T e x t > - 
-         < / T o o l t i p > - 
-         < T o o l t i p   c o l u m n = " Q l t y I n s p e c t i o n _ R e s u l t _ C o d e "   E l e m e n t I d = " 1 8 0 7 0 7 7 0 6 5 " > - 
-             < T o o l t i p T e x t   l a n g = " e n - U S " > S p e c i f i e s   t h e   r e s u l t   i s   a u t o m a t i c a l l y   d e t e r m i n e d   b a s e d   o n   t h e   t e s t   v a l u e   a n d   r e s u l t   c o n f i g u r a t i o n . < / T o o l t i p T e x t > - 
-         < / T o o l t i p > - 
-         < T o o l t i p   c o l u m n = " Q l t y I n s p e c t i o n _ R e s u l t _ D e s c r i p t i o n "   E l e m e n t I d = " 8 1 0 5 3 8 1 8 8 " > - 
-             < T o o l t i p T e x t   l a n g = " e n - U S " > S p e c i f i e s   t h e   r e s u l t   d e s c r i p t i o n   f o r   t h i s   t e s t   r e s u l t .   T h e   r e s u l t   i s   a u t o m a t i c a l l y   d e t e r m i n e d   b a s e d   o n   t h e   t e s t   v a l u e   a n d   r e s u l t   c o n f i g u r a t i o n . < / T o o l t i p T e x t > - 
-         < / T o o l t i p > - 
-         < T o o l t i p   c o l u m n = " Q l t y I n s p e c t i o n _ N o "   E l e m e n t I d = " 2 1 2 0 6 1 5 7 4 9 " > - 
-             < T o o l t i p T e x t   l a n g = " e n - U S " > S p e c i f i e s   t h e   q u a l i t y   i n s p e c t i o n   d o c u m e n t   n u m b e r . < / T o o l t i p T e x t > - 
-         < / T o o l t i p > - 
-         < T o o l t i p   c o l u m n = " Q l t y I n s p e c t i o n _ R e i n s p e c t i o n N o "   E l e m e n t I d = " 7 5 1 7 3 5 6 " > - 
-             < T o o l t i p T e x t   l a n g = " e n - U S " > S p e c i f i e s   t h e   r e - i n s p e c t i o n   c o u n t e r . < / T o o l t i p T e x t > - 
-         < / T o o l t i p > - 
-         < T o o l t i p   c o l u m n = " Q l t y I n s p e c t i o n _ F i n i s h e d _ B y _ U s e r _ I D "   E l e m e n t I d = " 1 7 5 0 5 1 6 3 3 8 " > - 
-             < T o o l t i p T e x t   l a n g = " e n - U S " > S p e c i f i e s   t h e   u s e r   t h a t   f i n i s h e d   t h e   i n s p e c t i o n . < / T o o l t i p T e x t > - 
-         < / T o o l t i p > - 
-         < T o o l t i p   c o l u m n = " Q l t y I n s p e c t i o n _ F i n i s h e d _ D a t e "   E l e m e n t I d = " 1 8 3 4 1 2 2 7 6 5 " > - 
-             < T o o l t i p T e x t   l a n g = " e n - U S " > S p e c i f i e s   t h e   d a t e   t h a t   t h e   i n s p e c t i o n   w a s   f i n i s h e d . < / T o o l t i p T e x t > - 
-         < / T o o l t i p > - 
-         < T o o l t i p   c o l u m n = " Q l t y I n s p e c t i o n _ S o u r c e _ I t e m _ N o _ "   E l e m e n t I d = " 1 2 6 8 0 5 0 5 1 8 " > - 
-             < T o o l t i p T e x t   l a n g = " e n - U S " > S p e c i f i e s   t h e   i t e m   t h a t   t h e   Q u a l i t y   I n s p e c t i o n   i s   f o r .   W h e n   u s e d   w i t h   p r o d u c t i o n   o r d e r s   t h i s   t y p i c a l l y   r e f e r s   t o   t h e   i t e m   b e i n g   p r o d u c e d . < / T o o l t i p T e x t > - 
-         < / T o o l t i p > - 
-         < T o o l t i p   c o l u m n = " Q l t y I n s p e c t i o n _ S o u r c e _ I t e m _ D e s c r i p t i o n "   E l e m e n t I d = " 6 4 6 8 9 0 6 3 0 " > - 
-             < T o o l t i p T e x t   l a n g = " e n - U S " > S p e c i f i e s   a   d e s c r i p t i o n   o f   t h e   i t e m . < / T o o l t i p T e x t > - 
-         < / T o o l t i p > - 
-         < T o o l t i p   c o l u m n = " Q l t y I n s p e c t i o n _ S o u r c e _ I t e m _ D e s c r i p t i o n 2 "   E l e m e n t I d = " 1 2 7 9 3 6 9 3 5 2 " > - 
-             < T o o l t i p T e x t   l a n g = " e n - U S " > S p e c i f i e s   i n f o r m a t i o n   i n   a d d i t i o n   t o   t h e   d e s c r i p t i o n . < / T o o l t i p T e x t > - 
-         < / T o o l t i p > - 
-         < T o o l t i p   c o l u m n = " Q l t y I n s p e c t i o n _ S o u r c e _ V a r i a n t _ C o d e "   E l e m e n t I d = " 1 6 0 8 4 0 3 8 2 1 " > - 
-             < T o o l t i p T e x t   l a n g = " e n - U S " > S p e c i f i e s   t h e   i t e m   v a r i a n t   t h a t   t h e   Q u a l i t y   I n s p e c t i o n   i s   f o r .   W h e n   u s e d   w i t h   p r o d u c t i o n   o r d e r s   t h i s   t y p i c a l l y   r e f e r s   t o   t h e   i t e m   b e i n g   p r o d u c e d . < / T o o l t i p T e x t > - 
-         < / T o o l t i p > - 
-         < T o o l t i p   c o l u m n = " Q l t y I n s p e c t i o n _ S o u r c e _ L o t _ N o _ "   E l e m e n t I d = " 1 1 2 3 5 5 1 3 1 2 " > - 
-             < T o o l t i p T e x t   l a n g = " e n - U S " > S p e c i f i e s   t h e   l o t   n u m b e r   t h a t   t h e   q u a l i t y   i n s p e c t i o n   i s   f o r .   T h i s   i s   o n l y   u s e d   f o r   l o t   t r a c k e d   i t e m s . < / T o o l t i p T e x t > - 
-         < / T o o l t i p > - 
-         < T o o l t i p   c o l u m n = " Q l t y I n s p e c t i o n _ S o u r c e _ S e r i a l _ N o _ "   E l e m e n t I d = " 1 5 2 0 5 9 1 4 4 7 " > - 
-             < T o o l t i p T e x t   l a n g = " e n - U S " > S p e c i f i e s   t h e   s e r i a l   n u m b e r   t h a t   t h e   q u a l i t y   i n s p e c t i o n   i s   f o r .   T h i s   i s   o n l y   u s e d   f o r   s e r i a l   t r a c k e d   i t e m s . < / T o o l t i p T e x t > - 
-         < / T o o l t i p > - 
-         < T o o l t i p   c o l u m n = " Q l t y I n s p e c t i o n _ S o u r c e _ P a c k a g e _ N o _ "   E l e m e n t I d = " 1 9 6 1 1 2 9 9 7 " > - 
-             < T o o l t i p T e x t   l a n g = " e n - U S " > S p e c i f i e s   t h e   p a c k a g e   n u m b e r   t h a t   t h e   q u a l i t y   i n s p e c t i o n   i s   f o r .   T h i s   i s   o n l y   u s e d   f o r   p a c k a g e   t r a c k e d   i t e m s . < / T o o l t i p T e x t > - 
-         < / T o o l t i p > - 
-         < T o o l t i p   c o l u m n = " Q l t y I n s p e c t i o n _ S o u r c e _ D o c u m e n t _ N o _ "   E l e m e n t I d = " 1 6 7 5 9 1 6 2 8 8 " > - 
-             < T o o l t i p T e x t   l a n g = " e n - U S " > S p e c i f i e s   a   r e f e r e n c e   t o   t h e   d o c u m e n t   t h a t   t h i s   Q u a l i t y   I n s p e c t i o n   i s   r e f e r r i n g   t o .   T h i s   t y p i c a l l y   r e f e r s   t o   a   p r o d u c t i o n   o r d e r   d o c u m e n t   n u m b e r . < / T o o l t i p T e x t > - 
-         < / T o o l t i p > - 
-         < T o o l t i p   c o l u m n = " Q l t y I n s p e c t i o n _ S o u r c e _ T a s k _ N o _ "   E l e m e n t I d = " 3 8 4 6 4 4 1 8 2 " > - 
-             < T o o l t i p T e x t   l a n g = " e n - U S " > S p e c i f i e s   a   r e f e r e n c e   t o   t h e   s o u r c e   t a s k   n o .   t h a t   t h i s   Q u a l i t y   I n s p e c t i o n   i s   r e f e r r i n g   t o .   T h i s   t y p i c a l l y   r e f e r s   t o   a n   o p e r a t i o n . < / T o o l t i p T e x t > - 
-         < / T o o l t i p > - 
-         < T o o l t i p   c o l u m n = " Q l t y I n s p e c t i o n _ S o u r c e _ C u s t o m _ 1 "   E l e m e n t I d = " 5 4 6 4 5 3 7 6 5 " > - 
-             < T o o l t i p T e x t   l a n g = " e n - U S " > S p e c i f i e s   a d d i t i o n a l   i n f o r m a t i o n   f r o m   a   s o u r c e   r e c o r d . < / T o o l t i p T e x t > - 
-         < / T o o l t i p > - 
-         < T o o l t i p   c o l u m n = " Q l t y I n s p e c t i o n _ S o u r c e _ C u s t o m _ 2 "   E l e m e n t I d = " 1 8 3 5 4 2 3 6 8 0 " > - 
-             < T o o l t i p T e x t   l a n g = " e n - U S " > S p e c i f i e s   a d d i t i o n a l   i n f o r m a t i o n   f r o m   a   s o u r c e   r e c o r d . < / T o o l t i p T e x t > - 
-         < / T o o l t i p > - 
-         < T o o l t i p   c o l u m n = " Q l t y I n s p e c t i o n _ S o u r c e _ C u s t o m _ 3 "   E l e m e n t I d = " 1 8 2 1 8 4 6 9 9 9 " > - 
-             < T o o l t i p T e x t   l a n g = " e n - U S " > S p e c i f i e s   a d d i t i o n a l   i n f o r m a t i o n   f r o m   a   s o u r c e   r e c o r d . < / T o o l t i p T e x t > - 
-         < / T o o l t i p > - 
-         < T o o l t i p   c o l u m n = " Q l t y I n s p e c t i o n _ S o u r c e _ C u s t o m _ 4 "   E l e m e n t I d = " 1 3 6 6 6 3 6 0 8 6 " > - 
-             < T o o l t i p T e x t   l a n g = " e n - U S " > S p e c i f i e s   a d d i t i o n a l   i n f o r m a t i o n   f r o m   a   s o u r c e   r e c o r d . < / T o o l t i p T e x t > - 
-         < / T o o l t i p > - 
-         < T o o l t i p   c o l u m n = " Q l t y I n s p e c t i o n _ S o u r c e _ C u s t o m _ 5 "   E l e m e n t I d = " 2 0 0 4 3 3 2 7 0 3 " > - 
-             < T o o l t i p T e x t   l a n g = " e n - U S " > S p e c i f i e s   a d d i t i o n a l   i n f o r m a t i o n   f r o m   a   s o u r c e   r e c o r d . < / T o o l t i p T e x t > - 
-         < / T o o l t i p > - 
-         < T o o l t i p   c o l u m n = " Q l t y I n s p e c t i o n _ S o u r c e _ C u s t o m _ 6 "   E l e m e n t I d = " 9 1 2 4 2 8 5 2 " > - 
-             < T o o l t i p T e x t   l a n g = " e n - U S " > S p e c i f i e s   a d d i t i o n a l   i n f o r m a t i o n   f r o m   a   s o u r c e   r e c o r d . < / T o o l t i p T e x t > - 
-         < / T o o l t i p > - 
-         < T o o l t i p   c o l u m n = " Q l t y I n s p e c t i o n _ S o u r c e _ C u s t o m _ 7 "   E l e m e n t I d = " 7 2 8 9 3 9 4 6 9 " > - 
-             < T o o l t i p T e x t   l a n g = " e n - U S " > S p e c i f i e s   a d d i t i o n a l   i n f o r m a t i o n   f r o m   a   s o u r c e   r e c o r d . < / T o o l t i p T e x t > - 
-         < / T o o l t i p > - 
-         < T o o l t i p   c o l u m n = " Q l t y I n s p e c t i o n _ S o u r c e _ C u s t o m _ 8 "   E l e m e n t I d = " 3 7 7 5 4 4 7 4 2 " > - 
-             < T o o l t i p T e x t   l a n g = " e n - U S " > S p e c i f i e s   a d d i t i o n a l   i n f o r m a t i o n   f r o m   a   s o u r c e   r e c o r d . < / T o o l t i p T e x t > - 
-         < / T o o l t i p > - 
-         < T o o l t i p   c o l u m n = " Q l t y I n s p e c t i o n _ S o u r c e _ C u s t o m _ 9 "   E l e m e n t I d = " 2 6 0 1 5 1 8 7 5 " > - 
-             < T o o l t i p T e x t   l a n g = " e n - U S " > S p e c i f i e s   a d d i t i o n a l   i n f o r m a t i o n   f r o m   a   s o u r c e   r e c o r d . < / T o o l t i p T e x t > - 
-         < / T o o l t i p > - 
-         < T o o l t i p   c o l u m n = " Q l t y I n s p e c t i o n _ S o u r c e _ C u s t o m _ 1 0 "   E l e m e n t I d = " 1 5 3 7 6 5 2 9 2 5 " > - 
-             < T o o l t i p T e x t   l a n g = " e n - U S " > S p e c i f i e s   a d d i t i o n a l   i n f o r m a t i o n   f r o m   a   s o u r c e   r e c o r d . < / T o o l t i p T e x t > - 
-         < / T o o l t i p > - 
-         < T o o l t i p   c o l u m n = " F i e l d _ C o d e "   E l e m e n t I d = " 1 3 2 7 2 5 5 7 3 " > - 
-             < T o o l t i p T e x t   l a n g = " e n - U S " > S p e c i f i e s   t h e   f i e l d / q u e s t i o n / m e t r i c   i n   t h i s   t e s t . < / T o o l t i p T e x t > - 
-         < / T o o l t i p > - 
-         < T o o l t i p   c o l u m n = " F i e l d _ D e s c r i p t i o n "   E l e m e n t I d = " 1 4 6 8 6 2 1 2 9 8 " > - 
-             < T o o l t i p T e x t   l a n g = " e n - U S " > S p e c i f i e s   a   d e s c r i p t i o n   o f   t h e   f i e l d   a s   i t   i s   u s e d   o n   t h e   t e s t . < / T o o l t i p T e x t > - 
-         < / T o o l t i p > - 
-         < T o o l t i p   c o l u m n = " N u m e r i c _ V a l u e "   E l e m e n t I d = " 4 6 0 4 1 2 6 4 6 " > - 
-             < T o o l t i p T e x t   l a n g = " e n - U S " > S p e c i f i e s   a n   e v a l u a t e d   n u m e r i c   v a l u e   o f   T e s t   V a l u e   f o r   u s e   i n   c a l c u l a t i o n s   a n d   a n a l y s i s .   T h i s   v a l u e   i s   a u t o m a t i c a l l y   c a l c u l a t e d   w h e n   t h e   T e s t   V a l u e   i s   e n t e r e d   o r   m o d i f i e d   b a s e d   o n   t h e   c o n f i g u r a t i o n   o f   t h e   T e s t   V a l u e   a n d   i s   n o t   d i r e c t l y   e d i t a b l e . < / T o o l t i p T e x t > - 
-         < / T o o l t i p > - 
-         < T o o l t i p   c o l u m n = " F i e l d _ T y p e "   E l e m e n t I d = " 1 3 2 8 1 6 4 0 1 6 " > - 
-             < T o o l t i p T e x t   l a n g = " e n - U S " > S p e c i f i e s   t h e   d a t a   t y p e   o f   t h e   v a l u e s   y o u   c a n   e n t e r   o r   s e l e c t   f o r   t h i s   t e s t .   U s e   D e c i m a l   f o r   n u m e r i c a l   m e a s u r e m e n t s .   U s e   C h o i c e   t o   g i v e   a   l i s t   o f   o p t i o n s   t o   c h o o s e   f r o m .   I f   y o u   w a n t   t o   c h o o s e   o p t i o n s   f r o m   a n   e x i s t i n g   t a b l e ,   u s e   T a b l e   L o o k u p . < / T o o l t i p T e x t > - 
-         < / T o o l t i p > - 
-         < T o o l t i p   c o l u m n = " T e s t _ R e s u l t "   E l e m e n t I d = " 1 2 7 1 0 6 2 1 4 1 " > - 
-             < T o o l t i p T e x t   l a n g = " e n - U S " > S p e c i f i e s   t h e   r e s u l t   i s   a u t o m a t i c a l l y   d e t e r m i n e d   b a s e d   o n   t h e   t e s t   v a l u e   a n d   r e s u l t   c o n f i g u r a t i o n . < / T o o l t i p T e x t > - 
-         < / T o o l t i p > - 
-     < / T o o l t i p s > - 
-     < C u r r e n t I n s p e c t i o n   E l e m e n t T y p e = " D a t a I t e m "   E l e m e n t I d = " 1 7 4 7 8 9 7 9 7 8 " > - 
-         < A p p r o v e r N a m e L a b e l   E l e m e n t T y p e = " C o l u m n "   E l e m e n t I d = " 1 8 9 7 9 9 2 7 8 5 "   D a t a T y p e = " T e x t " > A p p r o v e r N a m e L a b e l < / A p p r o v e r N a m e L a b e l > - 
-         < A p p r o v e r S i g n a t u r e L a b e l   E l e m e n t T y p e = " C o l u m n "   E l e m e n t I d = " 1 0 3 4 5 1 7 9 4 "   D a t a T y p e = " T e x t " > A p p r o v e r S i g n a t u r e L a b e l < / A p p r o v e r S i g n a t u r e L a b e l > - 
-         < C O A C o n t a c t _ A l l   E l e m e n t T y p e = " C o l u m n "   E l e m e n t I d = " 1 5 9 3 9 3 0 3 4 6 "   D a t a T y p e = " T e x t " > C O A C o n t a c t _ A l l < / C O A C o n t a c t _ A l l > - 
-         < C O A C o n t a c t _ R o w 1   E l e m e n t T y p e = " C o l u m n "   E l e m e n t I d = " 1 2 7 0 2 3 9 7 3 2 "   D a t a T y p e = " T e x t " > C O A C o n t a c t _ R o w 1 < / C O A C o n t a c t _ R o w 1 > - 
-         < C O A C o n t a c t _ R o w 2   E l e m e n t T y p e = " C o l u m n "   E l e m e n t I d = " 6 4 2 8 5 0 1 1 9 "   D a t a T y p e = " T e x t " > C O A C o n t a c t _ R o w 2 < / C O A C o n t a c t _ R o w 2 > - 
-         < C O A C o n t a c t _ R o w 3   E l e m e n t T y p e = " C o l u m n "   E l e m e n t I d = " 5 1 5 3 5 0 2 "   D a t a T y p e = " T e x t " > C O A C o n t a c t _ R o w 3 < / C O A C o n t a c t _ R o w 3 > - 
-         < C O A C o n t a c t _ R o w 4   E l e m e n t T y p e = " C o l u m n "   E l e m e n t I d = " 1 1 1 1 6 3 7 7 1 3 "   D a t a T y p e = " T e x t " > C O A C o n t a c t _ R o w 4 < / C O A C o n t a c t _ R o w 4 > - 
-         < C O A C o n t a c t _ R o w 5   E l e m e n t T y p e = " C o l u m n "   E l e m e n t I d = " 4 7 3 9 4 1 0 9 6 "   D a t a T y p e = " T e x t " > C O A C o n t a c t _ R o w 5 < / C O A C o n t a c t _ R o w 5 > - 
-         < C O A C o n t a c t _ R o w 6   E l e m e n t T y p e = " C o l u m n "   E l e m e n t I d = " 1 9 0 7 9 3 6 3 4 9 "   D a t a T y p e = " T e x t " > C O A C o n t a c t _ R o w 6 < / C O A C o n t a c t _ R o w 6 > - 
-         < C O A C o n t a c t _ R o w 7   E l e m e n t T y p e = " C o l u m n "   E l e m e n t I d = " 1 7 4 9 3 3 4 3 3 0 "   D a t a T y p e = " T e x t " > C O A C o n t a c t _ R o w 7 < / C O A C o n t a c t _ R o w 7 > - 
-         < C O A C o n t a c t _ R o w 8   E l e m e n t T y p e = " C o l u m n "   E l e m e n t I d = " 1 4 3 9 1 4 8 7 5 5 "   D a t a T y p e = " T e x t " > C O A C o n t a c t _ R o w 8 < / C O A C o n t a c t _ R o w 8 > - 
-         < C o m p a n y I n f o r m a t i o n _ A l l   E l e m e n t T y p e = " C o l u m n "   E l e m e n t I d = " 7 6 1 9 7 4 8 2 4 "   D a t a T y p e = " T e x t " > C o m p a n y I n f o r m a t i o n _ A l l < / C o m p a n y I n f o r m a t i o n _ A l l > - 
-         < C o m p a n y I n f o r m a t i o n _ R o w 1   E l e m e n t T y p e = " C o l u m n "   E l e m e n t I d = " 1 8 4 3 2 1 2 8 9 4 "   D a t a T y p e = " T e x t " > C o m p a n y I n f o r m a t i o n _ R o w 1 < / C o m p a n y I n f o r m a t i o n _ R o w 1 > - 
-         < C o m p a n y I n f o r m a t i o n _ R o w 2   E l e m e n t T y p e = " C o l u m n "   E l e m e n t I d = " 1 8 1 4 0 5 7 7 8 5 "   D a t a T y p e = " T e x t " > C o m p a n y I n f o r m a t i o n _ R o w 2 < / C o m p a n y I n f o r m a t i o n _ R o w 2 > - 
-         < C o m p a n y I n f o r m a t i o n _ R o w 3   E l e m e n t T y p e = " C o l u m n "   E l e m e n t I d = " 1 1 7 6 3 6 1 1 6 8 "   D a t a T y p e = " T e x t " > C o m p a n y I n f o r m a t i o n _ R o w 3 < / C o m p a n y I n f o r m a t i o n _ R o w 3 > - 
-         < C o m p a n y I n f o r m a t i o n _ R o w 4   E l e m e n t T y p e = " C o l u m n "   E l e m e n t I d = " 1 3 4 5 2 7 0 1 9 1 "   D a t a T y p e = " T e x t " > C o m p a n y I n f o r m a t i o n _ R o w 4 < / C o m p a n y I n f o r m a t i o n _ R o w 4 > - 
-         < C o m p a n y I n f o r m a t i o n _ R o w 5   E l e m e n t T y p e = " C o l u m n "   E l e m e n t I d = " 7 0 7 5 7 3 5 7 4 "   D a t a T y p e = " T e x t " > C o m p a n y I n f o r m a t i o n _ R o w 5 < / C o m p a n y I n f o r m a t i o n _ R o w 5 > - 
-         < C o m p a n y I n f o r m a t i o n _ R o w 6   E l e m e n t T y p e = " C o l u m n "   E l e m e n t I d = " 6 9 8 7 6 9 5 7 "   D a t a T y p e = " T e x t " > C o m p a n y I n f o r m a t i o n _ R o w 6 < / C o m p a n y I n f o r m a t i o n _ R o w 6 > - 
-         < C o m p a n y I n f o r m a t i o n _ R o w 7   E l e m e n t T y p e = " C o l u m n "   E l e m e n t I d = " 5 6 7 8 1 9 6 6 0 "   D a t a T y p e = " T e x t " > C o m p a n y I n f o r m a t i o n _ R o w 7 < / C o m p a n y I n f o r m a t i o n _ R o w 7 > - 
-         < C o m p a n y I n f o r m a t i o n _ R o w 8   E l e m e n t T y p e = " C o l u m n "   E l e m e n t I d = " 3 9 8 9 1 0 6 3 7 "   D a t a T y p e = " T e x t " > C o m p a n y I n f o r m a t i o n _ R o w 8 < / C o m p a n y I n f o r m a t i o n _ R o w 8 > - 
-         < C o m p a n y L o g o   E l e m e n t T y p e = " C o l u m n "   E l e m e n t I d = " 2 3 7 6 9 1 5 1 "   D a t a T y p e = " B l o b "   / > - 
-         < E m a i l L a b e l   E l e m e n t T y p e = " C o l u m n "   E l e m e n t I d = " 7 7 1 8 8 7 1 3 5 "   D a t a T y p e = " T e x t " > E m a i l L a b e l < / E m a i l L a b e l > - 
-         < E m a i l V a l u e   E l e m e n t T y p e = " C o l u m n "   E l e m e n t I d = " 3 8 8 1 2 2 7 6 2 "   D a t a T y p e = " T e x t " > E m a i l V a l u e < / E m a i l V a l u e > - 
-         < F i n i s h e d B y N a m e L a b e l   E l e m e n t T y p e = " C o l u m n "   E l e m e n t I d = " 2 1 0 1 0 0 9 6 5 1 "   D a t a T y p e = " T e x t " > F i n i s h e d B y N a m e L a b e l < / F i n i s h e d B y N a m e L a b e l > - 
-         < F i n i s h e d B y S i g n a t u r e L a b e l   E l e m e n t T y p e = " C o l u m n "   E l e m e n t I d = " 2 0 7 1 3 1 2 7 2 2 "   D a t a T y p e = " T e x t " > F i n i s h e d B y S i g n a t u r e L a b e l < / F i n i s h e d B y S i g n a t u r e L a b e l > - 
-         < F i n i s h e d D a t e O n l y   E l e m e n t T y p e = " C o l u m n "   E l e m e n t I d = " 2 0 0 8 0 4 4 9 4 3 "   D a t a T y p e = " D a t e " > F i n i s h e d D a t e O n l y < / F i n i s h e d D a t e O n l y > - 
-         < H o m e P a g e L a b e l   E l e m e n t T y p e = " C o l u m n "   E l e m e n t I d = " 4 6 2 3 7 4 2 3 1 "   D a t a T y p e = " T e x t " > H o m e P a g e L a b e l < / H o m e P a g e L a b e l > - 
-         < H o m e P a g e V a l u e   E l e m e n t T y p e = " C o l u m n "   E l e m e n t I d = " 5 3 3 5 1 4 0 3 4 "   D a t a T y p e = " T e x t " > H o m e P a g e V a l u e < / H o m e P a g e V a l u e > - 
-         < I n s p e c t i o n I n f o r m a t i o n   E l e m e n t T y p e = " C o l u m n "   E l e m e n t I d = " 1 5 3 2 8 6 0 1 9 9 "   D a t a T y p e = " T e x t " > I n s p e c t i o n I n f o r m a t i o n < / I n s p e c t i o n I n f o r m a t i o n > - 
-         < I t e m D e s c r i p t i o n   E l e m e n t T y p e = " C o l u m n "   E l e m e n t I d = " 1 9 6 5 3 9 3 7 9 0 "   D a t a T y p e = " T e x t " > I t e m D e s c r i p t i o n < / I t e m D e s c r i p t i o n > - 
-         < I t e m T r a c k i n g D e s c r i p t i o n   E l e m e n t T y p e = " C o l u m n "   E l e m e n t I d = " 1 1 1 7 1 0 3 3 4 5 "   D a t a T y p e = " T e x t " > I t e m T r a c k i n g D e s c r i p t i o n < / I t e m T r a c k i n g D e s c r i p t i o n > - 
-         < P h o n e N o L a b e l   E l e m e n t T y p e = " C o l u m n "   E l e m e n t I d = " 1 6 1 4 5 2 6 0 7 8 "   D a t a T y p e = " T e x t " > P h o n e N o L a b e l < / P h o n e N o L a b e l > - 
-         < P h o n e N o V a l u e   E l e m e n t T y p e = " C o l u m n "   E l e m e n t I d = " 1 2 8 6 6 4 9 7 8 1 "   D a t a T y p e = " T e x t " > P h o n e N o V a l u e < / P h o n e N o V a l u e > - 
-         < Q l t y I n s p e c t i o n T e m p l a t e _ D e s c r i p t i o n   E l e m e n t T y p e = " C o l u m n "   E l e m e n t I d = " 1 6 5 2 0 6 9 5 9 8 "   D a t a T y p e = " T e x t " > Q l t y I n s p e c t i o n T e m p l a t e _ D e s c r i p t i o n < / Q l t y I n s p e c t i o n T e m p l a t e _ D e s c r i p t i o n > - 
-         < Q l t y I n s p e c t i o n _ A p p r o v e r _ N a m e   E l e m e n t T y p e = " C o l u m n "   E l e m e n t I d = " 2 0 5 9 0 7 9 3 2 1 "   D a t a T y p e = " T e x t " > Q l t y I n s p e c t i o n _ A p p r o v e r _ N a m e < / Q l t y I n s p e c t i o n _ A p p r o v e r _ N a m e > - 
-         < Q l t y I n s p e c t i o n _ A p p r o v e r _ T i t l e   E l e m e n t T y p e = " C o l u m n "   E l e m e n t I d = " 4 7 5 7 2 7 8 9 8 "   D a t a T y p e = " T e x t " > Q l t y I n s p e c t i o n _ A p p r o v e r _ T i t l e < / Q l t y I n s p e c t i o n _ A p p r o v e r _ T i t l e > - 
-         < Q l t y I n s p e c t i o n _ D e s c r i p t i o n   E l e m e n t T y p e = " C o l u m n "   E l e m e n t I d = " 7 3 9 0 1 9 9 1 0 "   D a t a T y p e = " T e x t " > Q l t y I n s p e c t i o n _ D e s c r i p t i o n < / Q l t y I n s p e c t i o n _ D e s c r i p t i o n > - 
-         < Q l t y I n s p e c t i o n _ F i n i s h e d _ B y _ E m a i l   E l e m e n t T y p e = " C o l u m n "   E l e m e n t I d = " 1 5 2 1 1 3 4 6 3 1 "   D a t a T y p e = " T e x t " > Q l t y I n s p e c t i o n _ F i n i s h e d _ B y _ E m a i l < / Q l t y I n s p e c t i o n _ F i n i s h e d _ B y _ E m a i l > - 
-         < Q l t y I n s p e c t i o n _ F i n i s h e d _ B y _ P h o n e   E l e m e n t T y p e = " C o l u m n "   E l e m e n t I d = " 3 4 7 5 5 7 6 2 5 "   D a t a T y p e = " T e x t " > Q l t y I n s p e c t i o n _ F i n i s h e d _ B y _ P h o n e < / Q l t y I n s p e c t i o n _ F i n i s h e d _ B y _ P h o n e > - 
-         < Q l t y I n s p e c t i o n _ F i n i s h e d _ B y _ T i t l e   E l e m e n t T y p e = " C o l u m n "   E l e m e n t I d = " 4 6 0 0 4 5 6 8 3 "   D a t a T y p e = " T e x t " > Q l t y I n s p e c t i o n _ F i n i s h e d _ B y _ T i t l e < / Q l t y I n s p e c t i o n _ F i n i s h e d _ B y _ T i t l e > - 
-         < Q l t y I n s p e c t i o n _ F i n i s h e d _ B y _ U s e r N a m e   E l e m e n t T y p e = " C o l u m n "   E l e m e n t I d = " 1 9 5 3 6 1 2 5 3 1 "   D a t a T y p e = " T e x t " > Q l t y I n s p e c t i o n _ F i n i s h e d _ B y _ U s e r N a m e < / Q l t y I n s p e c t i o n _ F i n i s h e d _ B y _ U s e r N a m e > - 
-         < Q l t y I n s p e c t i o n _ F i n i s h e d _ B y _ U s e r _ I D   E l e m e n t T y p e = " C o l u m n "   E l e m e n t I d = " 1 7 5 0 5 1 6 3 3 8 "   D a t a T y p e = " C o d e " > Q l t y I n s p e c t i o n _ F i n i s h e d _ B y _ U s e r _ I D < / Q l t y I n s p e c t i o n _ F i n i s h e d _ B y _ U s e r _ I D > - 
-         < Q l t y I n s p e c t i o n _ F i n i s h e d _ D a t e   E l e m e n t T y p e = " C o l u m n "   E l e m e n t I d = " 1 8 3 4 1 2 2 7 6 5 "   D a t a T y p e = " D a t e T i m e " > Q l t y I n s p e c t i o n _ F i n i s h e d _ D a t e < / Q l t y I n s p e c t i o n _ F i n i s h e d _ D a t e > - 
-         < Q l t y I n s p e c t i o n _ N o   E l e m e n t T y p e = " C o l u m n "   E l e m e n t I d = " 2 1 2 0 6 1 5 7 4 9 "   D a t a T y p e = " C o d e " > Q l t y I n s p e c t i o n _ N o < / Q l t y I n s p e c t i o n _ N o > - 
-         < Q l t y I n s p e c t i o n _ R e i n s p e c t i o n N o   E l e m e n t T y p e = " C o l u m n "   E l e m e n t I d = " 7 5 1 7 3 5 6 "   D a t a T y p e = " I n t e g e r " > Q l t y I n s p e c t i o n _ R e i n s p e c t i o n N o < / Q l t y I n s p e c t i o n _ R e i n s p e c t i o n N o > - 
-         < Q l t y I n s p e c t i o n _ R e s u l t _ C o d e   E l e m e n t T y p e = " C o l u m n "   E l e m e n t I d = " 1 8 0 7 0 7 7 0 6 5 "   D a t a T y p e = " C o d e " > Q l t y I n s p e c t i o n _ R e s u l t _ C o d e < / Q l t y I n s p e c t i o n _ R e s u l t _ C o d e > - 
-         < Q l t y I n s p e c t i o n _ R e s u l t _ D e s c r i p t i o n   E l e m e n t T y p e = " C o l u m n "   E l e m e n t I d = " 8 1 0 5 3 8 1 8 8 "   D a t a T y p e = " T e x t " > Q l t y I n s p e c t i o n _ R e s u l t _ D e s c r i p t i o n < / Q l t y I n s p e c t i o n _ R e s u l t _ D e s c r i p t i o n > - 
-         < Q l t y I n s p e c t i o n _ S o u r c e _ C u s t o m _ 1   E l e m e n t T y p e = " C o l u m n "   E l e m e n t I d = " 5 4 6 4 5 3 7 6 5 "   D a t a T y p e = " T e x t " > Q l t y I n s p e c t i o n _ S o u r c e _ C u s t o m _ 1 < / Q l t y I n s p e c t i o n _ S o u r c e _ C u s t o m _ 1 > - 
-         < Q l t y I n s p e c t i o n _ S o u r c e _ C u s t o m _ 1 0   E l e m e n t T y p e = " C o l u m n "   E l e m e n t I d = " 1 5 3 7 6 5 2 9 2 5 "   D a t a T y p e = " D e c i m a l " > Q l t y I n s p e c t i o n _ S o u r c e _ C u s t o m _ 1 0 < / Q l t y I n s p e c t i o n _ S o u r c e _ C u s t o m _ 1 0 > - 
-         < Q l t y I n s p e c t i o n _ S o u r c e _ C u s t o m _ 2   E l e m e n t T y p e = " C o l u m n "   E l e m e n t I d = " 1 8 3 5 4 2 3 6 8 0 "   D a t a T y p e = " T e x t " > Q l t y I n s p e c t i o n _ S o u r c e _ C u s t o m _ 2 < / Q l t y I n s p e c t i o n _ S o u r c e _ C u s t o m _ 2 > - 
-         < Q l t y I n s p e c t i o n _ S o u r c e _ C u s t o m _ 3   E l e m e n t T y p e = " C o l u m n "   E l e m e n t I d = " 1 8 2 1 8 4 6 9 9 9 "   D a t a T y p e = " T e x t " > Q l t y I n s p e c t i o n _ S o u r c e _ C u s t o m _ 3 < / Q l t y I n s p e c t i o n _ S o u r c e _ C u s t o m _ 3 > - 
-         < Q l t y I n s p e c t i o n _ S o u r c e _ C u s t o m _ 4   E l e m e n t T y p e = " C o l u m n "   E l e m e n t I d = " 1 3 6 6 6 3 6 0 8 6 "   D a t a T y p e = " T e x t " > Q l t y I n s p e c t i o n _ S o u r c e _ C u s t o m _ 4 < / Q l t y I n s p e c t i o n _ S o u r c e _ C u s t o m _ 4 > - 
-         < Q l t y I n s p e c t i o n _ S o u r c e _ C u s t o m _ 5   E l e m e n t T y p e = " C o l u m n "   E l e m e n t I d = " 2 0 0 4 3 3 2 7 0 3 "   D a t a T y p e = " T e x t " > Q l t y I n s p e c t i o n _ S o u r c e _ C u s t o m _ 5 < / Q l t y I n s p e c t i o n _ S o u r c e _ C u s t o m _ 5 > - 
-         < Q l t y I n s p e c t i o n _ S o u r c e _ C u s t o m _ 6   E l e m e n t T y p e = " C o l u m n "   E l e m e n t I d = " 9 1 2 4 2 8 5 2 "   D a t a T y p e = " T e x t " > Q l t y I n s p e c t i o n _ S o u r c e _ C u s t o m _ 6 < / Q l t y I n s p e c t i o n _ S o u r c e _ C u s t o m _ 6 > - 
-         < Q l t y I n s p e c t i o n _ S o u r c e _ C u s t o m _ 7   E l e m e n t T y p e = " C o l u m n "   E l e m e n t I d = " 7 2 8 9 3 9 4 6 9 "   D a t a T y p e = " I n t e g e r " > Q l t y I n s p e c t i o n _ S o u r c e _ C u s t o m _ 7 < / Q l t y I n s p e c t i o n _ S o u r c e _ C u s t o m _ 7 > - 
-         < Q l t y I n s p e c t i o n _ S o u r c e _ C u s t o m _ 8   E l e m e n t T y p e = " C o l u m n "   E l e m e n t I d = " 3 7 7 5 4 4 7 4 2 "   D a t a T y p e = " I n t e g e r " > Q l t y I n s p e c t i o n _ S o u r c e _ C u s t o m _ 8 < / Q l t y I n s p e c t i o n _ S o u r c e _ C u s t o m _ 8 > - 
-         < Q l t y I n s p e c t i o n _ S o u r c e _ C u s t o m _ 9   E l e m e n t T y p e = " C o l u m n "   E l e m e n t I d = " 2 6 0 1 5 1 8 7 5 "   D a t a T y p e = " D e c i m a l " > Q l t y I n s p e c t i o n _ S o u r c e _ C u s t o m _ 9 < / Q l t y I n s p e c t i o n _ S o u r c e _ C u s t o m _ 9 > - 
-         < Q l t y I n s p e c t i o n _ S o u r c e _ D o c u m e n t _ N o _   E l e m e n t T y p e = " C o l u m n "   E l e m e n t I d = " 1 6 7 5 9 1 6 2 8 8 "   D a t a T y p e = " C o d e " > Q l t y I n s p e c t i o n _ S o u r c e _ D o c u m e n t _ N o _ < / Q l t y I n s p e c t i o n _ S o u r c e _ D o c u m e n t _ N o _ > - 
-         < Q l t y I n s p e c t i o n _ S o u r c e _ I t e m _ D e s c r i p t i o n   E l e m e n t T y p e = " C o l u m n "   E l e m e n t I d = " 6 4 6 8 9 0 6 3 0 "   D a t a T y p e = " T e x t " > Q l t y I n s p e c t i o n _ S o u r c e _ I t e m _ D e s c r i p t i o n < / Q l t y I n s p e c t i o n _ S o u r c e _ I t e m _ D e s c r i p t i o n > - 
-         < Q l t y I n s p e c t i o n _ S o u r c e _ I t e m _ D e s c r i p t i o n 2   E l e m e n t T y p e = " C o l u m n "   E l e m e n t I d = " 1 2 7 9 3 6 9 3 5 2 "   D a t a T y p e = " T e x t " > Q l t y I n s p e c t i o n _ S o u r c e _ I t e m _ D e s c r i p t i o n 2 < / Q l t y I n s p e c t i o n _ S o u r c e _ I t e m _ D e s c r i p t i o n 2 > - 
-         < Q l t y I n s p e c t i o n _ S o u r c e _ I t e m _ N o _   E l e m e n t T y p e = " C o l u m n "   E l e m e n t I d = " 1 2 6 8 0 5 0 5 1 8 "   D a t a T y p e = " C o d e " > Q l t y I n s p e c t i o n _ S o u r c e _ I t e m _ N o _ < / Q l t y I n s p e c t i o n _ S o u r c e _ I t e m _ N o _ > - 
-         < Q l t y I n s p e c t i o n _ S o u r c e _ L o t _ N o _   E l e m e n t T y p e = " C o l u m n "   E l e m e n t I d = " 1 1 2 3 5 5 1 3 1 2 "   D a t a T y p e = " C o d e " > Q l t y I n s p e c t i o n _ S o u r c e _ L o t _ N o _ < / Q l t y I n s p e c t i o n _ S o u r c e _ L o t _ N o _ > - 
-         < Q l t y I n s p e c t i o n _ S o u r c e _ P a c k a g e _ N o _   E l e m e n t T y p e = " C o l u m n "   E l e m e n t I d = " 1 9 6 1 1 2 9 9 7 "   D a t a T y p e = " C o d e " > Q l t y I n s p e c t i o n _ S o u r c e _ P a c k a g e _ N o _ < / Q l t y I n s p e c t i o n _ S o u r c e _ P a c k a g e _ N o _ > - 
-         < Q l t y I n s p e c t i o n _ S o u r c e _ S e r i a l _ N o _   E l e m e n t T y p e = " C o l u m n "   E l e m e n t I d = " 1 5 2 0 5 9 1 4 4 7 "   D a t a T y p e = " C o d e " > Q l t y I n s p e c t i o n _ S o u r c e _ S e r i a l _ N o _ < / Q l t y I n s p e c t i o n _ S o u r c e _ S e r i a l _ N o _ > - 
-         < Q l t y I n s p e c t i o n _ S o u r c e _ T a s k _ N o _   E l e m e n t T y p e = " C o l u m n "   E l e m e n t I d = " 3 8 4 6 4 4 1 8 2 "   D a t a T y p e = " C o d e " > Q l t y I n s p e c t i o n _ S o u r c e _ T a s k _ N o _ < / Q l t y I n s p e c t i o n _ S o u r c e _ T a s k _ N o _ > - 
-         < Q l t y I n s p e c t i o n _ S o u r c e _ V a r i a n t _ C o d e   E l e m e n t T y p e = " C o l u m n "   E l e m e n t I d = " 1 6 0 8 4 0 3 8 2 1 "   D a t a T y p e = " C o d e " > Q l t y I n s p e c t i o n _ S o u r c e _ V a r i a n t _ C o d e < / Q l t y I n s p e c t i o n _ S o u r c e _ V a r i a n t _ C o d e > - 
-         < Q l t y I n s p e c t i o n _ S t a t u s   E l e m e n t T y p e = " C o l u m n "   E l e m e n t I d = " 8 5 1 7 5 2 7 6 8 "   D a t a T y p e = " E n u m " > Q l t y I n s p e c t i o n _ S t a t u s < / Q l t y I n s p e c t i o n _ S t a t u s > - 
-         < R e i n s p e c t i o n S e q u e n c e I n f o r m a t i o n   E l e m e n t T y p e = " C o l u m n "   E l e m e n t I d = " 7 4 9 5 1 6 5 4 3 "   D a t a T y p e = " T e x t " > R e i n s p e c t i o n S e q u e n c e I n f o r m a t i o n < / R e i n s p e c t i o n S e q u e n c e I n f o r m a t i o n > - 
-         < C u r r e n t I n s p e c t i o n L i n e   E l e m e n t T y p e = " D a t a I t e m "   E l e m e n t I d = " 1 1 9 3 2 1 9 5 9 6 " > - 
-             < C a r r i a g e R e t u r n P e r s o n F i e l d D e t a i l s   E l e m e n t T y p e = " C o l u m n "   E l e m e n t I d = " 9 9 8 2 6 3 6 9 8 "   D a t a T y p e = " T e x t " > C a r r i a g e R e t u r n P e r s o n F i e l d D e t a i l s < / C a r r i a g e R e t u r n P e r s o n F i e l d D e t a i l s > - 
-             < C o n d i t i o n L a b e l _ 1   E l e m e n t T y p e = " C o l u m n "   E l e m e n t I d = " 1 2 2 7 8 8 1 1 9 4 "   D a t a T y p e = " T e x t " > C o n d i t i o n L a b e l _ 1 < / C o n d i t i o n L a b e l _ 1 > - 
-             < C o n d i t i o n L a b e l _ 2   E l e m e n t T y p e = " C o l u m n "   E l e m e n t I d = " 1 8 6 5 5 7 7 8 1 1 "   D a t a T y p e = " T e x t " > C o n d i t i o n L a b e l _ 2 < / C o n d i t i o n L a b e l _ 2 > - 
-             < F i e l d _ C o d e   E l e m e n t T y p e = " C o l u m n "   E l e m e n t I d = " 1 3 2 7 2 5 5 7 3 "   D a t a T y p e = " C o d e " > F i e l d _ C o d e < / F i e l d _ C o d e > - 
-             < F i e l d _ D e s c r i p t i o n   E l e m e n t T y p e = " C o l u m n "   E l e m e n t I d = " 1 4 6 8 6 2 1 2 9 8 "   D a t a T y p e = " T e x t " > F i e l d _ D e s c r i p t i o n < / F i e l d _ D e s c r i p t i o n > - 
-             < F i e l d _ E n t e r e d B y N a m e A n d T i m e s t a m p   E l e m e n t T y p e = " C o l u m n "   E l e m e n t I d = " 1 0 6 8 4 2 0 5 9 2 "   D a t a T y p e = " T e x t " > F i e l d _ E n t e r e d B y N a m e A n d T i m e s t a m p < / F i e l d _ E n t e r e d B y N a m e A n d T i m e s t a m p > - 
-             < F i e l d _ H a s E n t e r e d V a l u e   E l e m e n t T y p e = " C o l u m n "   E l e m e n t I d = " 1 7 1 6 2 6 5 8 2 4 "   D a t a T y p e = " B o o l e a n " > F i e l d _ H a s E n t e r e d V a l u e < / F i e l d _ H a s E n t e r e d V a l u e > - 
-             < F i e l d _ I f P e r s o n E m a i l   E l e m e n t T y p e = " C o l u m n "   E l e m e n t I d = " 1 3 4 6 0 5 7 6 5 0 "   D a t a T y p e = " T e x t " > F i e l d _ I f P e r s o n E m a i l < / F i e l d _ I f P e r s o n E m a i l > - 
-             < F i e l d _ I f P e r s o n N a m e   E l e m e n t T y p e = " C o l u m n "   E l e m e n t I d = " 4 1 4 7 0 2 4 4 3 "   D a t a T y p e = " T e x t " > F i e l d _ I f P e r s o n N a m e < / F i e l d _ I f P e r s o n N a m e > - 
-             < F i e l d _ I f P e r s o n P h o n e   E l e m e n t T y p e = " C o l u m n "   E l e m e n t I d = " 1 9 7 4 1 8 8 4 6 2 "   D a t a T y p e = " T e x t " > F i e l d _ I f P e r s o n P h o n e < / F i e l d _ I f P e r s o n P h o n e > - 
-             < F i e l d _ I f P e r s o n T i t l e   E l e m e n t T y p e = " C o l u m n "   E l e m e n t I d = " 1 0 0 4 6 0 9 5 4 2 "   D a t a T y p e = " T e x t " > F i e l d _ I f P e r s o n T i t l e < / F i e l d _ I f P e r s o n T i t l e > - 
-             < F i e l d _ I s L a b e l   E l e m e n t T y p e = " C o l u m n "   E l e m e n t I d = " 2 0 4 3 1 9 3 9 4 0 "   D a t a T y p e = " B o o l e a n " > F i e l d _ I s L a b e l < / F i e l d _ I s L a b e l > - 
-             < F i e l d _ I s P e r s o n F i e l d   E l e m e n t T y p e = " C o l u m n "   E l e m e n t I d = " 4 3 4 5 4 6 6 1 1 "   D a t a T y p e = " B o o l e a n " > F i e l d _ I s P e r s o n F i e l d < / F i e l d _ I s P e r s o n F i e l d > - 
-             < F i e l d _ I s T e x t   E l e m e n t T y p e = " C o l u m n "   E l e m e n t I d = " 5 9 3 6 9 2 0 1 "   D a t a T y p e = " B o o l e a n " > F i e l d _ I s T e x t < / F i e l d _ I s T e x t > - 
-             < F i e l d _ L i n e C o m m e n t a r y   E l e m e n t T y p e = " C o l u m n "   E l e m e n t I d = " 1 8 5 3 8 0 0 2 5 7 "   D a t a T y p e = " T e x t " > F i e l d _ L i n e C o m m e n t a r y < / F i e l d _ L i n e C o m m e n t a r y > - 
-             < F i e l d _ M o d i f i e d B y U s e r E m a i l   E l e m e n t T y p e = " C o l u m n "   E l e m e n t I d = " 2 0 5 3 4 9 0 5 4 5 "   D a t a T y p e = " T e x t " > F i e l d _ M o d i f i e d B y U s e r E m a i l < / F i e l d _ M o d i f i e d B y U s e r E m a i l > - 
-             < F i e l d _ M o d i f i e d B y U s e r I D   E l e m e n t T y p e = " C o l u m n "   E l e m e n t I d = " 1 3 6 3 9 8 7 2 2 2 "   D a t a T y p e = " C o d e " > F i e l d _ M o d i f i e d B y U s e r I D < / F i e l d _ M o d i f i e d B y U s e r I D > - 
-             < F i e l d _ M o d i f i e d B y U s e r J o b T i t l e   E l e m e n t T y p e = " C o l u m n "   E l e m e n t I d = " 7 1 3 3 5 4 3 4 0 "   D a t a T y p e = " T e x t " > F i e l d _ M o d i f i e d B y U s e r J o b T i t l e < / F i e l d _ M o d i f i e d B y U s e r J o b T i t l e > - 
-             < F i e l d _ M o d i f i e d B y U s e r N a m e   E l e m e n t T y p e = " C o l u m n "   E l e m e n t I d = " 7 9 8 2 2 1 9 1 6 "   D a t a T y p e = " T e x t " > F i e l d _ M o d i f i e d B y U s e r N a m e < / F i e l d _ M o d i f i e d B y U s e r N a m e > - 
-             < F i e l d _ M o d i f i e d B y U s e r P h o n e   E l e m e n t T y p e = " C o l u m n "   E l e m e n t I d = " 1 2 9 4 9 7 8 5 4 5 "   D a t a T y p e = " T e x t " > F i e l d _ M o d i f i e d B y U s e r P h o n e < / F i e l d _ M o d i f i e d B y U s e r P h o n e > - 
-             < F i e l d _ M o d i f i e d D a t e T i m e   E l e m e n t T y p e = " C o l u m n "   E l e m e n t I d = " 1 6 5 4 4 9 3 6 9 6 "   D a t a T y p e = " D a t e T i m e " > F i e l d _ M o d i f i e d D a t e T i m e < / F i e l d _ M o d i f i e d D a t e T i m e > - 
-             < F i e l d _ T y p e   E l e m e n t T y p e = " C o l u m n "   E l e m e n t I d = " 1 3 2 8 1 6 4 0 1 6 "   D a t a T y p e = " E n u m " > F i e l d _ T y p e < / F i e l d _ T y p e > - 
-             < I f P e r s o n D e s c r i p t i o n   E l e m e n t T y p e = " C o l u m n "   E l e m e n t I d = " 1 9 0 1 4 5 5 0 2 5 "   D a t a T y p e = " T e x t " > I f P e r s o n D e s c r i p t i o n < / I f P e r s o n D e s c r i p t i o n > - 
-             < I f P e r s o n M o d i f i e d B y U s e r E m a i l   E l e m e n t T y p e = " C o l u m n "   E l e m e n t I d = " 4 4 0 5 4 0 4 6 4 "   D a t a T y p e = " T e x t " > I f P e r s o n M o d i f i e d B y U s e r E m a i l < / I f P e r s o n M o d i f i e d B y U s e r E m a i l > - 
-             < I f P e r s o n M o d i f i e d D a t e T i m e   E l e m e n t T y p e = " C o l u m n "   E l e m e n t I d = " 8 1 4 8 1 3 6 2 3 "   D a t a T y p e = " T e x t " > I f P e r s o n M o d i f i e d D a t e T i m e < / I f P e r s o n M o d i f i e d D a t e T i m e > - 
-             < L a b e l F i e l d _ D e s c r i p t i o n   E l e m e n t T y p e = " C o l u m n "   E l e m e n t I d = " 3 2 9 5 4 9 8 4 0 "   D a t a T y p e = " T e x t " > L a b e l F i e l d _ D e s c r i p t i o n < / L a b e l F i e l d _ D e s c r i p t i o n > - 
-             < N u m e r i c _ V a l u e   E l e m e n t T y p e = " C o l u m n "   E l e m e n t I d = " 4 6 0 4 1 2 6 4 6 "   D a t a T y p e = " D e c i m a l " > N u m e r i c _ V a l u e < / N u m e r i c _ V a l u e > - 
-             < P r o m p t e d R e s u l t C a p t i o n _ 1   E l e m e n t T y p e = " C o l u m n "   E l e m e n t I d = " 1 5 4 8 2 0 5 1 6 9 "   D a t a T y p e = " T e x t " > P r o m p t e d R e s u l t C a p t i o n _ 1 < / P r o m p t e d R e s u l t C a p t i o n _ 1 > - 
-             < P r o m p t e d R e s u l t C a p t i o n _ 1 0   E l e m e n t T y p e = " C o l u m n "   E l e m e n t I d = " 6 6 5 1 3 7 3 2 1 "   D a t a T y p e = " T e x t " > P r o m p t e d R e s u l t C a p t i o n _ 1 0 < / P r o m p t e d R e s u l t C a p t i o n _ 1 0 > - 
-             < P r o m p t e d R e s u l t C a p t i o n _ 2   E l e m e n t T y p e = " C o l u m n "   E l e m e n t I d = " 2 1 0 9 0 6 5 5 1 0 "   D a t a T y p e = " T e x t " > P r o m p t e d R e s u l t C a p t i o n _ 2 < / P r o m p t e d R e s u l t C a p t i o n _ 2 > - 
-             < P r o m p t e d R e s u l t C a p t i o n _ 3   E l e m e n t T y p e = " C o l u m n "   E l e m e n t I d = " 1 4 7 1 3 6 8 8 9 3 "   D a t a T y p e = " T e x t " > P r o m p t e d R e s u l t C a p t i o n _ 3 < / P r o m p t e d R e s u l t C a p t i o n _ 3 > - 
-             < P r o m p t e d R e s u l t C a p t i o n _ 4   E l e m e n t T y p e = " C o l u m n "   E l e m e n t I d = " 8 3 3 6 7 2 2 7 6 "   D a t a T y p e = " T e x t " > P r o m p t e d R e s u l t C a p t i o n _ 4 < / P r o m p t e d R e s u l t C a p t i o n _ 4 > - 
-             < P r o m p t e d R e s u l t C a p t i o n _ 5   E l e m e n t T y p e = " C o l u m n "   E l e m e n t I d = " 1 9 5 9 7 5 6 5 9 "   D a t a T y p e = " T e x t " > P r o m p t e d R e s u l t C a p t i o n _ 5 < / P r o m p t e d R e s u l t C a p t i o n _ 5 > - 
-             < P r o m p t e d R e s u l t C a p t i o n _ 6   E l e m e n t T y p e = " C o l u m n "   E l e m e n t I d = " 4 4 1 7 2 0 9 5 8 "   D a t a T y p e = " T e x t " > P r o m p t e d R e s u l t C a p t i o n _ 6 < / P r o m p t e d R e s u l t C a p t i o n _ 6 > - 
-             < P r o m p t e d R e s u l t C a p t i o n _ 7   E l e m e n t T y p e = " C o l u m n "   E l e m e n t I d = " 1 0 7 9 4 1 7 5 7 5 "   D a t a T y p e = " T e x t " > P r o m p t e d R e s u l t C a p t i o n _ 7 < / P r o m p t e d R e s u l t C a p t i o n _ 7 > - 
-             < P r o m p t e d R e s u l t C a p t i o n _ 8   E l e m e n t T y p e = " C o l u m n "   E l e m e n t I d = " 1 0 3 9 0 2 9 1 2 "   D a t a T y p e = " T e x t " > P r o m p t e d R e s u l t C a p t i o n _ 8 < / P r o m p t e d R e s u l t C a p t i o n _ 8 > - 
-             < P r o m p t e d R e s u l t C a p t i o n _ 9   E l e m e n t T y p e = " C o l u m n "   E l e m e n t I d = " 7 4 1 5 9 9 5 2 9 "   D a t a T y p e = " T e x t " > P r o m p t e d R e s u l t C a p t i o n _ 9 < / P r o m p t e d R e s u l t C a p t i o n _ 9 > - 
-             < P r o m p t e d R e s u l t C o n d i t i o n D e s c r i p t i o n _ 1   E l e m e n t T y p e = " C o l u m n "   E l e m e n t I d = " 1 7 7 6 7 4 4 4 3 4 "   D a t a T y p e = " T e x t " > P r o m p t e d R e s u l t C o n d i t i o n D e s c r i p t i o n _ 1 < / P r o m p t e d R e s u l t C o n d i t i o n D e s c r i p t i o n _ 1 > - 
-             < P r o m p t e d R e s u l t C o n d i t i o n D e s c r i p t i o n _ 1 0   E l e m e n t T y p e = " C o l u m n "   E l e m e n t I d = " 1 0 2 8 7 8 8 8 8 2 "   D a t a T y p e = " T e x t " > P r o m p t e d R e s u l t C o n d i t i o n D e s c r i p t i o n _ 1 0 < / P r o m p t e d R e s u l t C o n d i t i o n D e s c r i p t i o n _ 1 0 > - 
-             < P r o m p t e d R e s u l t C o n d i t i o n D e s c r i p t i o n _ 2   E l e m e n t T y p e = " C o l u m n "   E l e m e n t I d = " 1 1 3 9 0 4 7 8 1 7 "   D a t a T y p e = " T e x t " > P r o m p t e d R e s u l t C o n d i t i o n D e s c r i p t i o n _ 2 < / P r o m p t e d R e s u l t C o n d i t i o n D e s c r i p t i o n _ 2 > - 
-             < P r o m p t e d R e s u l t C o n d i t i o n D e s c r i p t i o n _ 3   E l e m e n t T y p e = " C o l u m n "   E l e m e n t I d = " 5 0 1 3 5 1 2 0 0 "   D a t a T y p e = " T e x t " > P r o m p t e d R e s u l t C o n d i t i o n D e s c r i p t i o n _ 3 < / P r o m p t e d R e s u l t C o n d i t i o n D e s c r i p t i o n _ 3 > - 
-             < P r o m p t e d R e s u l t C o n d i t i o n D e s c r i p t i o n _ 4   E l e m e n t T y p e = " C o l u m n "   E l e m e n t I d = " 6 7 0 2 6 0 2 2 3 "   D a t a T y p e = " T e x t " > P r o m p t e d R e s u l t C o n d i t i o n D e s c r i p t i o n _ 4 < / P r o m p t e d R e s u l t C o n d i t i o n D e s c r i p t i o n _ 4 > - 
-             < P r o m p t e d R e s u l t C o n d i t i o n D e s c r i p t i o n _ 5   E l e m e n t T y p e = " C o l u m n "   E l e m e n t I d = " 3 2 5 6 3 6 0 6 "   D a t a T y p e = " T e x t " > P r o m p t e d R e s u l t C o n d i t i o n D e s c r i p t i o n _ 5 < / P r o m p t e d R e s u l t C o n d i t i o n D e s c r i p t i o n _ 5 > - 
-             < P r o m p t e d R e s u l t C o n d i t i o n D e s c r i p t i o n _ 6   E l e m e n t T y p e = " C o l u m n "   E l e m e n t I d = " 6 0 5 1 3 3 0 1 1 "   D a t a T y p e = " T e x t " > P r o m p t e d R e s u l t C o n d i t i o n D e s c r i p t i o n _ 6 < / P r o m p t e d R e s u l t C o n d i t i o n D e s c r i p t i o n _ 6 > - 
-             < P r o m p t e d R e s u l t C o n d i t i o n D e s c r i p t i o n _ 7   E l e m e n t T y p e = " C o l u m n "   E l e m e n t I d = " 1 2 4 2 8 2 9 6 2 8 "   D a t a T y p e = " T e x t " > P r o m p t e d R e s u l t C o n d i t i o n D e s c r i p t i o n _ 7 < / P r o m p t e d R e s u l t C o n d i t i o n D e s c r i p t i o n _ 7 > - 
-             < P r o m p t e d R e s u l t C o n d i t i o n D e s c r i p t i o n _ 8   E l e m e n t T y p e = " C o l u m n "   E l e m e n t I d = " 1 0 7 3 9 2 0 6 0 5 "   D a t a T y p e = " T e x t " > P r o m p t e d R e s u l t C o n d i t i o n D e s c r i p t i o n _ 8 < / P r o m p t e d R e s u l t C o n d i t i o n D e s c r i p t i o n _ 8 > - 
-             < P r o m p t e d R e s u l t C o n d i t i o n D e s c r i p t i o n _ 9   E l e m e n t T y p e = " C o l u m n "   E l e m e n t I d = " 1 7 1 1 6 1 7 2 2 2 "   D a t a T y p e = " T e x t " > P r o m p t e d R e s u l t C o n d i t i o n D e s c r i p t i o n _ 9 < / P r o m p t e d R e s u l t C o n d i t i o n D e s c r i p t i o n _ 9 > - 
-             < P r o m p t e d R e s u l t V i s i b l e _ 1   E l e m e n t T y p e = " C o l u m n "   E l e m e n t I d = " 1 3 9 9 7 0 4 4 1 7 "   D a t a T y p e = " B o o l e a n " > P r o m p t e d R e s u l t V i s i b l e _ 1 < / P r o m p t e d R e s u l t V i s i b l e _ 1 > - 
-             < P r o m p t e d R e s u l t V i s i b l e _ 1 0   E l e m e n t T y p e = " C o l u m n "   E l e m e n t I d = " 6 6 3 6 8 2 6 1 7 "   D a t a T y p e = " B o o l e a n " > P r o m p t e d R e s u l t V i s i b l e _ 1 0 < / P r o m p t e d R e s u l t V i s i b l e _ 1 0 > - 
-             < P r o m p t e d R e s u l t V i s i b l e _ 2   E l e m e n t T y p e = " C o l u m n "   E l e m e n t I d = " 2 0 3 7 4 0 1 0 3 4 "   D a t a T y p e = " B o o l e a n " > P r o m p t e d R e s u l t V i s i b l e _ 2 < / P r o m p t e d R e s u l t V i s i b l e _ 2 > - 
-             < P r o m p t e d R e s u l t V i s i b l e _ 3   E l e m e n t T y p e = " C o l u m n "   E l e m e n t I d = " 1 6 1 9 8 6 9 6 4 5 "   D a t a T y p e = " B o o l e a n " > P r o m p t e d R e s u l t V i s i b l e _ 3 < / P r o m p t e d R e s u l t V i s i b l e _ 3 > - 
-             < P r o m p t e d R e s u l t V i s i b l e _ 4   E l e m e n t T y p e = " C o l u m n "   E l e m e n t I d = " 9 8 2 1 7 3 0 2 8 "   D a t a T y p e = " B o o l e a n " > P r o m p t e d R e s u l t V i s i b l e _ 4 < / P r o m p t e d R e s u l t V i s i b l e _ 4 > - 
-             < P r o m p t e d R e s u l t V i s i b l e _ 5   E l e m e n t T y p e = " C o l u m n "   E l e m e n t I d = " 3 4 4 4 7 6 4 1 1 "   D a t a T y p e = " B o o l e a n " > P r o m p t e d R e s u l t V i s i b l e _ 5 < / P r o m p t e d R e s u l t V i s i b l e _ 5 > - 
-             < P r o m p t e d R e s u l t V i s i b l e _ 6   E l e m e n t T y p e = " C o l u m n "   E l e m e n t I d = " 2 9 3 2 2 0 2 0 6 "   D a t a T y p e = " B o o l e a n " > P r o m p t e d R e s u l t V i s i b l e _ 6 < / P r o m p t e d R e s u l t V i s i b l e _ 6 > - 
-             < P r o m p t e d R e s u l t V i s i b l e _ 7   E l e m e n t T y p e = " C o l u m n "   E l e m e n t I d = " 9 3 0 9 1 6 8 2 3 "   D a t a T y p e = " B o o l e a n " > P r o m p t e d R e s u l t V i s i b l e _ 7 < / P r o m p t e d R e s u l t V i s i b l e _ 7 > - 
-             < P r o m p t e d R e s u l t V i s i b l e _ 8   E l e m e n t T y p e = " C o l u m n "   E l e m e n t I d = " 4 4 5 9 7 8 4 0 "   D a t a T y p e = " B o o l e a n " > P r o m p t e d R e s u l t V i s i b l e _ 8 < / P r o m p t e d R e s u l t V i s i b l e _ 8 > - 
-             < P r o m p t e d R e s u l t V i s i b l e _ 9   E l e m e n t T y p e = " C o l u m n "   E l e m e n t I d = " 5 9 3 0 9 8 7 7 7 "   D a t a T y p e = " B o o l e a n " > P r o m p t e d R e s u l t V i s i b l e _ 9 < / P r o m p t e d R e s u l t V i s i b l e _ 9 > - 
-             < T e s t _ R e s u l t   E l e m e n t T y p e = " C o l u m n "   E l e m e n t I d = " 1 2 7 1 0 6 2 1 4 1 "   D a t a T y p e = " C o d e " > T e s t _ R e s u l t < / T e s t _ R e s u l t > - 
-             < T e s t _ R e s u l t D e s c r i p t i o n   E l e m e n t T y p e = " C o l u m n "   E l e m e n t I d = " 1 9 4 3 4 5 8 6 8 5 "   D a t a T y p e = " T e x t " > T e s t _ R e s u l t D e s c r i p t i o n < / T e s t _ R e s u l t D e s c r i p t i o n > - 
-             < T e s t _ V a l u e   E l e m e n t T y p e = " C o l u m n "   E l e m e n t I d = " 8 1 3 5 6 4 5 2 1 "   D a t a T y p e = " T e x t " > T e s t _ V a l u e < / T e s t _ V a l u e > - 
-             < W o r d D e s c r i p t i o n   E l e m e n t T y p e = " C o l u m n "   E l e m e n t I d = " 5 4 4 0 8 2 0 6 7 "   D a t a T y p e = " T e x t " > W o r d D e s c r i p t i o n < / W o r d D e s c r i p t i o n > - 
-             < W o r d M o d i f i e d B y U s e r N a m e   E l e m e n t T y p e = " C o l u m n "   E l e m e n t I d = " 1 6 2 5 9 3 3 4 7 9 "   D a t a T y p e = " T e x t " > W o r d M o d i f i e d B y U s e r N a m e < / W o r d M o d i f i e d B y U s e r N a m e > - 
-             < W o r d M o d i f i e d D a t e T i m e   E l e m e n t T y p e = " C o l u m n "   E l e m e n t I d = " 2 0 8 1 0 1 2 8 7 5 "   D a t a T y p e = " T e x t " > W o r d M o d i f i e d D a t e T i m e < / W o r d M o d i f i e d D a t e T i m e > - 
-             < W o r d T e s t V a l u e   E l e m e n t T y p e = " C o l u m n "   E l e m e n t I d = " 1 4 4 7 8 2 4 1 2 2 "   D a t a T y p e = " T e x t " > W o r d T e s t V a l u e < / W o r d T e s t V a l u e > - 
-         < / C u r r e n t I n s p e c t i o n L i n e > - 
-     < / C u r r e n t I n s p e c t i o n > - 
- < / N a v W o r d R e p o r t X m l P a r t > 
-</file>
-
-<file path=customXml/item3.xml>��< ? x m l   v e r s i o n = " 1 . 0 "   e n c o d i n g = " u t f - 1 6 " ? > - 
- < N a v W o r d R e p o r t X m l P a r t   x m l n s = " u r n : m i c r o s o f t - d y n a m i c s - n a v / r e p o r t s / Q l t y _ G e n e r a l _ P u r p o s e _ I n s p e c t / 2 0 4 0 5 / " > - 
-     < B C R e p o r t I n f o r m a t i o n > - 
-         < R e p o r t M e t a d a t a > - 
-             < E x t e n s i o n I d > E x t e n s i o n   I D < / E x t e n s i o n I d > - 
-             < E x t e n s i o n N a m e > E x t e n s i o n   N a m e < / E x t e n s i o n N a m e > - 
-             < E x t e n s i o n P u b l i s h e r > E x t e n s i o n   P u b l i s h e r < / E x t e n s i o n P u b l i s h e r > - 
-             < E x t e n s i o n V e r s i o n > E x t e n s i o n   V e r s i o n < / E x t e n s i o n V e r s i o n > - 
-             < R e p o r t I d > R e p o r t   I D < / R e p o r t I d > - 
-             < R e p o r t N a m e > R e p o r t   N a m e < / R e p o r t N a m e > - 
-             < A b o u t T h i s R e p o r t T i t l e > A b o u t   T h i s   R e p o r t   T i t l e < / A b o u t T h i s R e p o r t T i t l e > - 
-             < A b o u t T h i s R e p o r t T e x t > A b o u t   T h i s   R e p o r t   T e x t < / A b o u t T h i s R e p o r t T e x t > - 
-             < R e p o r t H e l p L i n k > R e p o r t   H e l p   L i n k < / R e p o r t H e l p L i n k > - 
-         < / R e p o r t M e t a d a t a > - 
-         < R e p o r t R e q u e s t > - 
-             < T e n a n t E n t r a I d > T e n a n t   E n t r a   I d < / T e n a n t E n t r a I d > - 
-             < E n v i r o n m e n t N a m e > E n v i r o n m e n t   N a m e < / E n v i r o n m e n t N a m e > - 
-             < E n v i r o n m e n t T y p e > E n v i r o n m e n t   T y p e < / E n v i r o n m e n t T y p e > - 
-             < C o m p a n y N a m e > C o m p a n y   N a m e < / C o m p a n y N a m e > - 
-             < C o m p a n y D i s p l a y N a m e > C o m p a n y   D i s p l a y   N a m e < / C o m p a n y D i s p l a y N a m e > - 
-             < C o m p a n y I d > C o m p a n y   I D < / C o m p a n y I d > - 
-             < U s e r N a m e > U s e r   N a m e < / U s e r N a m e > - 
-             < D a t e A n d T i m e > D a t e   a n d   T i m e < / D a t e A n d T i m e > - 
-             < L a n g u a g e > L a n g u a g e < / L a n g u a g e > - 
-             < F o r m a t R e g i o n > F o r m a t   R e g i o n < / F o r m a t R e g i o n > - 
-             < D a t e T i m e V a l u e s > - 
-                 < Y e a r > Y e a r < / Y e a r > - 
-                 < M o n t h N u m b e r > M o n t h   N u m b e r < / M o n t h N u m b e r > - 
-                 < D a y N u m b e r > D a y   N u m b e r < / D a y N u m b e r > - 
-                 < H o u r > H o u r < / H o u r > - 
-                 < M i n u t e > M i n u t e < / M i n u t e > - 
-             < / D a t e T i m e V a l u e s > - 
-         < / R e p o r t R e q u e s t > - 
-     < / B C R e p o r t I n f o r m a t i o n > - 
-     < L a b e l s > - 
-         < C o m p l e t e d B y L a b e l > C o m p l e t e d B y L a b e l < / C o m p l e t e d B y L a b e l > - 
-         < C o m p l e t e d D a t e L a b e l > C o m p l e t e d D a t e L a b e l < / C o m p l e t e d D a t e L a b e l > - 
-         < D a t e L a b e l > D a t e L a b e l < / D a t e L a b e l > - 
-         < F i e l d L a b e l > F i e l d L a b e l < / F i e l d L a b e l > - 
-         < I n s p e c t i o n L a b e l > I n s p e c t i o n L a b e l < / I n s p e c t i o n L a b e l > - 
-         < I t e m L a b e l > I t e m L a b e l < / I t e m L a b e l > - 
-         < I t e m T r a c k i n g L a b e l > I t e m T r a c k i n g L a b e l < / I t e m T r a c k i n g L a b e l > - 
-         < L a s t M o d i f i e d B y L a b e l > L a s t M o d i f i e d B y L a b e l < / L a s t M o d i f i e d B y L a b e l > - 
-         < R e p o r t T i t l e L a b e l > R e p o r t T i t l e L a b e l < / R e p o r t T i t l e L a b e l > - 
-         < R e s u l t L a b e l > R e s u l t L a b e l < / R e s u l t L a b e l > - 
-         < T e s t D o c u m e n t N o L a b e l > T e s t D o c u m e n t N o L a b e l < / T e s t D o c u m e n t N o L a b e l > - 
-     < / L a b e l s > - 
-     < C u r r e n t I n s p e c t i o n > - 
-         < A p p r o v e r N a m e L a b e l > A p p r o v e r N a m e L a b e l < / A p p r o v e r N a m e L a b e l > - 
-         < A p p r o v e r S i g n a t u r e L a b e l > A p p r o v e r S i g n a t u r e L a b e l < / A p p r o v e r S i g n a t u r e L a b e l > - 
-         < C O A C o n t a c t _ A l l > C O A C o n t a c t _ A l l < / C O A C o n t a c t _ A l l > - 
-         < C O A C o n t a c t _ R o w 1 > C O A C o n t a c t _ R o w 1 < / C O A C o n t a c t _ R o w 1 > - 
-         < C O A C o n t a c t _ R o w 2 > C O A C o n t a c t _ R o w 2 < / C O A C o n t a c t _ R o w 2 > - 
-         < C O A C o n t a c t _ R o w 3 > C O A C o n t a c t _ R o w 3 < / C O A C o n t a c t _ R o w 3 > - 
-         < C O A C o n t a c t _ R o w 4 > C O A C o n t a c t _ R o w 4 < / C O A C o n t a c t _ R o w 4 > - 
-         < C O A C o n t a c t _ R o w 5 > C O A C o n t a c t _ R o w 5 < / C O A C o n t a c t _ R o w 5 > - 
-         < C O A C o n t a c t _ R o w 6 > C O A C o n t a c t _ R o w 6 < / C O A C o n t a c t _ R o w 6 > - 
-         < C O A C o n t a c t _ R o w 7 > C O A C o n t a c t _ R o w 7 < / C O A C o n t a c t _ R o w 7 > - 
-         < C O A C o n t a c t _ R o w 8 > C O A C o n t a c t _ R o w 8 < / C O A C o n t a c t _ R o w 8 > - 
-         < C o m p a n y I n f o r m a t i o n _ A l l > C o m p a n y I n f o r m a t i o n _ A l l < / C o m p a n y I n f o r m a t i o n _ A l l > - 
-         < C o m p a n y I n f o r m a t i o n _ R o w 1 > C o m p a n y I n f o r m a t i o n _ R o w 1 < / C o m p a n y I n f o r m a t i o n _ R o w 1 > - 
-         < C o m p a n y I n f o r m a t i o n _ R o w 2 > C o m p a n y I n f o r m a t i o n _ R o w 2 < / C o m p a n y I n f o r m a t i o n _ R o w 2 > - 
-         < C o m p a n y I n f o r m a t i o n _ R o w 3 > C o m p a n y I n f o r m a t i o n _ R o w 3 < / C o m p a n y I n f o r m a t i o n _ R o w 3 > - 
-         < C o m p a n y I n f o r m a t i o n _ R o w 4 > C o m p a n y I n f o r m a t i o n _ R o w 4 < / C o m p a n y I n f o r m a t i o n _ R o w 4 > - 
-         < C o m p a n y I n f o r m a t i o n _ R o w 5 > C o m p a n y I n f o r m a t i o n _ R o w 5 < / C o m p a n y I n f o r m a t i o n _ R o w 5 > - 
-         < C o m p a n y I n f o r m a t i o n _ R o w 6 > C o m p a n y I n f o r m a t i o n _ R o w 6 < / C o m p a n y I n f o r m a t i o n _ R o w 6 > - 
-         < C o m p a n y I n f o r m a t i o n _ R o w 7 > C o m p a n y I n f o r m a t i o n _ R o w 7 < / C o m p a n y I n f o r m a t i o n _ R o w 7 > - 
-         < C o m p a n y I n f o r m a t i o n _ R o w 8 > C o m p a n y I n f o r m a t i o n _ R o w 8 < / C o m p a n y I n f o r m a t i o n _ R o w 8 > - 
-         < C o m p a n y L o g o   / > - 
-         < E m a i l L a b e l > E m a i l L a b e l < / E m a i l L a b e l > - 
-         < E m a i l V a l u e > E m a i l V a l u e < / E m a i l V a l u e > - 
-         < F i n i s h e d B y N a m e L a b e l > F i n i s h e d B y N a m e L a b e l < / F i n i s h e d B y N a m e L a b e l > - 
-         < F i n i s h e d B y S i g n a t u r e L a b e l > F i n i s h e d B y S i g n a t u r e L a b e l < / F i n i s h e d B y S i g n a t u r e L a b e l > - 
-         < F i n i s h e d D a t e O n l y > F i n i s h e d D a t e O n l y < / F i n i s h e d D a t e O n l y > - 
-         < H o m e P a g e L a b e l > H o m e P a g e L a b e l < / H o m e P a g e L a b e l > - 
-         < H o m e P a g e V a l u e > H o m e P a g e V a l u e < / H o m e P a g e V a l u e > - 
-         < I n s p e c t i o n I n f o r m a t i o n > I n s p e c t i o n I n f o r m a t i o n < / I n s p e c t i o n I n f o r m a t i o n > - 
-         < I t e m D e s c r i p t i o n > I t e m D e s c r i p t i o n < / I t e m D e s c r i p t i o n > - 
-         < I t e m T r a c k i n g D e s c r i p t i o n > I t e m T r a c k i n g D e s c r i p t i o n < / I t e m T r a c k i n g D e s c r i p t i o n > - 
-         < P h o n e N o L a b e l > P h o n e N o L a b e l < / P h o n e N o L a b e l > - 
-         < P h o n e N o V a l u e > P h o n e N o V a l u e < / P h o n e N o V a l u e > - 
-         < Q l t y I n s p e c t i o n T e m p l a t e _ D e s c r i p t i o n > Q l t y I n s p e c t i o n T e m p l a t e _ D e s c r i p t i o n < / Q l t y I n s p e c t i o n T e m p l a t e _ D e s c r i p t i o n > - 
-         < Q l t y I n s p e c t i o n _ A p p r o v e r _ N a m e > Q l t y I n s p e c t i o n _ A p p r o v e r _ N a m e < / Q l t y I n s p e c t i o n _ A p p r o v e r _ N a m e > - 
-         < Q l t y I n s p e c t i o n _ A p p r o v e r _ T i t l e > Q l t y I n s p e c t i o n _ A p p r o v e r _ T i t l e < / Q l t y I n s p e c t i o n _ A p p r o v e r _ T i t l e > - 
-         < Q l t y I n s p e c t i o n _ D e s c r i p t i o n > Q l t y I n s p e c t i o n _ D e s c r i p t i o n < / Q l t y I n s p e c t i o n _ D e s c r i p t i o n > - 
-         < Q l t y I n s p e c t i o n _ F i n i s h e d _ B y _ E m a i l > Q l t y I n s p e c t i o n _ F i n i s h e d _ B y _ E m a i l < / Q l t y I n s p e c t i o n _ F i n i s h e d _ B y _ E m a i l > - 
-         < Q l t y I n s p e c t i o n _ F i n i s h e d _ B y _ P h o n e > Q l t y I n s p e c t i o n _ F i n i s h e d _ B y _ P h o n e < / Q l t y I n s p e c t i o n _ F i n i s h e d _ B y _ P h o n e > - 
-         < Q l t y I n s p e c t i o n _ F i n i s h e d _ B y _ T i t l e > Q l t y I n s p e c t i o n _ F i n i s h e d _ B y _ T i t l e < / Q l t y I n s p e c t i o n _ F i n i s h e d _ B y _ T i t l e > - 
-         < Q l t y I n s p e c t i o n _ F i n i s h e d _ B y _ U s e r N a m e > Q l t y I n s p e c t i o n _ F i n i s h e d _ B y _ U s e r N a m e < / Q l t y I n s p e c t i o n _ F i n i s h e d _ B y _ U s e r N a m e > - 
-         < Q l t y I n s p e c t i o n _ F i n i s h e d _ B y _ U s e r _ I D > Q l t y I n s p e c t i o n _ F i n i s h e d _ B y _ U s e r _ I D < / Q l t y I n s p e c t i o n _ F i n i s h e d _ B y _ U s e r _ I D > - 
-         < Q l t y I n s p e c t i o n _ F i n i s h e d _ D a t e > Q l t y I n s p e c t i o n _ F i n i s h e d _ D a t e < / Q l t y I n s p e c t i o n _ F i n i s h e d _ D a t e > - 
-         < Q l t y I n s p e c t i o n _ N o > Q l t y I n s p e c t i o n _ N o < / Q l t y I n s p e c t i o n _ N o > - 
-         < Q l t y I n s p e c t i o n _ R e i n s p e c t i o n N o > Q l t y I n s p e c t i o n _ R e i n s p e c t i o n N o < / Q l t y I n s p e c t i o n _ R e i n s p e c t i o n N o > - 
-         < Q l t y I n s p e c t i o n _ R e s u l t _ C o d e > Q l t y I n s p e c t i o n _ R e s u l t _ C o d e < / Q l t y I n s p e c t i o n _ R e s u l t _ C o d e > - 
-         < Q l t y I n s p e c t i o n _ R e s u l t _ D e s c r i p t i o n > Q l t y I n s p e c t i o n _ R e s u l t _ D e s c r i p t i o n < / Q l t y I n s p e c t i o n _ R e s u l t _ D e s c r i p t i o n > - 
-         < Q l t y I n s p e c t i o n _ S o u r c e _ C u s t o m _ 1 > Q l t y I n s p e c t i o n _ S o u r c e _ C u s t o m _ 1 < / Q l t y I n s p e c t i o n _ S o u r c e _ C u s t o m _ 1 > - 
-         < Q l t y I n s p e c t i o n _ S o u r c e _ C u s t o m _ 1 0 > Q l t y I n s p e c t i o n _ S o u r c e _ C u s t o m _ 1 0 < / Q l t y I n s p e c t i o n _ S o u r c e _ C u s t o m _ 1 0 > - 
-         < Q l t y I n s p e c t i o n _ S o u r c e _ C u s t o m _ 2 > Q l t y I n s p e c t i o n _ S o u r c e _ C u s t o m _ 2 < / Q l t y I n s p e c t i o n _ S o u r c e _ C u s t o m _ 2 > - 
-         < Q l t y I n s p e c t i o n _ S o u r c e _ C u s t o m _ 3 > Q l t y I n s p e c t i o n _ S o u r c e _ C u s t o m _ 3 < / Q l t y I n s p e c t i o n _ S o u r c e _ C u s t o m _ 3 > - 
-         < Q l t y I n s p e c t i o n _ S o u r c e _ C u s t o m _ 4 > Q l t y I n s p e c t i o n _ S o u r c e _ C u s t o m _ 4 < / Q l t y I n s p e c t i o n _ S o u r c e _ C u s t o m _ 4 > - 
-         < Q l t y I n s p e c t i o n _ S o u r c e _ C u s t o m _ 5 > Q l t y I n s p e c t i o n _ S o u r c e _ C u s t o m _ 5 < / Q l t y I n s p e c t i o n _ S o u r c e _ C u s t o m _ 5 > - 
-         < Q l t y I n s p e c t i o n _ S o u r c e _ C u s t o m _ 6 > Q l t y I n s p e c t i o n _ S o u r c e _ C u s t o m _ 6 < / Q l t y I n s p e c t i o n _ S o u r c e _ C u s t o m _ 6 > - 
-         < Q l t y I n s p e c t i o n _ S o u r c e _ C u s t o m _ 7 > Q l t y I n s p e c t i o n _ S o u r c e _ C u s t o m _ 7 < / Q l t y I n s p e c t i o n _ S o u r c e _ C u s t o m _ 7 > - 
-         < Q l t y I n s p e c t i o n _ S o u r c e _ C u s t o m _ 8 > Q l t y I n s p e c t i o n _ S o u r c e _ C u s t o m _ 8 < / Q l t y I n s p e c t i o n _ S o u r c e _ C u s t o m _ 8 > - 
-         < Q l t y I n s p e c t i o n _ S o u r c e _ C u s t o m _ 9 > Q l t y I n s p e c t i o n _ S o u r c e _ C u s t o m _ 9 < / Q l t y I n s p e c t i o n _ S o u r c e _ C u s t o m _ 9 > - 
-         < Q l t y I n s p e c t i o n _ S o u r c e _ D o c u m e n t _ N o _ > Q l t y I n s p e c t i o n _ S o u r c e _ D o c u m e n t _ N o _ < / Q l t y I n s p e c t i o n _ S o u r c e _ D o c u m e n t _ N o _ > - 
-         < Q l t y I n s p e c t i o n _ S o u r c e _ I t e m _ D e s c r i p t i o n > Q l t y I n s p e c t i o n _ S o u r c e _ I t e m _ D e s c r i p t i o n < / Q l t y I n s p e c t i o n _ S o u r c e _ I t e m _ D e s c r i p t i o n > - 
-         < Q l t y I n s p e c t i o n _ S o u r c e _ I t e m _ D e s c r i p t i o n 2 > Q l t y I n s p e c t i o n _ S o u r c e _ I t e m _ D e s c r i p t i o n 2 < / Q l t y I n s p e c t i o n _ S o u r c e _ I t e m _ D e s c r i p t i o n 2 > - 
-         < Q l t y I n s p e c t i o n _ S o u r c e _ I t e m _ N o _ > Q l t y I n s p e c t i o n _ S o u r c e _ I t e m _ N o _ < / Q l t y I n s p e c t i o n _ S o u r c e _ I t e m _ N o _ > - 
-         < Q l t y I n s p e c t i o n _ S o u r c e _ L o t _ N o _ > Q l t y I n s p e c t i o n _ S o u r c e _ L o t _ N o _ < / Q l t y I n s p e c t i o n _ S o u r c e _ L o t _ N o _ > - 
-         < Q l t y I n s p e c t i o n _ S o u r c e _ P a c k a g e _ N o _ > Q l t y I n s p e c t i o n _ S o u r c e _ P a c k a g e _ N o _ < / Q l t y I n s p e c t i o n _ S o u r c e _ P a c k a g e _ N o _ > - 
-         < Q l t y I n s p e c t i o n _ S o u r c e _ S e r i a l _ N o _ > Q l t y I n s p e c t i o n _ S o u r c e _ S e r i a l _ N o _ < / Q l t y I n s p e c t i o n _ S o u r c e _ S e r i a l _ N o _ > - 
-         < Q l t y I n s p e c t i o n _ S o u r c e _ T a s k _ N o _ > Q l t y I n s p e c t i o n _ S o u r c e _ T a s k _ N o _ < / Q l t y I n s p e c t i o n _ S o u r c e _ T a s k _ N o _ > - 
-         < Q l t y I n s p e c t i o n _ S o u r c e _ V a r i a n t _ C o d e > Q l t y I n s p e c t i o n _ S o u r c e _ V a r i a n t _ C o d e < / Q l t y I n s p e c t i o n _ S o u r c e _ V a r i a n t _ C o d e > - 
-         < Q l t y I n s p e c t i o n _ S t a t u s > Q l t y I n s p e c t i o n _ S t a t u s < / Q l t y I n s p e c t i o n _ S t a t u s > - 
-         < R e i n s p e c t i o n S e q u e n c e I n f o r m a t i o n > R e i n s p e c t i o n S e q u e n c e I n f o r m a t i o n < / R e i n s p e c t i o n S e q u e n c e I n f o r m a t i o n > - 
-         < C u r r e n t I n s p e c t i o n L i n e > - 
-             < C a r r i a g e R e t u r n P e r s o n F i e l d D e t a i l s > C a r r i a g e R e t u r n P e r s o n F i e l d D e t a i l s < / C a r r i a g e R e t u r n P e r s o n F i e l d D e t a i l s > - 
-             < C o n d i t i o n L a b e l _ 1 > C o n d i t i o n L a b e l _ 1 < / C o n d i t i o n L a b e l _ 1 > - 
-             < C o n d i t i o n L a b e l _ 2 > C o n d i t i o n L a b e l _ 2 < / C o n d i t i o n L a b e l _ 2 > - 
-             < F i e l d _ C o d e > F i e l d _ C o d e < / F i e l d _ C o d e > - 
-             < F i e l d _ D e s c r i p t i o n > F i e l d _ D e s c r i p t i o n < / F i e l d _ D e s c r i p t i o n > - 
-             < F i e l d _ E n t e r e d B y N a m e A n d T i m e s t a m p > F i e l d _ E n t e r e d B y N a m e A n d T i m e s t a m p < / F i e l d _ E n t e r e d B y N a m e A n d T i m e s t a m p > - 
-             < F i e l d _ H a s E n t e r e d V a l u e > F i e l d _ H a s E n t e r e d V a l u e < / F i e l d _ H a s E n t e r e d V a l u e > - 
-             < F i e l d _ I f P e r s o n E m a i l > F i e l d _ I f P e r s o n E m a i l < / F i e l d _ I f P e r s o n E m a i l > - 
-             < F i e l d _ I f P e r s o n N a m e > F i e l d _ I f P e r s o n N a m e < / F i e l d _ I f P e r s o n N a m e > - 
-             < F i e l d _ I f P e r s o n P h o n e > F i e l d _ I f P e r s o n P h o n e < / F i e l d _ I f P e r s o n P h o n e > - 
-             < F i e l d _ I f P e r s o n T i t l e > F i e l d _ I f P e r s o n T i t l e < / F i e l d _ I f P e r s o n T i t l e > - 
-             < F i e l d _ I s L a b e l > F i e l d _ I s L a b e l < / F i e l d _ I s L a b e l > - 
-             < F i e l d _ I s P e r s o n F i e l d > F i e l d _ I s P e r s o n F i e l d < / F i e l d _ I s P e r s o n F i e l d > - 
-             < F i e l d _ I s T e x t > F i e l d _ I s T e x t < / F i e l d _ I s T e x t > - 
-             < F i e l d _ L i n e C o m m e n t a r y > F i e l d _ L i n e C o m m e n t a r y < / F i e l d _ L i n e C o m m e n t a r y > - 
-             < F i e l d _ M o d i f i e d B y U s e r E m a i l > F i e l d _ M o d i f i e d B y U s e r E m a i l < / F i e l d _ M o d i f i e d B y U s e r E m a i l > - 
-             < F i e l d _ M o d i f i e d B y U s e r I D > F i e l d _ M o d i f i e d B y U s e r I D < / F i e l d _ M o d i f i e d B y U s e r I D > - 
-             < F i e l d _ M o d i f i e d B y U s e r J o b T i t l e > F i e l d _ M o d i f i e d B y U s e r J o b T i t l e < / F i e l d _ M o d i f i e d B y U s e r J o b T i t l e > - 
-             < F i e l d _ M o d i f i e d B y U s e r N a m e > F i e l d _ M o d i f i e d B y U s e r N a m e < / F i e l d _ M o d i f i e d B y U s e r N a m e > - 
-             < F i e l d _ M o d i f i e d B y U s e r P h o n e > F i e l d _ M o d i f i e d B y U s e r P h o n e < / F i e l d _ M o d i f i e d B y U s e r P h o n e > - 
-             < F i e l d _ M o d i f i e d D a t e T i m e > F i e l d _ M o d i f i e d D a t e T i m e < / F i e l d _ M o d i f i e d D a t e T i m e > - 
-             < F i e l d _ T y p e > F i e l d _ T y p e < / F i e l d _ T y p e > - 
-             < I f P e r s o n D e s c r i p t i o n > I f P e r s o n D e s c r i p t i o n < / I f P e r s o n D e s c r i p t i o n > - 
-             < I f P e r s o n M o d i f i e d B y U s e r E m a i l > I f P e r s o n M o d i f i e d B y U s e r E m a i l < / I f P e r s o n M o d i f i e d B y U s e r E m a i l > - 
-             < I f P e r s o n M o d i f i e d D a t e T i m e > I f P e r s o n M o d i f i e d D a t e T i m e < / I f P e r s o n M o d i f i e d D a t e T i m e > - 
-             < L a b e l F i e l d _ D e s c r i p t i o n > L a b e l F i e l d _ D e s c r i p t i o n < / L a b e l F i e l d _ D e s c r i p t i o n > - 
-             < N u m e r i c _ V a l u e > N u m e r i c _ V a l u e < / N u m e r i c _ V a l u e > - 
-             < P r o m p t e d R e s u l t C a p t i o n _ 1 > P r o m p t e d R e s u l t C a p t i o n _ 1 < / P r o m p t e d R e s u l t C a p t i o n _ 1 > - 
-             < P r o m p t e d R e s u l t C a p t i o n _ 1 0 > P r o m p t e d R e s u l t C a p t i o n _ 1 0 < / P r o m p t e d R e s u l t C a p t i o n _ 1 0 > - 
-             < P r o m p t e d R e s u l t C a p t i o n _ 2 > P r o m p t e d R e s u l t C a p t i o n _ 2 < / P r o m p t e d R e s u l t C a p t i o n _ 2 > - 
-             < P r o m p t e d R e s u l t C a p t i o n _ 3 > P r o m p t e d R e s u l t C a p t i o n _ 3 < / P r o m p t e d R e s u l t C a p t i o n _ 3 > - 
-             < P r o m p t e d R e s u l t C a p t i o n _ 4 > P r o m p t e d R e s u l t C a p t i o n _ 4 < / P r o m p t e d R e s u l t C a p t i o n _ 4 > - 
-             < P r o m p t e d R e s u l t C a p t i o n _ 5 > P r o m p t e d R e s u l t C a p t i o n _ 5 < / P r o m p t e d R e s u l t C a p t i o n _ 5 > - 
-             < P r o m p t e d R e s u l t C a p t i o n _ 6 > P r o m p t e d R e s u l t C a p t i o n _ 6 < / P r o m p t e d R e s u l t C a p t i o n _ 6 > - 
-             < P r o m p t e d R e s u l t C a p t i o n _ 7 > P r o m p t e d R e s u l t C a p t i o n _ 7 < / P r o m p t e d R e s u l t C a p t i o n _ 7 > - 
-             < P r o m p t e d R e s u l t C a p t i o n _ 8 > P r o m p t e d R e s u l t C a p t i o n _ 8 < / P r o m p t e d R e s u l t C a p t i o n _ 8 > - 
-             < P r o m p t e d R e s u l t C a p t i o n _ 9 > P r o m p t e d R e s u l t C a p t i o n _ 9 < / P r o m p t e d R e s u l t C a p t i o n _ 9 > - 
-             < P r o m p t e d R e s u l t C o n d i t i o n D e s c r i p t i o n _ 1 > P r o m p t e d R e s u l t C o n d i t i o n D e s c r i p t i o n _ 1 < / P r o m p t e d R e s u l t C o n d i t i o n D e s c r i p t i o n _ 1 > - 
-             < P r o m p t e d R e s u l t C o n d i t i o n D e s c r i p t i o n _ 1 0 > P r o m p t e d R e s u l t C o n d i t i o n D e s c r i p t i o n _ 1 0 < / P r o m p t e d R e s u l t C o n d i t i o n D e s c r i p t i o n _ 1 0 > - 
-             < P r o m p t e d R e s u l t C o n d i t i o n D e s c r i p t i o n _ 2 > P r o m p t e d R e s u l t C o n d i t i o n D e s c r i p t i o n _ 2 < / P r o m p t e d R e s u l t C o n d i t i o n D e s c r i p t i o n _ 2 > - 
-             < P r o m p t e d R e s u l t C o n d i t i o n D e s c r i p t i o n _ 3 > P r o m p t e d R e s u l t C o n d i t i o n D e s c r i p t i o n _ 3 < / P r o m p t e d R e s u l t C o n d i t i o n D e s c r i p t i o n _ 3 > - 
-             < P r o m p t e d R e s u l t C o n d i t i o n D e s c r i p t i o n _ 4 > P r o m p t e d R e s u l t C o n d i t i o n D e s c r i p t i o n _ 4 < / P r o m p t e d R e s u l t C o n d i t i o n D e s c r i p t i o n _ 4 > - 
-             < P r o m p t e d R e s u l t C o n d i t i o n D e s c r i p t i o n _ 5 > P r o m p t e d R e s u l t C o n d i t i o n D e s c r i p t i o n _ 5 < / P r o m p t e d R e s u l t C o n d i t i o n D e s c r i p t i o n _ 5 > - 
-             < P r o m p t e d R e s u l t C o n d i t i o n D e s c r i p t i o n _ 6 > P r o m p t e d R e s u l t C o n d i t i o n D e s c r i p t i o n _ 6 < / P r o m p t e d R e s u l t C o n d i t i o n D e s c r i p t i o n _ 6 > - 
-             < P r o m p t e d R e s u l t C o n d i t i o n D e s c r i p t i o n _ 7 > P r o m p t e d R e s u l t C o n d i t i o n D e s c r i p t i o n _ 7 < / P r o m p t e d R e s u l t C o n d i t i o n D e s c r i p t i o n _ 7 > - 
-             < P r o m p t e d R e s u l t C o n d i t i o n D e s c r i p t i o n _ 8 > P r o m p t e d R e s u l t C o n d i t i o n D e s c r i p t i o n _ 8 < / P r o m p t e d R e s u l t C o n d i t i o n D e s c r i p t i o n _ 8 > - 
-             < P r o m p t e d R e s u l t C o n d i t i o n D e s c r i p t i o n _ 9 > P r o m p t e d R e s u l t C o n d i t i o n D e s c r i p t i o n _ 9 < / P r o m p t e d R e s u l t C o n d i t i o n D e s c r i p t i o n _ 9 > - 
-             < P r o m p t e d R e s u l t V i s i b l e _ 1 > P r o m p t e d R e s u l t V i s i b l e _ 1 < / P r o m p t e d R e s u l t V i s i b l e _ 1 > - 
-             < P r o m p t e d R e s u l t V i s i b l e _ 1 0 > P r o m p t e d R e s u l t V i s i b l e _ 1 0 < / P r o m p t e d R e s u l t V i s i b l e _ 1 0 > - 
-             < P r o m p t e d R e s u l t V i s i b l e _ 2 > P r o m p t e d R e s u l t V i s i b l e _ 2 < / P r o m p t e d R e s u l t V i s i b l e _ 2 > - 
-             < P r o m p t e d R e s u l t V i s i b l e _ 3 > P r o m p t e d R e s u l t V i s i b l e _ 3 < / P r o m p t e d R e s u l t V i s i b l e _ 3 > - 
-             < P r o m p t e d R e s u l t V i s i b l e _ 4 > P r o m p t e d R e s u l t V i s i b l e _ 4 < / P r o m p t e d R e s u l t V i s i b l e _ 4 > - 
-             < P r o m p t e d R e s u l t V i s i b l e _ 5 > P r o m p t e d R e s u l t V i s i b l e _ 5 < / P r o m p t e d R e s u l t V i s i b l e _ 5 > - 
-             < P r o m p t e d R e s u l t V i s i b l e _ 6 > P r o m p t e d R e s u l t V i s i b l e _ 6 < / P r o m p t e d R e s u l t V i s i b l e _ 6 > - 
-             < P r o m p t e d R e s u l t V i s i b l e _ 7 > P r o m p t e d R e s u l t V i s i b l e _ 7 < / P r o m p t e d R e s u l t V i s i b l e _ 7 > - 
-             < P r o m p t e d R e s u l t V i s i b l e _ 8 > P r o m p t e d R e s u l t V i s i b l e _ 8 < / P r o m p t e d R e s u l t V i s i b l e _ 8 > - 
-             < P r o m p t e d R e s u l t V i s i b l e _ 9 > P r o m p t e d R e s u l t V i s i b l e _ 9 < / P r o m p t e d R e s u l t V i s i b l e _ 9 > - 
-             < T e s t _ R e s u l t > T e s t _ R e s u l t < / T e s t _ R e s u l t > - 
-             < T e s t _ R e s u l t D e s c r i p t i o n > T e s t _ R e s u l t D e s c r i p t i o n < / T e s t _ R e s u l t D e s c r i p t i o n > - 
-             < T e s t _ V a l u e > T e s t _ V a l u e < / T e s t _ V a l u e > - 
-             < W o r d D e s c r i p t i o n > W o r d D e s c r i p t i o n < / W o r d D e s c r i p t i o n > - 
-             < W o r d M o d i f i e d B y U s e r N a m e > W o r d M o d i f i e d B y U s e r N a m e < / W o r d M o d i f i e d B y U s e r N a m e > - 
-             < W o r d M o d i f i e d D a t e T i m e > W o r d M o d i f i e d D a t e T i m e < / W o r d M o d i f i e d D a t e T i m e > - 
-             < W o r d T e s t V a l u e > W o r d T e s t V a l u e < / W o r d T e s t V a l u e > - 
-         < / C u r r e n t I n s p e c t i o n L i n e > - 
-     < / C u r r e n t I n s p e c t i o n > - 
- < / N a v W o r d R e p o r t X m l P a r t > 
-</file>
-
 <file path=customXml/itemProps1.xml><?xml version="1.0" encoding="utf-8"?>
-<ds:datastoreItem xmlns:ds="http://schemas.openxmlformats.org/officeDocument/2006/customXml" ds:itemID="{17CE75AC-9DC5-435C-A40B-AC945788E8B7}">
+<ds:datastoreItem xmlns:ds="http://schemas.openxmlformats.org/officeDocument/2006/customXml" ds:itemID="{17DA42EE-3024-4C2F-8931-9EB6F7151F21}">
   <ds:schemaRefs>
-    <ds:schemaRef ds:uri="http://schemas.openxmlformats.org/officeDocument/2006/bibliography"/>
+    <ds:schemaRef ds:uri="urn:microsoft-dynamics-nav/reports/Qlty_General_Purpose_Inspect/20405/"/>
   </ds:schemaRefs>
 </ds:datastoreItem>
 </file>
@@ -5771,9 +6547,9 @@
 </file>
 
 <file path=customXml/itemProps3.xml><?xml version="1.0" encoding="utf-8"?>
-<ds:datastoreItem xmlns:ds="http://schemas.openxmlformats.org/officeDocument/2006/customXml" ds:itemID="{17DA42EE-3024-4C2F-8931-9EB6F7151F21}">
+<ds:datastoreItem xmlns:ds="http://schemas.openxmlformats.org/officeDocument/2006/customXml" ds:itemID="{17CE75AC-9DC5-435C-A40B-AC945788E8B7}">
   <ds:schemaRefs>
-    <ds:schemaRef ds:uri="urn:microsoft-dynamics-nav/reports/Qlty_General_Purpose_Inspect/20405/"/>
+    <ds:schemaRef ds:uri="http://schemas.openxmlformats.org/officeDocument/2006/bibliography"/>
   </ds:schemaRefs>
 </ds:datastoreItem>
 </file>

</xml_diff>